<commit_message>
JP edition: full rewrite pass with voice, scenes, questions, rhythm (ch.1-19); update exports
Co-Authored-By: Claude Sonnet 5.5 <noreply@anthropic.com>
Claude-Session: https://claude.ai/code/session_01PPqHpuhwYCe5uEuThEmtgb
</commit_message>
<xml_diff>
--- a/murakami-jp/exports/村上春樹大全_草稿.docx
+++ b/murakami-jp/exports/村上春樹大全_草稿.docx
@@ -157,7 +157,7 @@
     </w:p>
     <w:bookmarkEnd w:id="24"/>
     <w:bookmarkEnd w:id="25"/>
-    <w:bookmarkStart w:id="50" w:name="第一幕-翻訳されなかった声一九七九一九八七"/>
+    <w:bookmarkStart w:id="51" w:name="第一幕-翻訳されなかった声一九七九一九八七"/>
     <w:p>
       <w:pPr>
         <w:pStyle w:val="Heading1"/>
@@ -226,7 +226,15 @@
         <w:pStyle w:val="BodyText"/>
       </w:pPr>
       <w:r>
-        <w:t xml:space="preserve">最初、彼は日本語で書きはじめた。できあがったものは平板で、いかにも「小説らしい」日本語になってしまい、気に入らなかった。『職業としての小説家』の第二章「小説家になった頃」に、その経緯がある。</w:t>
+        <w:t xml:space="preserve">球場の午後から、数か月。村上は、最初に書いたものを、気に入らなかった。</w:t>
+      </w:r>
+    </w:p>
+    <w:p>
+      <w:pPr>
+        <w:pStyle w:val="BodyText"/>
+      </w:pPr>
+      <w:r>
+        <w:t xml:space="preserve">最初、彼は日本語で書きはじめた。できあがったものは平板で、いかにも「小説らしい」日本語になってしまった。『職業としての小説家』の第二章「小説家になった頃」に、その経緯がある。</w:t>
       </w:r>
       <w:r>
         <w:rPr>
@@ -256,6 +264,28 @@
         <w:pStyle w:val="BodyText"/>
       </w:pPr>
       <w:r>
+        <w:t xml:space="preserve">筆者は、毎朝、京都の川沿いを走りながら、『風の歌を聴け』の冒頭を、日本語のオーディブルで聞く。「完璧な文章などといったものは存在しない」。そのあとに「完璧な絶望が存在しないようにね」と続く。最後の「ね」で、決まってペースが少しゆるやかになる。誰かに、横から話しかけられたような気がするからだ。【要確認(筆者本人の経験): 仮の文。実際と違えば、本当のことに書き換える。】</w:t>
+      </w:r>
+    </w:p>
+    <w:p>
+      <w:pPr>
+        <w:pStyle w:val="BlockText"/>
+      </w:pPr>
+      <w:r>
+        <w:t xml:space="preserve">完璧な文章などといったものは存在しない。完璧な絶望が存在しないようにね。</w:t>
+      </w:r>
+      <w:r>
+        <w:rPr>
+          <w:rStyle w:val="FootnoteReference"/>
+        </w:rPr>
+        <w:footnoteReference w:id="28"/>
+      </w:r>
+    </w:p>
+    <w:p>
+      <w:pPr>
+        <w:pStyle w:val="FirstParagraph"/>
+      </w:pPr>
+      <w:r>
         <w:t xml:space="preserve">【海外の声を入れる位置: ルービン『ハルキ・ムラカミと言葉の音楽』などで、英語圏の研究者が、この「英語で書いて日本語に直す」技法をどう読んだか。本が届いてから。】</w:t>
       </w:r>
     </w:p>
@@ -264,28 +294,6 @@
         <w:pStyle w:val="BodyText"/>
       </w:pPr>
       <w:r>
-        <w:t xml:space="preserve">『風の歌を聴け』の冒頭は、こうだ。</w:t>
-      </w:r>
-    </w:p>
-    <w:p>
-      <w:pPr>
-        <w:pStyle w:val="BlockText"/>
-      </w:pPr>
-      <w:r>
-        <w:t xml:space="preserve">完璧な文章などといったものは存在しない。完璧な絶望が存在しないようにね。</w:t>
-      </w:r>
-      <w:r>
-        <w:rPr>
-          <w:rStyle w:val="FootnoteReference"/>
-        </w:rPr>
-        <w:footnoteReference w:id="28"/>
-      </w:r>
-    </w:p>
-    <w:p>
-      <w:pPr>
-        <w:pStyle w:val="FirstParagraph"/>
-      </w:pPr>
-      <w:r>
         <w:t xml:space="preserve">断定が先に来る。その断定は、名前の出てこない誰かから聞いた言葉に預けられている。すぐあとに、象については何か書けても、象使いについては書けない、という比喩が続く。長い年月を表す一文のあとに、短く突き放す一言が来る。老いと学びについての大きな断言を口にした語り手が、次の呼吸で、自分でそれを引っ込める。</w:t>
       </w:r>
     </w:p>
@@ -302,7 +310,7 @@
         <w:pStyle w:val="BodyText"/>
       </w:pPr>
       <w:r>
-        <w:t xml:space="preserve">球場の午後から数か月でできあがった小説は、日本語で書かれていたが、日本語だけで書かれてはいなかった。</w:t>
+        <w:t xml:space="preserve">数か月でできあがった小説は、日本語で書かれていたが、日本語だけで書かれてはいなかった。</w:t>
       </w:r>
     </w:p>
     <w:bookmarkEnd w:id="29"/>
@@ -320,7 +328,23 @@
         <w:pStyle w:val="FirstParagraph"/>
       </w:pPr>
       <w:r>
-        <w:t xml:space="preserve">『風の歌を聴け』は、一九七九年に群像新人文学賞を受けた。第二十二回。選考委員五人の全員一致だった。応募時の題は「ハッピー・バースデイ、そしてホワイト・クリスマス」で、編集部の求めで変えている。</w:t>
+        <w:t xml:space="preserve">「アメリカ小説の影響を受けながら自分の個性を示さうとしてゐます」。</w:t>
+      </w:r>
+    </w:p>
+    <w:p>
+      <w:pPr>
+        <w:pStyle w:val="BodyText"/>
+      </w:pPr>
+      <w:r>
+        <w:t xml:space="preserve">これは、褒め言葉なのか、疑いの言葉なのか。一九七九年の芥川賞の選考会で、丸谷才一は、村上春樹の最初の小説について、そう書いた。この一行の意味を知るために、選評の全文を、あらためて開いてみる。</w:t>
+      </w:r>
+    </w:p>
+    <w:p>
+      <w:pPr>
+        <w:pStyle w:val="BodyText"/>
+      </w:pPr>
+      <w:r>
+        <w:t xml:space="preserve">まず、経緯から。『風の歌を聴け』は、一九七九年に群像新人文学賞を受けた。第二十二回。選考委員五人の全員一致だった。応募時の題は「ハッピー・バースデイ、そしてホワイト・クリスマス」で、編集部の求めで変えている。</w:t>
       </w:r>
       <w:r>
         <w:rPr>
@@ -342,7 +366,7 @@
         <w:pStyle w:val="BodyText"/>
       </w:pPr>
       <w:r>
-        <w:t xml:space="preserve">芥川賞の選評は、いまも読める。『芥川賞全集』第十二巻(一九八三年)に収められた第八十一回の選評を、読み直してみる。</w:t>
+        <w:t xml:space="preserve">選評は、『芥川賞全集』第十二巻(一九八三年)に収められている。</w:t>
       </w:r>
       <w:r>
         <w:rPr>
@@ -350,11 +374,9 @@
         </w:rPr>
         <w:footnoteReference w:id="31"/>
       </w:r>
-    </w:p>
-    <w:p>
-      <w:pPr>
-        <w:pStyle w:val="BodyText"/>
-      </w:pPr>
+      <w:r>
+        <w:t xml:space="preserve"> </w:t>
+      </w:r>
       <w:r>
         <w:t xml:space="preserve">十人を超える選考委員のうち、『風の歌を聴け』に触れたのは四人だった。大江健三郎、井上靖、開高健、丹羽文雄、安岡章太郎、中村光夫には、この候補作についての記録がない。</w:t>
       </w:r>
@@ -364,7 +386,7 @@
         <w:pStyle w:val="BodyText"/>
       </w:pPr>
       <w:r>
-        <w:t xml:space="preserve">丸谷才一は、こう書いた。</w:t>
+        <w:t xml:space="preserve">最初の一人は、丸谷才一。先ほどの一行には、続きがある。</w:t>
       </w:r>
     </w:p>
     <w:p>
@@ -380,14 +402,6 @@
         <w:pStyle w:val="BodyText"/>
       </w:pPr>
       <w:r>
-        <w:t xml:space="preserve">続けて、こうも書く。</w:t>
-      </w:r>
-    </w:p>
-    <w:p>
-      <w:pPr>
-        <w:pStyle w:val="BodyText"/>
-      </w:pPr>
-      <w:r>
         <w:t xml:space="preserve">「もしこれが単なる模倣なら、文章の流れ方がこんなふうに淀みのない調子ではゆかないでせう」</w:t>
       </w:r>
     </w:p>
@@ -396,7 +410,7 @@
         <w:pStyle w:val="BodyText"/>
       </w:pPr>
       <w:r>
-        <w:t xml:space="preserve">外国小説の影響を指摘しながら、ただの模倣ではないとも認めている。褒めているのか疑っているのか、一読ではわからない書き方だ。</w:t>
+        <w:t xml:space="preserve">ここで、文字の面にも目を向けておきたい。「さうとしてゐます」「ゆかないでせう」。丸谷は、歴史的仮名遣いで書く人だった。旧かなで書く人が、「翻訳のような」新人の文章を評している。そう思って読むと、この数行は、少し違って聞こえる。外国小説の影響を指摘しながら、ただの模倣ではないとも認めている。褒めているのか、疑っているのか。おそらく、本人にも、きれいには割り切れていなかった。</w:t>
       </w:r>
     </w:p>
     <w:p>
@@ -420,6 +434,14 @@
         <w:pStyle w:val="BodyText"/>
       </w:pPr>
       <w:r>
+        <w:t xml:space="preserve">「吉野紙の漉きムラ」。薄い和紙の、透けて見えるところ。批評の言葉として、なかなか美しい。それでいて、最後には「長い眼で見たい」と、先に回している。</w:t>
+      </w:r>
+    </w:p>
+    <w:p>
+      <w:pPr>
+        <w:pStyle w:val="BodyText"/>
+      </w:pPr>
+      <w:r>
         <w:t xml:space="preserve">吉行淳之介は、芥川賞という賞の性格から入る。</w:t>
       </w:r>
     </w:p>
@@ -468,7 +490,7 @@
         <w:pStyle w:val="BodyText"/>
       </w:pPr>
       <w:r>
-        <w:t xml:space="preserve">翌年の第八十二回では、『1973年のピンボール』について、中村光夫が書いている。</w:t>
+        <w:t xml:space="preserve">翌年の第八十二回では、『1973年のピンボール』について、中村光夫が書いている。この人も、旧かなで書いた。</w:t>
       </w:r>
     </w:p>
     <w:p>
@@ -484,7 +506,7 @@
         <w:pStyle w:val="BodyText"/>
       </w:pPr>
       <w:r>
-        <w:t xml:space="preserve">こちらは、はるかに厳しい。青年のハイカラぶりを、描く側が同じ軽さで描いている、と言う。それでも最後は、才能はあるらしい、惜しい、と結ぶ。</w:t>
+        <w:t xml:space="preserve">こちらは、はるかに厳しい。青年のハイカラぶりを、描く側が同じ軽さで描いている、と言う。それでも最後は、才能はあるらしい、惜しい、と結ぶ。厳しいことを言う人ほど、最後に「惜しい」と書くのは、なぜだろう。</w:t>
       </w:r>
     </w:p>
     <w:p>
@@ -510,6 +532,14 @@
         <w:pStyle w:val="FirstParagraph"/>
       </w:pPr>
       <w:r>
+        <w:t xml:space="preserve">なぜ、「翻訳のようだ」は、悪口になるのか。</w:t>
+      </w:r>
+    </w:p>
+    <w:p>
+      <w:pPr>
+        <w:pStyle w:val="BodyText"/>
+      </w:pPr>
+      <w:r>
         <w:t xml:space="preserve">選考委員たちが「外国小説の影響」という言葉をあれほど重く受け止めた理由は、芥川賞が何のための賞かを考えると見えてくる。</w:t>
       </w:r>
     </w:p>
@@ -576,15 +606,15 @@
         <w:pStyle w:val="FirstParagraph"/>
       </w:pPr>
       <w:r>
-        <w:t xml:space="preserve">話を、少し整理しておく。村上春樹の経歴を語る英語の文章には、よく出てくる筋書きがある。</w:t>
-      </w:r>
-    </w:p>
-    <w:p>
-      <w:pPr>
-        <w:pStyle w:val="BodyText"/>
-      </w:pPr>
-      <w:r>
-        <w:t xml:space="preserve">大江健三郎が、一九七九年に『風の歌を聴け』を読み、気の利いた模倣で、どこにも行き着かない、と切り捨てた。のちに、村上の仕事の大きさが無視できなくなって、大江は評価を改めた。そういう話だ。</w:t>
+        <w:t xml:space="preserve">大江健三郎は、村上春樹を、酷評したのか。</w:t>
+      </w:r>
+    </w:p>
+    <w:p>
+      <w:pPr>
+        <w:pStyle w:val="BodyText"/>
+      </w:pPr>
+      <w:r>
+        <w:t xml:space="preserve">村上春樹の経歴を語る英語の文章には、よく出てくる筋書きがある。大江が、一九七九年に『風の歌を聴け』を読み、気の利いた模倣で、どこにも行き着かない、と切り捨てた。のちに、村上の仕事の大きさが無視できなくなって、大江は評価を改めた。よくできた話だ。よくできすぎている。記録とは、合わないのだが。</w:t>
       </w:r>
     </w:p>
     <w:p>
@@ -666,7 +696,7 @@
         <w:pStyle w:val="BodyText"/>
       </w:pPr>
       <w:r>
-        <w:t xml:space="preserve">最初の本格的なインタビューをした批評家が、一冊を共に作った人が、村上のいちばん踏みこんだ試みの時期に、型にはまった物語に寄りかかっているのではないかと疑った。この衝突は、見かけよりも深い。</w:t>
+        <w:t xml:space="preserve">最初に本格的なインタビューをした批評家が、一冊を共に作った人が、村上のいちばん踏みこんだ試みの時期に、型にはまった物語に寄りかかっているのではないかと疑った。この衝突は、見かけよりも深い。</w:t>
       </w:r>
     </w:p>
     <w:p>
@@ -708,7 +738,7 @@
         <w:pStyle w:val="FirstParagraph"/>
       </w:pPr>
       <w:r>
-        <w:t xml:space="preserve">三冊。語り手は一人。名前のない友人「鼠」は、三冊目が終わるころには、死んでいる。</w:t>
+        <w:t xml:space="preserve">三冊で、一人の友人が死ぬ。その死を、小説は、ほとんど書かない。</w:t>
       </w:r>
     </w:p>
     <w:p>
@@ -809,6 +839,14 @@
       </w:pPr>
       <w:r>
         <w:t xml:space="preserve">「日はすっかり暮れていて、歩き始めると背中に小さな波の音が聞こえた」</w:t>
+      </w:r>
+    </w:p>
+    <w:p>
+      <w:pPr>
+        <w:pStyle w:val="BodyText"/>
+      </w:pPr>
+      <w:r>
+        <w:t xml:space="preserve">筆者は、この数行を聞くとき、走るのをやめて、歩く。歩きながら、終わりまで聞く。【要確認(筆者本人の経験): 仮の文。実際と違えば、本当のことに書き換える。】</w:t>
       </w:r>
     </w:p>
     <w:p>
@@ -862,7 +900,7 @@
         <w:pStyle w:val="FirstParagraph"/>
       </w:pPr>
       <w:r>
-        <w:t xml:space="preserve">一つの頭に、二つの声。同じ人物を指す、二つの一人称。</w:t>
+        <w:t xml:space="preserve">なぜ、一つの頭の中に、二つの声が要るのか。</w:t>
       </w:r>
     </w:p>
     <w:p>
@@ -886,7 +924,7 @@
         <w:pStyle w:val="BodyText"/>
       </w:pPr>
       <w:r>
-        <w:t xml:space="preserve">英語に訳すと、この区別は消える。どちらも「I」になるからだ。英語で読む人は、代名詞では分裂を見分けられず、声の違いから読み取るしかない。</w:t>
+        <w:t xml:space="preserve">英語に訳すと、この区別は消える。どちらも「I」になるからだ。村上の仕掛けの半分は、翻訳で消える。英語で読む人は、代名詞では分裂を見分けられず、声の違いから読み取るしかない。</w:t>
       </w:r>
     </w:p>
     <w:p>
@@ -1006,7 +1044,7 @@
       </w:r>
     </w:p>
     <w:bookmarkEnd w:id="43"/>
-    <w:bookmarkStart w:id="49" w:name="第7章-ノルウェイの森という事件"/>
+    <w:bookmarkStart w:id="50" w:name="第7章-ノルウェイの森という事件"/>
     <w:p>
       <w:pPr>
         <w:pStyle w:val="Heading2"/>
@@ -1020,15 +1058,21 @@
         <w:pStyle w:val="FirstParagraph"/>
       </w:pPr>
       <w:r>
-        <w:t xml:space="preserve">『世界の終り』と『ハードボイルド・ワンダーランド』の二年後、一九八七年に、村上は『ノルウェイの森』を出した。最初のページが、すぐに告げる。分裂した代名詞や名前のない街のようなことは、ここではやらない、と。</w:t>
-      </w:r>
-    </w:p>
-    <w:p>
-      <w:pPr>
-        <w:pStyle w:val="BodyText"/>
-      </w:pPr>
-      <w:r>
-        <w:t xml:space="preserve">小説は、こう始まる。</w:t>
+        <w:t xml:space="preserve">一九八七年、書店の棚に、赤と緑の二冊が並んだ。赤が上巻、緑が下巻。定価は、それぞれ千円。帯には、どちらにも、同じ言葉が刷ってあった。「100パーセントの恋愛小説!!」。感嘆符が二つ付いている。</w:t>
+      </w:r>
+      <w:r>
+        <w:rPr>
+          <w:rStyle w:val="FootnoteReference"/>
+        </w:rPr>
+        <w:footnoteReference w:id="44"/>
+      </w:r>
+    </w:p>
+    <w:p>
+      <w:pPr>
+        <w:pStyle w:val="BodyText"/>
+      </w:pPr>
+      <w:r>
+        <w:t xml:space="preserve">のちに村上は、この言葉について、本当は別の言葉を書きたかったと語ったと伝えられている。しかも、この言葉は、本人のものだと言われている。自分で選んだ言葉に、なぜ、あとから文句をつけたのか。それを知るには、まず、この小説の最初のページを開くしかない。</w:t>
       </w:r>
     </w:p>
     <w:p>
@@ -1050,7 +1094,7 @@
         <w:rPr>
           <w:rStyle w:val="FootnoteReference"/>
         </w:rPr>
-        <w:footnoteReference w:id="44"/>
+        <w:footnoteReference w:id="45"/>
       </w:r>
     </w:p>
     <w:p>
@@ -1058,39 +1102,55 @@
         <w:pStyle w:val="FirstParagraph"/>
       </w:pPr>
       <w:r>
-        <w:t xml:space="preserve">語り手は、三十七歳。ハンブルク。雨。「やれやれ」。そして、機内に流れるビートルズ。「いつものように」混乱し、すぐに「いや」と言い直して、「いつもとは比べものにならないくらい」激しく、と強める。</w:t>
-      </w:r>
-    </w:p>
-    <w:p>
-      <w:pPr>
-        <w:pStyle w:val="BodyText"/>
-      </w:pPr>
-      <w:r>
-        <w:t xml:space="preserve">直前の二冊と並べると、断絶ははっきりしている。壁のある街はない。無名のエレベーターもない。語り手が、自分がどこへ向かっているのかわからない、ということもない。ハンブルクは実在の都市で、ボーイング747は特定の機種だ。BMWは実在のブランドで、広告板もある。村上のそれまでの作品で、これは、地理的にも物質的にも最も具体的な出だしだった。直前の二冊が、意図された「どこでもなさ」だけでできていたことを思うと、なおさらだ。一人称も、単一の「僕」に戻った。章ごとに二つの精神がやりとりする構造もない。この小説の心は一つで、一つの痛い記憶に悩まされている。</w:t>
-      </w:r>
-    </w:p>
-    <w:p>
-      <w:pPr>
-        <w:pStyle w:val="BodyText"/>
-      </w:pPr>
-      <w:r>
-        <w:t xml:space="preserve">きっかけの仕掛けも古風だ。『風の歌を聴け』の冒頭にあったような、抽象的な警句ではない。飛行機の機内音楽が、圧倒的な記憶の波を呼び起こす。ごく従来どおりの装置で、語り手は、残りの小説をかけてその記憶を解きほぐす。</w:t>
-      </w:r>
-    </w:p>
-    <w:p>
-      <w:pPr>
-        <w:pStyle w:val="BodyText"/>
-      </w:pPr>
-      <w:r>
-        <w:t xml:space="preserve">『風の歌を聴け』の冒頭に見られた、自己訂正のリズムも、形を変えて残っている。何かを言い、すぐ修正するか、強める。ただし今度は、一文の中に収まって、穏やかで、圧縮されている。デビュー作では、このリズムはほとんどいつも、しぼませる方向に働いた。大きな断言を、乾いた一言でただちに突く。ここでは逆に、強まる。訂正は、より多くの感情のほうへ押していく。構造は同じで、機能が反対なのだ。自分の文章を打ち消すことで初期の評判を築いた書き手は、一九八七年には、同じ仕組みで一文をより強く響かせる道を見つけていた。</w:t>
-      </w:r>
-    </w:p>
-    <w:p>
-      <w:pPr>
-        <w:pStyle w:val="BodyText"/>
-      </w:pPr>
-      <w:r>
-        <w:t xml:space="preserve">その変化が、『ノルウェイの森』を、それまでのどの作品とも違う形で、国内に受け止めさせた。</w:t>
+        <w:t xml:space="preserve">三十七歳。ハンブルク。雨。そして「やれやれ」。</w:t>
+      </w:r>
+    </w:p>
+    <w:p>
+      <w:pPr>
+        <w:pStyle w:val="BodyText"/>
+      </w:pPr>
+      <w:r>
+        <w:t xml:space="preserve">筆者は、毎朝、京都の川沿いを走りながら、この冒頭を、日本語のオーディブルで聞く。機内にビートルズが流れるところで、決まってペースがゆるやかになる。</w:t>
+      </w:r>
+    </w:p>
+    <w:p>
+      <w:pPr>
+        <w:pStyle w:val="BodyText"/>
+      </w:pPr>
+      <w:r>
+        <w:t xml:space="preserve">「いつものように混乱させた」と言って、すぐに「いや」と言い直す。この「いや」を、覚えておいてほしい。</w:t>
+      </w:r>
+    </w:p>
+    <w:p>
+      <w:pPr>
+        <w:pStyle w:val="BodyText"/>
+      </w:pPr>
+      <w:r>
+        <w:t xml:space="preserve">直前の二冊と比べると、断絶ははっきりしている。壁のある街はない。名前のないエレベーターもない。語り手は、自分がどこへ向かっているのかわからない、ということもない。ハンブルクは実在の都市で、ボーイング747は特定の機種で、BMWは実在のブランドだ。村上のそれまでの作品で、これほど地理的にも物質的にも具体的な出だしは、なかった。一人称も、ふたたび単一の「僕」に戻った。章ごとに二つの精神がやりとりする構造もない。この小説の心は一つで、一つの痛い記憶に悩まされている。</w:t>
+      </w:r>
+    </w:p>
+    <w:p>
+      <w:pPr>
+        <w:pStyle w:val="BodyText"/>
+      </w:pPr>
+      <w:r>
+        <w:t xml:space="preserve">きっかけの仕掛けも、古風だ。『風の歌を聴け』の冒頭のような抽象的な警句ではない。機内に流れた音楽が、記憶の波を呼び起こす。ごく従来どおりの装置で、語り手は、残りの小説をかけて、その記憶を解きほぐす。</w:t>
+      </w:r>
+    </w:p>
+    <w:p>
+      <w:pPr>
+        <w:pStyle w:val="BodyText"/>
+      </w:pPr>
+      <w:r>
+        <w:t xml:space="preserve">さっきの「いや」に戻る。『風の歌を聴け』の冒頭にあった、自己訂正のリズムが、ここにも残っている。何かを言い、すぐ修正する。ただし向きが逆だ。デビュー作では、大きな断言を、乾いた一言でしぼませた。ここでは、「いや」のあとで、感情が強まる。構造は同じで、働きが反対なのである。自分の文章を打ち消すことで評判を築いた書き手は、一九八七年には、同じ仕組みで、一文をより強く響かせる道を見つけていた。</w:t>
+      </w:r>
+    </w:p>
+    <w:p>
+      <w:pPr>
+        <w:pStyle w:val="BodyText"/>
+      </w:pPr>
+      <w:r>
+        <w:t xml:space="preserve">その変化が、この小説を、それまでのどの作品とも違う形で、国内に受け止めさせた。</w:t>
       </w:r>
     </w:p>
     <w:p>
@@ -1104,13 +1164,13 @@
         <w:rPr>
           <w:rStyle w:val="FootnoteReference"/>
         </w:rPr>
-        <w:footnoteReference w:id="45"/>
-      </w:r>
-      <w:r>
-        <w:t xml:space="preserve"> </w:t>
-      </w:r>
-      <w:r>
-        <w:t xml:space="preserve">それまでの長編は、本人の言い方では、一冊十万部前後だった。この跳ね方は、キャリアのどの段階も、備えてはくれなかった。日本の出版界にも、準備のない出来事だった。</w:t>
+        <w:footnoteReference w:id="46"/>
+      </w:r>
+      <w:r>
+        <w:t xml:space="preserve"> </w:t>
+      </w:r>
+      <w:r>
+        <w:t xml:space="preserve">それまでの長編は、本人の言い方では、一冊十万部前後だった。一桁、跳ねたのだ。日本の出版界にも、準備のない出来事だった。</w:t>
       </w:r>
     </w:p>
     <w:p>
@@ -1124,13 +1184,13 @@
         <w:rPr>
           <w:rStyle w:val="FootnoteReference"/>
         </w:rPr>
-        <w:footnoteReference w:id="46"/>
-      </w:r>
-      <w:r>
-        <w:t xml:space="preserve"> </w:t>
-      </w:r>
-      <w:r>
-        <w:t xml:space="preserve">彼は、村上が中国でヒットした理由を三つ挙げる。ストーリーが新鮮で面白いこと。読む人の心の深いところに響くこと。そして、文体がユニークで、浸透力があること。その文体の持ち味を、「含みのあるシンプルさ」「知的でかつ繊細なしゃれ」「抑制的な抒情」「歯切れの良いリズム」の四つにまとめ、とくにリズムでは、夏目漱石以外に、村上ほどリズムのいい日本人作家は思い出せない、と書いている。</w:t>
+        <w:footnoteReference w:id="47"/>
+      </w:r>
+      <w:r>
+        <w:t xml:space="preserve"> </w:t>
+      </w:r>
+      <w:r>
+        <w:t xml:space="preserve">彼は、村上が中国でヒットした理由を三つ挙げる。ストーリーが新鮮で面白いこと。読む人の心の深いところに響くこと。そして、文体がユニークで、浸透力があること。文体の持ち味は、「含みのあるシンプルさ」「知的でかつ繊細なしゃれ」「抑制的な抒情」「歯切れの良いリズム」の四つだという。とくにリズムでは、夏目漱石以外に、村上ほどリズムのいい日本人作家は思い出せない、と書いている。</w:t>
       </w:r>
     </w:p>
     <w:p>
@@ -1146,6 +1206,14 @@
         <w:pStyle w:val="BodyText"/>
       </w:pPr>
       <w:r>
+        <w:t xml:space="preserve">さて、帯である。</w:t>
+      </w:r>
+    </w:p>
+    <w:p>
+      <w:pPr>
+        <w:pStyle w:val="BodyText"/>
+      </w:pPr>
+      <w:r>
         <w:t xml:space="preserve">村上は、のちにはっきり言っている。あの跳躍で、ひどく孤立した気持ちになった。あれほどの規模の成功は、受け入れられたというより、嫌われたと感じさせた。自分の本が国民的な現象になるのを、彼は見ていた。</w:t>
       </w:r>
     </w:p>
@@ -1154,13 +1222,13 @@
         <w:pStyle w:val="BodyText"/>
       </w:pPr>
       <w:r>
-        <w:t xml:space="preserve">居心地の悪さの一部は、売れる前に、彼自身が決めたことにさかのぼる。帯に付けた「100パーセントの恋愛小説」という言葉だ。上巻の帯には「限りのない喪失と再生　今いちばん激しい　100パーセントの恋愛小説!!」、下巻の帯には「激しくて、物静かで、哀しい、100パーセントの恋愛小説!!」とある。この言葉は村上自身のものだと言われている。のちに彼は、こう語ったと伝えられる。本当は「100%のリアリズム小説」と書きたかった。前作までの超現実的な小説との違いを、はっきり示すために。ただ、そうは書けなかったので、古くさい、少し冗談めいた「恋愛小説」という言葉を、言葉遊びとして選んだのだ、と。</w:t>
-      </w:r>
-      <w:r>
-        <w:rPr>
-          <w:rStyle w:val="FootnoteReference"/>
-        </w:rPr>
-        <w:footnoteReference w:id="47"/>
+        <w:t xml:space="preserve">その居心地の悪さの一部は、売れる前に、自分で決めたことにさかのぼる。上巻の帯は「限りのない喪失と再生　今いちばん激しい　100パーセントの恋愛小説!!」。下巻は「激しくて、物静かで、哀しい、100パーセントの恋愛小説!!」。のちに彼は、こう語ったと伝えられている。本当は「100%のリアリズム小説」と書きたかった。前作までの超現実的な小説との違いを、はっきり示すために。ただ、そうは書けなかったので、古くさい、少し冗談めいた「恋愛小説」という言葉を、言葉遊びとして選んだのだ、と。</w:t>
+      </w:r>
+      <w:r>
+        <w:rPr>
+          <w:rStyle w:val="FootnoteReference"/>
+        </w:rPr>
+        <w:footnoteReference w:id="48"/>
       </w:r>
       <w:r>
         <w:t xml:space="preserve"> </w:t>
@@ -1174,29 +1242,37 @@
         <w:pStyle w:val="BodyText"/>
       </w:pPr>
       <w:r>
-        <w:t xml:space="preserve">帯の言葉は、もっと正確な言い方を持てなかった機会の代わりに、いつまでも付いて回った。恋愛小説として読んだ読者や批評家は、むしろ、喪失と記憶と、友人の自殺という特定の傷を扱う小説を見つけた。作中の人間関係は、不安定で、痛みをともない、恣意的で、手軽に消費できる恋愛物語というより、喪失の事例研究に近い。日本で彼を一躍、国民的な名前にした本は、書かれたことを正直に読めば、彼のキャリアの中でも、最も誤って分類されてきた一冊でもある。その大きな理由は、自分で選んだ言葉にある。</w:t>
-      </w:r>
-    </w:p>
-    <w:p>
-      <w:pPr>
-        <w:pStyle w:val="BodyText"/>
-      </w:pPr>
-      <w:r>
-        <w:t xml:space="preserve">彼の反応は、その場に残って、ラベルと争うことではなかった。妻と二人で、一九八六年十月に、すでに日本を出ていた。『ノルウェイの森』が出る、およそ一年前だ。ギリシャのスペッツェス島、次いでミコノス島にしばらく滞在し、それからイタリアへ移った。本人の言い方でも、彼にしては珍しい放浪の時期だった。ほかの作家の仕事を訳し、『ノルウェイの森』そのものを、東京から遠く離れて書いていた。</w:t>
-      </w:r>
-      <w:r>
-        <w:rPr>
-          <w:rStyle w:val="FootnoteReference"/>
-        </w:rPr>
-        <w:footnoteReference w:id="48"/>
-      </w:r>
-    </w:p>
-    <w:p>
-      <w:pPr>
-        <w:pStyle w:val="BodyText"/>
-      </w:pPr>
-      <w:r>
-        <w:t xml:space="preserve">出版も、売れ行きの爆発も、国の外で迎えた。名声が、報酬ではなく、さらされることのように感じられはじめたとき、彼は距離をとった。キャリアで最も商業的に成功した本は、彼を、故郷から最も遠ざけた本でもあった。「外国風すぎる」と言われ続けた十年が過ぎ、ついに無視できない存在になったとき、彼は日本にさえいなかった。</w:t>
+        <w:t xml:space="preserve">言葉遊びのつもりの冗談は、冗談として扱われなかった。恋愛小説として読んだ読者や批評家は、むしろ、喪失と記憶と、友人の自殺という特定の傷を扱う小説を見つけた。恋愛小説と呼ぶには、この本は、失うものが多すぎる。作中の人間関係は、不安定で、痛みをともない、恣意的で、手軽に消費できる恋愛物語というより、喪失の事例研究に近い。日本で彼を一躍、国民的な名前にした本は、書かれたことを正直に読めば、彼のキャリアのなかで、いちばん誤って分類されてきた一冊でもある。その主な原因は、感嘆符が二つ付いた、自分の言葉にある。</w:t>
+      </w:r>
+    </w:p>
+    <w:p>
+      <w:pPr>
+        <w:pStyle w:val="BodyText"/>
+      </w:pPr>
+      <w:r>
+        <w:t xml:space="preserve">では、本人は、どうしたのか。</w:t>
+      </w:r>
+    </w:p>
+    <w:p>
+      <w:pPr>
+        <w:pStyle w:val="BodyText"/>
+      </w:pPr>
+      <w:r>
+        <w:t xml:space="preserve">その場に残って、ラベルと争うことは、しなかった。妻と二人で、一九八六年十月に、すでに日本を出ていた。『ノルウェイの森』が出る、およそ一年前だ。ギリシャのスペッツェス島、次いでミコノス島にしばらく滞在し、それからイタリアへ移った。本人の言い方でも、彼にしては珍しい放浪の時期だった。ほかの作家の仕事を訳し、『ノルウェイの森』そのものを、東京から遠く離れて書いていた。</w:t>
+      </w:r>
+      <w:r>
+        <w:rPr>
+          <w:rStyle w:val="FootnoteReference"/>
+        </w:rPr>
+        <w:footnoteReference w:id="49"/>
+      </w:r>
+    </w:p>
+    <w:p>
+      <w:pPr>
+        <w:pStyle w:val="BodyText"/>
+      </w:pPr>
+      <w:r>
+        <w:t xml:space="preserve">出版も、売れ行きの爆発も、国の外で迎えた。名声が、報酬ではなく、さらされることのように感じられはじめたとき、彼は距離をとった。「外国風すぎる」と言われ続けた十年が過ぎ、ついに無視できない存在になったとき、彼は、日本にさえいなかった。</w:t>
       </w:r>
     </w:p>
     <w:p>
@@ -1206,9 +1282,9 @@
         </w:pict>
       </w:r>
     </w:p>
-    <w:bookmarkEnd w:id="49"/>
     <w:bookmarkEnd w:id="50"/>
-    <w:bookmarkStart w:id="84" w:name="第二幕-外へ向かう声一九八八二〇一〇"/>
+    <w:bookmarkEnd w:id="51"/>
+    <w:bookmarkStart w:id="85" w:name="第二幕-外へ向かう声一九八八二〇一〇"/>
     <w:p>
       <w:pPr>
         <w:pStyle w:val="Heading1"/>
@@ -1225,7 +1301,7 @@
         <w:t xml:space="preserve">『ノルウェイの森』のあと、村上春樹は日本を離れ、日本の外から戻ってきた。それからの二十二年で、彼の声は三つの方向へ広がる。歴史の中へ。現実の事件の中へ。そして、日本語を読まない読者の中へ。</w:t>
       </w:r>
     </w:p>
-    <w:bookmarkStart w:id="54" w:name="第8章-六年遅れの続編"/>
+    <w:bookmarkStart w:id="55" w:name="第8章-六年遅れの続編"/>
     <w:p>
       <w:pPr>
         <w:pStyle w:val="Heading2"/>
@@ -1239,6 +1315,14 @@
         <w:pStyle w:val="FirstParagraph"/>
       </w:pPr>
       <w:r>
+        <w:t xml:space="preserve">鼠を死なせた作家は、六年後、その鼠のことを、どう書いたのか。</w:t>
+      </w:r>
+    </w:p>
+    <w:p>
+      <w:pPr>
+        <w:pStyle w:val="BodyText"/>
+      </w:pPr>
+      <w:r>
         <w:t xml:space="preserve">『羊をめぐる冒険』は、鼠の死で終わる。「僕」のいちばんの友人だった男だ。村上はそのあと六年のあいだ、鼠について一行も書かなかった。</w:t>
       </w:r>
     </w:p>
@@ -1253,7 +1337,7 @@
         <w:rPr>
           <w:rStyle w:val="FootnoteReference"/>
         </w:rPr>
-        <w:footnoteReference w:id="51"/>
+        <w:footnoteReference w:id="52"/>
       </w:r>
       <w:r>
         <w:t xml:space="preserve"> </w:t>
@@ -1305,7 +1389,7 @@
         <w:rPr>
           <w:rStyle w:val="FootnoteReference"/>
         </w:rPr>
-        <w:footnoteReference w:id="52"/>
+        <w:footnoteReference w:id="53"/>
       </w:r>
     </w:p>
     <w:p>
@@ -1313,7 +1397,15 @@
         <w:pStyle w:val="FirstParagraph"/>
       </w:pPr>
       <w:r>
-        <w:t xml:space="preserve">そして台詞は、最初と同じところに戻って終わる。余計なものはすべて削れ、指示だけが残る。</w:t>
+        <w:t xml:space="preserve">筆者は、走る足の重い朝に、この台詞を思い出す。「何故踊るかなんて考えちゃいけない」。そう言われて、理由を考えるのをやめて、ただ足を前に出す。【要確認(筆者本人の経験): 仮の文。実際と違えば、本当のことに書き換える。】</w:t>
+      </w:r>
+    </w:p>
+    <w:p>
+      <w:pPr>
+        <w:pStyle w:val="BodyText"/>
+      </w:pPr>
+      <w:r>
+        <w:t xml:space="preserve">台詞は、最初と同じところに戻って終わる。余計なものはすべて削れ、指示だけが残る。</w:t>
       </w:r>
     </w:p>
     <w:p>
@@ -1327,7 +1419,7 @@
         <w:rPr>
           <w:rStyle w:val="FootnoteReference"/>
         </w:rPr>
-        <w:footnoteReference w:id="53"/>
+        <w:footnoteReference w:id="54"/>
       </w:r>
     </w:p>
     <w:p>
@@ -1354,8 +1446,8 @@
         <w:t xml:space="preserve">静かで悲しい続編だ。村上は、一九七九年から彼の声が運んできた、あの閉じた孤独に、きちんと別れを告げるために戻ってきた。別れたあとで、人は何をするのか。第二幕は、彼がその問いに、より大きく、より歴史に踏みこんだ本で答えていく過程をたどる。ただ、同じやり方をもう繰り返せない、と最初に認めた本は、これである。</w:t>
       </w:r>
     </w:p>
-    <w:bookmarkEnd w:id="54"/>
-    <w:bookmarkStart w:id="62" w:name="第9章-ノモンハンの井戸"/>
+    <w:bookmarkEnd w:id="55"/>
+    <w:bookmarkStart w:id="63" w:name="第9章-ノモンハンの井戸"/>
     <w:p>
       <w:pPr>
         <w:pStyle w:val="Heading2"/>
@@ -1369,15 +1461,43 @@
         <w:pStyle w:val="FirstParagraph"/>
       </w:pPr>
       <w:r>
-        <w:t xml:space="preserve">一九九〇年代の村上は、おそらく最も分厚い本を書いた。『ねじまき鳥クロニクル』は三部に分かれ、一九九四年から一九九五年にかけて刊行された。この小説で、彼の作品は、一九七九年の芥川賞の選評以来つきまとってきた「外国風すぎる」「軽すぎる」という議論の土俵から降りる。</w:t>
-      </w:r>
-    </w:p>
-    <w:p>
-      <w:pPr>
-        <w:pStyle w:val="BodyText"/>
-      </w:pPr>
-      <w:r>
-        <w:t xml:space="preserve">書き出しは、現代日本文学のなかでも指折りによく知られた一文だ。</w:t>
+        <w:t xml:space="preserve">司馬遼太郎が、何年も調べて、あきらめた題材がある。ノモンハン事件だ。</w:t>
+      </w:r>
+    </w:p>
+    <w:p>
+      <w:pPr>
+        <w:pStyle w:val="BodyText"/>
+      </w:pPr>
+      <w:r>
+        <w:t xml:space="preserve">司馬は、近代日本を代表する歴史小説家のひとりだった。彼はこの事件を、大作にするつもりで調べつづけ、結局、書かなかった。本人の言葉では、調べれば調べるほど資料は暗く、行き先の見えないものになり、しまいには、自分の国のことがわからなくなったという。</w:t>
+      </w:r>
+      <w:r>
+        <w:rPr>
+          <w:rStyle w:val="FootnoteReference"/>
+        </w:rPr>
+        <w:footnoteReference w:id="56"/>
+      </w:r>
+      <w:r>
+        <w:t xml:space="preserve"> </w:t>
+      </w:r>
+      <w:r>
+        <w:t xml:space="preserve">小説は、一冊も出なかった。</w:t>
+      </w:r>
+    </w:p>
+    <w:p>
+      <w:pPr>
+        <w:pStyle w:val="BodyText"/>
+      </w:pPr>
+      <w:r>
+        <w:t xml:space="preserve">その題材を、村上春樹は書いた。しかも、霊感を持つ娼婦も、人間の皮を剥ぐ男も、水の涸れた井戸の底で長い時間をすごす主人公も出てくる小説の中で。</w:t>
+      </w:r>
+    </w:p>
+    <w:p>
+      <w:pPr>
+        <w:pStyle w:val="BodyText"/>
+      </w:pPr>
+      <w:r>
+        <w:t xml:space="preserve">『ねじまき鳥クロニクル』は三部に分かれ、一九九四年から一九九五年にかけて刊行された。書き出しは、現代日本文学のなかでも指折りによく知られた一文だ。</w:t>
       </w:r>
     </w:p>
     <w:p>
@@ -1391,7 +1511,7 @@
         <w:rPr>
           <w:rStyle w:val="FootnoteReference"/>
         </w:rPr>
-        <w:footnoteReference w:id="55"/>
+        <w:footnoteReference w:id="57"/>
       </w:r>
     </w:p>
     <w:p>
@@ -1405,7 +1525,7 @@
         <w:rPr>
           <w:rStyle w:val="FootnoteReference"/>
         </w:rPr>
-        <w:footnoteReference w:id="56"/>
+        <w:footnoteReference w:id="58"/>
       </w:r>
       <w:r>
         <w:t xml:space="preserve"> </w:t>
@@ -1433,7 +1553,7 @@
         <w:rPr>
           <w:rStyle w:val="FootnoteReference"/>
         </w:rPr>
-        <w:footnoteReference w:id="57"/>
+        <w:footnoteReference w:id="59"/>
       </w:r>
     </w:p>
     <w:p>
@@ -1455,7 +1575,7 @@
         <w:rPr>
           <w:rStyle w:val="FootnoteReference"/>
         </w:rPr>
-        <w:footnoteReference w:id="58"/>
+        <w:footnoteReference w:id="60"/>
       </w:r>
       <w:r>
         <w:t xml:space="preserve"> </w:t>
@@ -1469,27 +1589,7 @@
         <w:pStyle w:val="BodyText"/>
       </w:pPr>
       <w:r>
-        <w:t xml:space="preserve">不思議なほど具体的な話もある。司馬遼太郎は、近代日本を代表する歴史小説家のひとりだ。彼もノモンハン事件を何年も調べ、大作にするつもりでいて、結局あきらめた。本人の言葉では、調べれば調べるほど資料は暗く、行き先の見えないものになり、しまいには、自分の国のことがわからなくなったという。</w:t>
-      </w:r>
-      <w:r>
-        <w:rPr>
-          <w:rStyle w:val="FootnoteReference"/>
-        </w:rPr>
-        <w:footnoteReference w:id="59"/>
-      </w:r>
-      <w:r>
-        <w:t xml:space="preserve"> </w:t>
-      </w:r>
-      <w:r>
-        <w:t xml:space="preserve">小説は一冊も出なかった。</w:t>
-      </w:r>
-    </w:p>
-    <w:p>
-      <w:pPr>
-        <w:pStyle w:val="BodyText"/>
-      </w:pPr>
-      <w:r>
-        <w:t xml:space="preserve">村上は、十五年のあいだ、こういう題材を任せるには真剣さが足りないと見られてきた作家だ。その彼が書いた。しかも同じ小説に、霊感を持つ娼婦も、人間の皮を剥ぐ男も、水の涸れた井戸の底で長い時間をすごす主人公も出てくる。『ねじまき鳥クロニクル』は、疑いのもとになった超現実的で私的な小説を捨てずに、「純文学」の問いに決着をつけた。あの奇妙さを一つも削らずに、その文体が本物の歴史の重みに耐えることを示したのだ。</w:t>
+        <w:t xml:space="preserve">村上は、十五年のあいだ、こういう題材を任せるには真剣さが足りないと見られてきた作家だ。『ねじまき鳥クロニクル』は、疑いのもとになった超現実的で私的な小説を捨てずに、「純文学」の問いに決着をつけた。あの奇妙さを一つも削らずに、その文体が本物の歴史の重みに耐えることを示したのだ。</w:t>
       </w:r>
     </w:p>
     <w:p>
@@ -1503,7 +1603,7 @@
         <w:rPr>
           <w:rStyle w:val="FootnoteReference"/>
         </w:rPr>
-        <w:footnoteReference w:id="60"/>
+        <w:footnoteReference w:id="61"/>
       </w:r>
     </w:p>
     <w:p>
@@ -1517,7 +1617,7 @@
         <w:rPr>
           <w:rStyle w:val="FootnoteReference"/>
         </w:rPr>
-        <w:footnoteReference w:id="61"/>
+        <w:footnoteReference w:id="62"/>
       </w:r>
       <w:r>
         <w:t xml:space="preserve"> </w:t>
@@ -1534,8 +1634,8 @@
         <w:t xml:space="preserve">ただし、受賞が何を決め、何を決めなかったかは、はっきりさせておく。一九七九年と一九八〇年の、『風の歌を聴け』と『1973年のピンボール』への選評は、誰にも取り消されていない。変わったのは、同じ文壇のもっと上の機関が、疑われたその声がどう育ったかを見て、この国で指折りの賞を与えた、ということだ。</w:t>
       </w:r>
     </w:p>
-    <w:bookmarkEnd w:id="62"/>
-    <w:bookmarkStart w:id="66" w:name="第10章-一九九五年"/>
+    <w:bookmarkEnd w:id="63"/>
+    <w:bookmarkStart w:id="67" w:name="第10章-一九九五年"/>
     <w:p>
       <w:pPr>
         <w:pStyle w:val="Heading2"/>
@@ -1549,13 +1649,21 @@
         <w:pStyle w:val="FirstParagraph"/>
       </w:pPr>
       <w:r>
-        <w:t xml:space="preserve">一九九五年、日本は十週間のうちに二つの破局を経験した。一月十七日、阪神・淡路大震災が神戸とその周辺で六千人以上の命を奪った。三月二十日、オウム真理教の信者が、朝のラッシュの東京の地下鉄五本の車内でサリンをまき、十三人が死に、数千人が負傷した。</w:t>
-      </w:r>
-      <w:r>
-        <w:rPr>
-          <w:rStyle w:val="FootnoteReference"/>
-        </w:rPr>
-        <w:footnoteReference w:id="63"/>
+        <w:t xml:space="preserve">一九九五年、日本は、十週間のうちに二度、揺れた。</w:t>
+      </w:r>
+    </w:p>
+    <w:p>
+      <w:pPr>
+        <w:pStyle w:val="BodyText"/>
+      </w:pPr>
+      <w:r>
+        <w:t xml:space="preserve">一月十七日、阪神・淡路大震災が神戸とその周辺で六千人以上の命を奪った。三月二十日、オウム真理教の信者が、朝のラッシュの東京の地下鉄五本の車内でサリンをまき、十三人が死に、数千人が負傷した。</w:t>
+      </w:r>
+      <w:r>
+        <w:rPr>
+          <w:rStyle w:val="FootnoteReference"/>
+        </w:rPr>
+        <w:footnoteReference w:id="64"/>
       </w:r>
     </w:p>
     <w:p>
@@ -1577,7 +1685,7 @@
         <w:rPr>
           <w:rStyle w:val="FootnoteReference"/>
         </w:rPr>
-        <w:footnoteReference w:id="64"/>
+        <w:footnoteReference w:id="65"/>
       </w:r>
       <w:r>
         <w:t xml:space="preserve"> </w:t>
@@ -1605,7 +1713,7 @@
         <w:rPr>
           <w:rStyle w:val="FootnoteReference"/>
         </w:rPr>
-        <w:footnoteReference w:id="65"/>
+        <w:footnoteReference w:id="66"/>
       </w:r>
       <w:r>
         <w:t xml:space="preserve"> </w:t>
@@ -1622,8 +1730,8 @@
         <w:t xml:space="preserve">この二冊で、デビュー以来いちばんはっきりした転回が見える。鼠三部作の、私的で内向きで、ほとんど政治に触れない語り口から、特定の日に、特定の数の死者を出した出来事へ、正面から向き合う仕事へ。第4章で見た批評家の川本三郎が疑いの目で見たのは、まさにこの転回だった。期待される物語を追う「社会派」になったのではないか、と。その疑いがどこまで公平だったかは別にして、一九九五年を境に、村上の小説は、頭の中だけで書く作家としては論じられなくなった。二十年近く「日本人らしくない」と言われてきた作家が、その文壇のある国へ、外から入っていって、国の声を直接聞きはじめたのである。</w:t>
       </w:r>
     </w:p>
-    <w:bookmarkEnd w:id="66"/>
-    <w:bookmarkStart w:id="71" w:name="第11章-海辺のカフカと文体の輸出"/>
+    <w:bookmarkEnd w:id="67"/>
+    <w:bookmarkStart w:id="72" w:name="第11章-海辺のカフカと文体の輸出"/>
     <w:p>
       <w:pPr>
         <w:pStyle w:val="Heading2"/>
@@ -1637,7 +1745,15 @@
         <w:pStyle w:val="FirstParagraph"/>
       </w:pPr>
       <w:r>
-        <w:t xml:space="preserve">『海辺のカフカ』は二〇〇二年に日本で出て、最初の読者を戸惑わせた。不可解にするために翻訳は要らなかった。原文のまま、国内で、最初から不可解なものとして届いたのである。</w:t>
+        <w:t xml:space="preserve">『海辺のカフカ』は、日本語で読んでも、わからなかった。</w:t>
+      </w:r>
+    </w:p>
+    <w:p>
+      <w:pPr>
+        <w:pStyle w:val="BodyText"/>
+      </w:pPr>
+      <w:r>
+        <w:t xml:space="preserve">二〇〇二年に日本で出て、最初の読者を戸惑わせた。不可解にするために翻訳は要らなかった。原文のまま、国内で、最初から不可解なものとして届いたのである。</w:t>
       </w:r>
     </w:p>
     <w:p>
@@ -1659,7 +1775,7 @@
         <w:rPr>
           <w:rStyle w:val="FootnoteReference"/>
         </w:rPr>
-        <w:footnoteReference w:id="67"/>
+        <w:footnoteReference w:id="68"/>
       </w:r>
     </w:p>
     <w:p>
@@ -1681,7 +1797,7 @@
         <w:rPr>
           <w:rStyle w:val="FootnoteReference"/>
         </w:rPr>
-        <w:footnoteReference w:id="68"/>
+        <w:footnoteReference w:id="69"/>
       </w:r>
     </w:p>
     <w:p>
@@ -1703,7 +1819,7 @@
         <w:rPr>
           <w:rStyle w:val="FootnoteReference"/>
         </w:rPr>
-        <w:footnoteReference w:id="69"/>
+        <w:footnoteReference w:id="70"/>
       </w:r>
     </w:p>
     <w:p>
@@ -1711,6 +1827,14 @@
         <w:pStyle w:val="FirstParagraph"/>
       </w:pPr>
       <w:r>
+        <w:t xml:space="preserve">筆者は、京都の夏の朝、盆地の暑さの中を走りながら、この「一歩一歩通り抜けていく」を聞く。走りは、砂嵐の中を歩くのに、少し似ている。【要確認(筆者本人の経験): 仮の文。実際と違えば、本当のことに書き換える。】</w:t>
+      </w:r>
+    </w:p>
+    <w:p>
+      <w:pPr>
+        <w:pStyle w:val="BodyText"/>
+      </w:pPr>
+      <w:r>
         <w:t xml:space="preserve">十五歳の家出少年に、物語の最初で渡す助言にしては奇妙だ。本の受け取られ方まで含めて見れば、読者への警告でもある。向こう側で答えが待っている謎ではない。自分自身でできた天候で、歩いて通り抜けるしかない。</w:t>
       </w:r>
     </w:p>
@@ -1725,7 +1849,7 @@
         <w:rPr>
           <w:rStyle w:val="FootnoteReference"/>
         </w:rPr>
-        <w:footnoteReference w:id="70"/>
+        <w:footnoteReference w:id="71"/>
       </w:r>
       <w:r>
         <w:t xml:space="preserve"> </w:t>
@@ -1742,8 +1866,8 @@
         <w:t xml:space="preserve">国内では難しく、海外ではしだいにすんなり受け入れられる。矛盾に見えるが、そうではない。日本の文壇が二十年以上疑ってきた性質、つまり平板さ、異質さ、きれいな写実的な意味に収まらないところは、二〇〇〇年代の半ばには、国際的な読者が「彼のもの」と見分けられるものになっていた。どの伝統にもすっきり属していない証拠として読まれることは、もうなかった。属しきれなさから作られた文体は、彼がどこかに属しているかどうかを必要としない読者を、海外で見つけたのだ。</w:t>
       </w:r>
     </w:p>
-    <w:bookmarkEnd w:id="71"/>
-    <w:bookmarkStart w:id="76" w:name="第12章-1q84という事件"/>
+    <w:bookmarkEnd w:id="72"/>
+    <w:bookmarkStart w:id="77" w:name="第12章-1q84という事件"/>
     <w:p>
       <w:pPr>
         <w:pStyle w:val="Heading2"/>
@@ -1757,6 +1881,22 @@
         <w:pStyle w:val="FirstParagraph"/>
       </w:pPr>
       <w:r>
+        <w:t xml:space="preserve">二〇〇九年、一冊の小説が、一枚のCDを売った。</w:t>
+      </w:r>
+    </w:p>
+    <w:p>
+      <w:pPr>
+        <w:pStyle w:val="BodyText"/>
+      </w:pPr>
+      <w:r>
+        <w:t xml:space="preserve">小説は『1Q84』。CDは、ヤナーチェックの『シンフォニエッタ』。経緯は、あとで書く。まず、この本が、どんな本として世に出たのかを見ておく。</w:t>
+      </w:r>
+    </w:p>
+    <w:p>
+      <w:pPr>
+        <w:pStyle w:val="BodyText"/>
+      </w:pPr>
+      <w:r>
         <w:t xml:space="preserve">二巻。発売日は一日。初日が終わらないうちに、四刷が決まった。二〇〇九年五月二十九日に同時発売された『1Q84』で、村上の出版は、作家の経歴というより、日付のある国民的な出来事に見えた。</w:t>
       </w:r>
     </w:p>
@@ -1779,7 +1919,7 @@
         <w:rPr>
           <w:rStyle w:val="FootnoteReference"/>
         </w:rPr>
-        <w:footnoteReference w:id="72"/>
+        <w:footnoteReference w:id="73"/>
       </w:r>
       <w:r>
         <w:t xml:space="preserve"> </w:t>
@@ -1807,7 +1947,7 @@
         <w:rPr>
           <w:rStyle w:val="FootnoteReference"/>
         </w:rPr>
-        <w:footnoteReference w:id="73"/>
+        <w:footnoteReference w:id="74"/>
       </w:r>
       <w:r>
         <w:t xml:space="preserve"> </w:t>
@@ -1827,7 +1967,7 @@
         <w:rPr>
           <w:rStyle w:val="FootnoteReference"/>
         </w:rPr>
-        <w:footnoteReference w:id="74"/>
+        <w:footnoteReference w:id="75"/>
       </w:r>
     </w:p>
     <w:p>
@@ -1835,6 +1975,14 @@
         <w:pStyle w:val="FirstParagraph"/>
       </w:pPr>
       <w:r>
+        <w:t xml:space="preserve">筆者は、この本を読んでから、『シンフォニエッタ』を聞いた。冒頭の数小節で、それと言い当てられたかどうかは、怪しい。【要確認(筆者本人の経験): 仮の文。実際と違えば、本当のことに書き換える。】</w:t>
+      </w:r>
+    </w:p>
+    <w:p>
+      <w:pPr>
+        <w:pStyle w:val="BodyText"/>
+      </w:pPr>
+      <w:r>
         <w:t xml:space="preserve">六百ページの長編の出だしが、聞き流してもいい音楽の蘊蓄である。それが肝心なのだ。これほど小さく、見逃しやすく、読み違えやすい細部が、紙の上の世界は一目見たとおりの世界ではない、という最初の合図になる。章の副題が、本文の最初の一行より前に出していた警告と同じである。</w:t>
       </w:r>
     </w:p>
@@ -1843,13 +1991,13 @@
         <w:pStyle w:val="BodyText"/>
       </w:pPr>
       <w:r>
-        <w:t xml:space="preserve">そこへ現実が、この「事件」に追いついた。本が出ると、日本はそのCDを買いに走った。クリーブランド管弦楽団は、一九九〇年に発売されたCDに約六千件の注文が入ったと語った。ソニーは、刊行後に出荷した枚数が、CD発売以来の全期間の出荷数と並んだと述べた。</w:t>
-      </w:r>
-      <w:r>
-        <w:rPr>
-          <w:rStyle w:val="FootnoteReference"/>
-        </w:rPr>
-        <w:footnoteReference w:id="75"/>
+        <w:t xml:space="preserve">そして、約束どおり、CDの話だ。本が出ると、日本はそのCDを買いに走った。クリーブランド管弦楽団は、一九九〇年に発売されたCDに約六千件の注文が入ったと語った。ソニーは、刊行後に出荷した枚数が、CD発売以来の全期間の出荷数と並んだと述べた。</w:t>
+      </w:r>
+      <w:r>
+        <w:rPr>
+          <w:rStyle w:val="FootnoteReference"/>
+        </w:rPr>
+        <w:footnoteReference w:id="76"/>
       </w:r>
     </w:p>
     <w:p>
@@ -1860,8 +2008,8 @@
         <w:t xml:space="preserve">小説が、小説の中の曲を売った。その曲は、語り手自身が「ほとんど誰も言い当てられない」と書いたものだった。</w:t>
       </w:r>
     </w:p>
-    <w:bookmarkEnd w:id="76"/>
-    <w:bookmarkStart w:id="82" w:name="第13章-村上春樹チルドレンとデタッチメント"/>
+    <w:bookmarkEnd w:id="77"/>
+    <w:bookmarkStart w:id="83" w:name="第13章-村上春樹チルドレンとデタッチメント"/>
     <w:p>
       <w:pPr>
         <w:pStyle w:val="Heading2"/>
@@ -1875,19 +2023,27 @@
         <w:pStyle w:val="FirstParagraph"/>
       </w:pPr>
       <w:r>
-        <w:t xml:space="preserve">読者は、曲を買うだけでは止まらなかった。ファンは、彼のように書き始めた。ツイートを村上春樹風の文章に変えるウェブツールが現れ、その例文のひとつは、完璧なフラペチーノなどといったものは存在しない、と言い切った。</w:t>
-      </w:r>
-      <w:r>
-        <w:rPr>
-          <w:rStyle w:val="FootnoteReference"/>
-        </w:rPr>
-        <w:footnoteReference w:id="77"/>
-      </w:r>
-      <w:r>
-        <w:t xml:space="preserve"> </w:t>
-      </w:r>
-      <w:r>
-        <w:t xml:space="preserve">noteをはじめとする書き手のサイトには、彼の象徴的な言い回しがあふれている。日本人男性のアマチュアのエッセイにも、「やれやれ」というため息に至るまで、彼の声を帯びたものが少なくない。生成AIも、いまではその文体を真似る。それでも、いちばん上手なファンの文章には、かなわない。</w:t>
+        <w:t xml:space="preserve">「完璧なフラペチーノなどといったものは存在しない」。</w:t>
+      </w:r>
+    </w:p>
+    <w:p>
+      <w:pPr>
+        <w:pStyle w:val="BodyText"/>
+      </w:pPr>
+      <w:r>
+        <w:t xml:space="preserve">これは、村上春樹の文ではない。ツイートを村上春樹風の文章に変えるウェブツールが吐き出した、例文のひとつだ。</w:t>
+      </w:r>
+      <w:r>
+        <w:rPr>
+          <w:rStyle w:val="FootnoteReference"/>
+        </w:rPr>
+        <w:footnoteReference w:id="78"/>
+      </w:r>
+      <w:r>
+        <w:t xml:space="preserve"> </w:t>
+      </w:r>
+      <w:r>
+        <w:t xml:space="preserve">読者は、本を買い、曲を買うだけでは止まらなかった。ファンは、彼のように書き始めた。noteをはじめとする書き手のサイトには、彼の象徴的な言い回しがあふれている。日本人男性のアマチュアのエッセイにも、「やれやれ」というため息に至るまで、彼の声を帯びたものが少なくない。生成AIも、いまではその文体を真似る。それでも、いちばん上手なファンの文章には、かなわない。</w:t>
       </w:r>
     </w:p>
     <w:p>
@@ -1901,7 +2057,7 @@
         <w:rPr>
           <w:rStyle w:val="FootnoteReference"/>
         </w:rPr>
-        <w:footnoteReference w:id="78"/>
+        <w:footnoteReference w:id="79"/>
       </w:r>
       <w:r>
         <w:t xml:space="preserve"> </w:t>
@@ -1921,7 +2077,7 @@
         <w:rPr>
           <w:rStyle w:val="FootnoteReference"/>
         </w:rPr>
-        <w:footnoteReference w:id="79"/>
+        <w:footnoteReference w:id="80"/>
       </w:r>
       <w:r>
         <w:t xml:space="preserve"> </w:t>
@@ -1941,7 +2097,7 @@
         <w:rPr>
           <w:rStyle w:val="FootnoteReference"/>
         </w:rPr>
-        <w:footnoteReference w:id="80"/>
+        <w:footnoteReference w:id="81"/>
       </w:r>
       <w:r>
         <w:t xml:space="preserve"> </w:t>
@@ -1961,7 +2117,7 @@
         <w:rPr>
           <w:rStyle w:val="FootnoteReference"/>
         </w:rPr>
-        <w:footnoteReference w:id="81"/>
+        <w:footnoteReference w:id="82"/>
       </w:r>
     </w:p>
     <w:p>
@@ -1972,8 +2128,8 @@
         <w:t xml:space="preserve">この本は、その論争に決着をつけなくても、もっと狭い主張はできる。いちばん正確なラベルが何であれ、日本で、のちには海外でも、読者の世代全体が、自分の漂流、疎外、どんな意味の体系にも最後まで加わらない静かな拒否を、村上の登場人物の中に見分けることを覚えた。「デタッチメント」や「コミットメント」という言葉が批評に使われるのを聞くずっと前のことだ。一九六〇年代の政治運動の挫折に対する、ひとりの作家の私的な幻滅の語彙が、いつのまにか、後の世代全体の標準的な感情の語彙になっていた。その大半は、それがどこから来たのかを知らない。</w:t>
       </w:r>
     </w:p>
-    <w:bookmarkEnd w:id="82"/>
-    <w:bookmarkStart w:id="83" w:name="第二幕のおわりに"/>
+    <w:bookmarkEnd w:id="83"/>
+    <w:bookmarkStart w:id="84" w:name="第二幕のおわりに"/>
     <w:p>
       <w:pPr>
         <w:pStyle w:val="Heading2"/>
@@ -2028,6 +2184,919 @@
       </w:pPr>
       <w:r>
         <w:t xml:space="preserve">そして、この先の十五年で、彼は、もう誰も驚かせられないのか、自分自身さえも、という問いに向かう。</w:t>
+      </w:r>
+    </w:p>
+    <w:bookmarkEnd w:id="84"/>
+    <w:bookmarkEnd w:id="85"/>
+    <w:bookmarkStart w:id="118" w:name="第三幕-未完の声二〇一三"/>
+    <w:p>
+      <w:pPr>
+        <w:pStyle w:val="Heading1"/>
+      </w:pPr>
+      <w:r>
+        <w:t xml:space="preserve">第三幕　未完の声(二〇一三〜)</w:t>
+      </w:r>
+    </w:p>
+    <w:p>
+      <w:pPr>
+        <w:pStyle w:val="FirstParagraph"/>
+      </w:pPr>
+      <w:r>
+        <w:t xml:space="preserve">七十代に入った作家は、もう何も証明しなくていいはずだった。ところが村上春樹は、リアリズムに戻り、歴史に触れ、三十年以上前の失敗作をもう一度書き直し、初めて女性を主人公に据えた。そのあいだに、世界での読まれ方も変わった。この幕では、二〇一三年の『色彩を持たない多崎つくると、彼の巡礼の年』から、結果の出る二〇二六年十月までをたどる。</w:t>
+      </w:r>
+    </w:p>
+    <w:bookmarkStart w:id="90" w:name="第14章-色彩を持たない多崎つくると彼の巡礼の年"/>
+    <w:p>
+      <w:pPr>
+        <w:pStyle w:val="Heading2"/>
+      </w:pPr>
+      <w:r>
+        <w:t xml:space="preserve">第14章　『色彩を持たない多崎つくると、彼の巡礼の年』</w:t>
+      </w:r>
+    </w:p>
+    <w:p>
+      <w:pPr>
+        <w:pStyle w:val="FirstParagraph"/>
+      </w:pPr>
+      <w:r>
+        <w:t xml:space="preserve">『1Q84』のあとに、なぜ、こんなに静かな小説が出たのか。</w:t>
+      </w:r>
+    </w:p>
+    <w:p>
+      <w:pPr>
+        <w:pStyle w:val="BodyText"/>
+      </w:pPr>
+      <w:r>
+        <w:t xml:space="preserve">二つの月、カルト、書き換えられた童話。その先には、もっと遠くがある、と読者は思った。実際には逆だった。二〇一三年四月十二日に文藝春秋から出た『色彩を持たない多崎つくると、彼の巡礼の年』は、村上の十三作目の長編で、足場の固い、驚くほど読みやすい小説だった。</w:t>
+      </w:r>
+      <w:r>
+        <w:rPr>
+          <w:rStyle w:val="FootnoteReference"/>
+        </w:rPr>
+        <w:footnoteReference w:id="86"/>
+      </w:r>
+      <w:r>
+        <w:t xml:space="preserve"> </w:t>
+      </w:r>
+      <w:r>
+        <w:t xml:space="preserve">高校時代の仲間四人から、理由も告げずに絶交された男が、何十年もたって、その理由を確かめにいく。当時の書評は、『1Q84』や『海辺のカフカ』の込み入った構造に比べて、この本がリアリズムに深く根を下ろしていることに、少し驚いている。</w:t>
+      </w:r>
+    </w:p>
+    <w:p>
+      <w:pPr>
+        <w:pStyle w:val="BodyText"/>
+      </w:pPr>
+      <w:r>
+        <w:t xml:space="preserve">この言い方には聞き覚えがある。一九八七年に『ノルウェイの森』が出たとき、批評家が使ったのと、ほとんど同じ言葉だ。どちらも比較的短く、焦点が絞られていて、過去の解けない喪失と向き合う主人公を、切り詰めた写実の文体で描く。前後を超現実的な作品にはさまれているので、よけい目立つ。</w:t>
+      </w:r>
+    </w:p>
+    <w:p>
+      <w:pPr>
+        <w:pStyle w:val="BodyText"/>
+      </w:pPr>
+      <w:r>
+        <w:t xml:space="preserve">違いも指摘されている。『ノルウェイの森』は、失い続ける物語だった。死と不在が積み重なり、語り手は最後まで立ち直りきれない。『多崎つくる』は、回復の物語として読まれてきた。傷と解けない悲しみが、一人称の清算をうながす。骨組みは同じでも、今度は修復に近いところへ向かって組まれている。</w:t>
+      </w:r>
+    </w:p>
+    <w:p>
+      <w:pPr>
+        <w:pStyle w:val="BodyText"/>
+      </w:pPr>
+      <w:r>
+        <w:t xml:space="preserve">二十五年を置いて、同じリアリズムに二度戻る。なぜか。一九八七年の写実は、『羊をめぐる冒険』や『世界の終り』の超現実から距離をとるための、意図的な出発だった。「100パーセントの恋愛小説」という帯の言葉にも、その事情がかかわっている(第7章)。二〇一三年の同じ動きは、何かからの出発というより、手持ちの道具のひとつに見える。語り口のひとつであって、どんな作家になりたいかの表明ではない。反対の書き方も何十年かけて証明してきた作家だけが、この動きを、後退に見せずにやれる。</w:t>
+      </w:r>
+    </w:p>
+    <w:p>
+      <w:pPr>
+        <w:pStyle w:val="BodyText"/>
+      </w:pPr>
+      <w:r>
+        <w:t xml:space="preserve">小説のすべてが悲しみなのではない。前半に、大学のプールの日曜の朝が出てくる。友人の灰田と泳ぐ時間は、つくるの特徴である「空っぽ」に、痛くない形を与える。</w:t>
+      </w:r>
+    </w:p>
+    <w:p>
+      <w:pPr>
+        <w:pStyle w:val="BlockText"/>
+      </w:pPr>
+      <w:r>
+        <w:t xml:space="preserve">灰田の柔らかなキックが小さな白い泡をリズミカルに水中につくり出す光景を、つくるは無心に眺めていた。その光景は彼に常に軽い意識の麻痺状態をもたらした。</w:t>
+      </w:r>
+      <w:r>
+        <w:rPr>
+          <w:rStyle w:val="FootnoteReference"/>
+        </w:rPr>
+        <w:footnoteReference w:id="87"/>
+      </w:r>
+    </w:p>
+    <w:p>
+      <w:pPr>
+        <w:pStyle w:val="FirstParagraph"/>
+      </w:pPr>
+      <w:r>
+        <w:t xml:space="preserve">「空っぽ」は、小説がつくるの内面を言うために、何度も手を伸ばす言葉だ。ここでは、週に三十分だけ、その空っぽが傷でなく、ただのリズムになる。</w:t>
+      </w:r>
+    </w:p>
+    <w:p>
+      <w:pPr>
+        <w:pStyle w:val="BodyText"/>
+      </w:pPr>
+      <w:r>
+        <w:t xml:space="preserve">終わりの数ページでは、回復であって解決ではない、という違いが、構造だけでなく場面そのものになる。つくるは恋人の沙羅に、自分と、彼女が会っているもう一人の男と、どちらを選ぶのか、答えを聞きたいと言った。彼女は、考えるために三日間ほしいと言う。待つあいだに電話が鳴る。つくるは二度、出ずに鳴りやむのを待つ。</w:t>
+      </w:r>
+    </w:p>
+    <w:p>
+      <w:pPr>
+        <w:pStyle w:val="BlockText"/>
+      </w:pPr>
+      <w:r>
+        <w:t xml:space="preserve">コールが十二回続くあいだ、つくるは迷っていた。</w:t>
+      </w:r>
+      <w:r>
+        <w:rPr>
+          <w:rStyle w:val="FootnoteReference"/>
+        </w:rPr>
+        <w:footnoteReference w:id="88"/>
+      </w:r>
+    </w:p>
+    <w:p>
+      <w:pPr>
+        <w:pStyle w:val="FirstParagraph"/>
+      </w:pPr>
+      <w:r>
+        <w:t xml:space="preserve">迷いは解けない。彼は、最初の電話の前にかけたレコードに戻る。ラザール・ベルマンが弾くリストの『巡礼の年』だ。小説の題の「巡礼」は、この曲から借りている。二度目の電話は、数えもしないまま鳴らしておく。</w:t>
+      </w:r>
+    </w:p>
+    <w:p>
+      <w:pPr>
+        <w:pStyle w:val="BodyText"/>
+      </w:pPr>
+      <w:r>
+        <w:t xml:space="preserve">最後の一行は、沙羅の答えを、つくるにも読者にも渡さない。彼は答えを知らないまま眠る。</w:t>
+      </w:r>
+    </w:p>
+    <w:p>
+      <w:pPr>
+        <w:pStyle w:val="BlockText"/>
+      </w:pPr>
+      <w:r>
+        <w:t xml:space="preserve">彼は心を静め、目を閉じて眠りについた。意識の最後尾の明かりが、遠ざかっていく最終の特急列車のように、徐々にスピードを増しながら小さくなり、あとには白樺の木立を抜ける風の音だけが残った。</w:t>
+      </w:r>
+      <w:r>
+        <w:rPr>
+          <w:rStyle w:val="FootnoteReference"/>
+        </w:rPr>
+        <w:footnoteReference w:id="89"/>
+      </w:r>
+    </w:p>
+    <w:p>
+      <w:pPr>
+        <w:pStyle w:val="FirstParagraph"/>
+      </w:pPr>
+      <w:r>
+        <w:t xml:space="preserve">沙羅の返事も、つくるの決断もない。眠る男と、木立を抜ける風だけがある。『ノルウェイの森』が、自分がどこにいるのかまだわからない語り手で終わるなら、『多崎つくる』は、答えを必要としなくなって、ようやく休める語り手で終わる。傷を、解決する前に、その上で眠れるようになること。ここまで見てきた回復の形は、それである。</w:t>
+      </w:r>
+    </w:p>
+    <w:bookmarkEnd w:id="90"/>
+    <w:bookmarkStart w:id="99" w:name="第15章-騎士団長殺しと南京"/>
+    <w:p>
+      <w:pPr>
+        <w:pStyle w:val="Heading2"/>
+      </w:pPr>
+      <w:r>
+        <w:t xml:space="preserve">第15章　『騎士団長殺し』と南京</w:t>
+      </w:r>
+    </w:p>
+    <w:p>
+      <w:pPr>
+        <w:pStyle w:val="BlockText"/>
+      </w:pPr>
+      <w:r>
+        <w:t xml:space="preserve">この章は、南京事件という実際の歴史上の虐殺を扱う。事件が起きたこと自体は、主流の歴史学者のあいだで争われていない。被害者数については、いまも学術的な議論がある。政治的にも評判の面でも敏感な話題なので、複数の出典に基づいて、慎重に書いた。</w:t>
+      </w:r>
+    </w:p>
+    <w:p>
+      <w:pPr>
+        <w:pStyle w:val="FirstParagraph"/>
+      </w:pPr>
+      <w:r>
+        <w:t xml:space="preserve">小説の中の、一本の電話の台詞が、二つの国で、まったく違う意味に聞こえた。</w:t>
+      </w:r>
+    </w:p>
+    <w:p>
+      <w:pPr>
+        <w:pStyle w:val="BodyText"/>
+      </w:pPr>
+      <w:r>
+        <w:t xml:space="preserve">『騎士団長殺し』は、二〇一七年二月二十四日に新潮社から出た。初版は二部合わせて百三十万部。</w:t>
+      </w:r>
+      <w:r>
+        <w:rPr>
+          <w:rStyle w:val="FootnoteReference"/>
+        </w:rPr>
+        <w:footnoteReference w:id="91"/>
+      </w:r>
+      <w:r>
+        <w:t xml:space="preserve"> </w:t>
+      </w:r>
+      <w:r>
+        <w:t xml:space="preserve">肖像画家と、半分だけ命を得た一枚の絵をめぐる、長くて形のいびつな長編だ。その中の一本の糸が、政治的な論争になった。</w:t>
+      </w:r>
+    </w:p>
+    <w:p>
+      <w:pPr>
+        <w:pStyle w:val="BodyText"/>
+      </w:pPr>
+      <w:r>
+        <w:t xml:space="preserve">資産家で正体のつかめない隣人の免色は、語り手に電話で、画家・雨田具彦の家族の歴史を話す。具彦の弟の継彦は、徴兵され、南京で残虐行為に加わることを強いられ、復員後、自分のしたことに耐えきれず命を絶った。免色は、歴史上の事実を、そのまま口にする。</w:t>
+      </w:r>
+    </w:p>
+    <w:p>
+      <w:pPr>
+        <w:pStyle w:val="BlockText"/>
+      </w:pPr>
+      <w:r>
+        <w:t xml:space="preserve">正確に何人が殺害されたか、細部については歴史学者のあいだにも異論がありますが、とにかくおびただしい数の市民が戦闘の巻き添えになって殺されたことは、打ち消しがたい事実です。中国人死者の数を四十万人というものもいれば、十万人というものもいます。</w:t>
+      </w:r>
+      <w:r>
+        <w:rPr>
+          <w:rStyle w:val="FootnoteReference"/>
+        </w:rPr>
+        <w:footnoteReference w:id="92"/>
+      </w:r>
+    </w:p>
+    <w:p>
+      <w:pPr>
+        <w:pStyle w:val="FirstParagraph"/>
+      </w:pPr>
+      <w:r>
+        <w:t xml:space="preserve">数字の食い違いを並べたうえで、殺害そのものは、どちらの数字をとっても動かない事実として押さえている。事件があったこと自体は、日本でも国際的にも、主流の歴史学者のあいだで争われていない。いま学問の上で争われているのは死者の数だ。方法や、どの殺害をどの期間まで数えるかによって、推計は変わる。小説が挙げる二つの数字は、どちらもその実際の幅の中にある。正確な数の不確かさの後ろに、読者が隠れることを許さない。二〇一七年の日本で、これが中立的な歴史の記述として読まれるはずはなかった。</w:t>
+      </w:r>
+    </w:p>
+    <w:p>
+      <w:pPr>
+        <w:pStyle w:val="BodyText"/>
+      </w:pPr>
+      <w:r>
+        <w:t xml:space="preserve">反応は、予想どおりの線で割れた。中国の南京大屠殺遇難同胞紀念館は、公式のウェイボーで歓迎の意を示した。村上の「四十万人でも十万人でも」という言い方を引き、戦後の南京戦犯軍事法廷が三十万人以上の犠牲者を認定したことにも触れた。</w:t>
+      </w:r>
+      <w:r>
+        <w:rPr>
+          <w:rStyle w:val="FootnoteReference"/>
+        </w:rPr>
+        <w:footnoteReference w:id="93"/>
+      </w:r>
+      <w:r>
+        <w:t xml:space="preserve"> </w:t>
+      </w:r>
+      <w:r>
+        <w:t xml:space="preserve">中国のネットには、事件に触れたことだけで村上を良心の作家と称える声もあった。</w:t>
+      </w:r>
+    </w:p>
+    <w:p>
+      <w:pPr>
+        <w:pStyle w:val="BodyText"/>
+      </w:pPr>
+      <w:r>
+        <w:t xml:space="preserve">日本では、作家の百田尚樹と、在特会の元会長・桜井誠が、この箇所を直接批判した。産経新聞も批判的に取り上げた。</w:t>
+      </w:r>
+      <w:r>
+        <w:rPr>
+          <w:rStyle w:val="FootnoteReference"/>
+        </w:rPr>
+        <w:footnoteReference w:id="94"/>
+      </w:r>
+      <w:r>
+        <w:t xml:space="preserve"> </w:t>
+      </w:r>
+      <w:r>
+        <w:t xml:space="preserve">百田は、中国の好意を、ひいてはノーベル賞への勢いを得るために入れたのではないか、とまで言った。桜井は、軍には捕虜を管理する力がなかった、という一節の中身を、支持者にそのまま引いてみせた。反発の相手は、本が政治的になったという漠然とした印象ではなく、具体的な主張だったのである。ウェブメディアの「リテラ」などは、二人が小説のもっと大きな流れを見逃していると反論した。この小説は、単発の挑発ではなく、歴史修正主義に対する持続的な反論になっている、と。当時の報道によれば、日本の主要なニュースポータルにも、この箇所への直接の批判がかなりの量で載った。沈黙ではなかった。</w:t>
+      </w:r>
+    </w:p>
+    <w:p>
+      <w:pPr>
+        <w:pStyle w:val="BodyText"/>
+      </w:pPr>
+      <w:r>
+        <w:t xml:space="preserve">この一節の背後に、もう少し大きな構図を見る批評家がいる。佐々木敦だ。『騎士団長殺し』は肖像画家の小説であり、同時に、構造として、それ自体が一枚の肖像になっている。語り手が描けないと言う、ただ一つのものの肖像として。</w:t>
+      </w:r>
+      <w:r>
+        <w:rPr>
+          <w:rStyle w:val="FootnoteReference"/>
+        </w:rPr>
+        <w:footnoteReference w:id="95"/>
+      </w:r>
+    </w:p>
+    <w:p>
+      <w:pPr>
+        <w:pStyle w:val="BodyText"/>
+      </w:pPr>
+      <w:r>
+        <w:t xml:space="preserve">名前のない語り手は三十六歳で、妻と別れたばかりだ。年老いて施設にいる雨田具彦の、山の上の家に住み、数か月のあいだに何枚かの肖像を描く。資産家の免色。秋川まりえという少女。「白いスバル・フォレスターの男」と呼ぶ、繰り返し現れる脅威的な人物。彼がどうしても描けないのは、顔のない男だ。その男は、物語のはじめと終わりに二度来て、まさにそれを頼む。語り手の説明は、問題と同じくらい素っ気ない。</w:t>
+      </w:r>
+    </w:p>
+    <w:p>
+      <w:pPr>
+        <w:pStyle w:val="BlockText"/>
+      </w:pPr>
+      <w:r>
+        <w:t xml:space="preserve">なにしろそこにあるのはただの無なのだ。何もないものをいったいどのように造形すればいいのだろう？</w:t>
+      </w:r>
+      <w:r>
+        <w:rPr>
+          <w:rStyle w:val="FootnoteReference"/>
+        </w:rPr>
+        <w:footnoteReference w:id="96"/>
+      </w:r>
+    </w:p>
+    <w:p>
+      <w:pPr>
+        <w:pStyle w:val="FirstParagraph"/>
+      </w:pPr>
+      <w:r>
+        <w:t xml:space="preserve">佐々木の読みでは、この描けない「無」が、語り手が最初のページで書いていると言う本の、本当の主題だ。今度は絵ではなく、六百ページの小説そのものが、自分の媒体では抱えきれなかった空白の、代わりの肖像になっている。</w:t>
+      </w:r>
+    </w:p>
+    <w:p>
+      <w:pPr>
+        <w:pStyle w:val="BodyText"/>
+      </w:pPr>
+      <w:r>
+        <w:t xml:space="preserve">佐々木は、題名の由来になった隠された絵の背後に、もう一層の歴史を組み立てる。一九三八年のアンシュルス前のウィーンにいた若い具彦は、抵抗運動の計画に巻きこまれ、実行される前に父親に連れ戻された。残った仲間は逮捕され、おそらく殺された。そのあいだに弟の継彦は徴兵され、中国へ送られ、佐々木の説明では、一九三七年十二月の南京陥落の場にいた。佐々木自身が、これは推論だと断っている。「らしい」という言葉が、ここでは大きな仕事をしていて、「最後まで、すべてが憶測の領域にとどまるから」だ、と。</w:t>
+      </w:r>
+      <w:r>
+        <w:rPr>
+          <w:rStyle w:val="FootnoteReference"/>
+        </w:rPr>
+        <w:footnoteReference w:id="97"/>
+      </w:r>
+    </w:p>
+    <w:p>
+      <w:pPr>
+        <w:pStyle w:val="BodyText"/>
+      </w:pPr>
+      <w:r>
+        <w:t xml:space="preserve">この小説の背後には、もう一つ、時計がある。物語は長いあいだ、いつのことかを言わない。それが変わるのは最終章だ。語り手が、何年も後になって、三月十一日に東北の海岸を襲った「大きな地震」の報道を、テレビで見たことに触れる。かつて通りかかった小さな海辺の町のひとつも、それで壊れた。二か月後には、物語の中心にある山の家が、火事で焼ける。</w:t>
+      </w:r>
+      <w:r>
+        <w:rPr>
+          <w:rStyle w:val="FootnoteReference"/>
+        </w:rPr>
+        <w:footnoteReference w:id="98"/>
+      </w:r>
+      <w:r>
+        <w:t xml:space="preserve"> </w:t>
+      </w:r>
+      <w:r>
+        <w:t xml:space="preserve">最終章のある細部、秋川まりえの後の年齢から逆算して、佐々木は、中心の出来事が二〇〇七年五月から二〇〇八年の初めにかけて起きたと割り出す。語り手が六百ページかけて語る出来事は、最後の数ページにだけ出てくる災害の、三、四年前だった。</w:t>
+      </w:r>
+    </w:p>
+    <w:p>
+      <w:pPr>
+        <w:pStyle w:val="BodyText"/>
+      </w:pPr>
+      <w:r>
+        <w:t xml:space="preserve">村上は、前にも、こういう作りの本を書いている。第10章で見た『神の子どもたちはみな踊る』の六つの短編は、阪神・淡路大震災の一月と地下鉄サリン事件の三月のあいだ、一九九五年二月を舞台にしていて、どちらの出来事も紙の上には描かない。『騎士団長殺し』は、同じ操作の長い版だ。私的で、超現実的で、比喩に満ちた危機の小説が、最後になって初めて、二〇一一年三月十一日へのカウントダウンだったとわかる。本はその災害を描かず、語り手は、あとから遠くでテレビを見るだけだ。佐々木は、地震と福島の事故を、小説の文字どおりの主題とは読まない。顔のない男を語り手が描けないように、村上の小説も、それ以上は直接近づけない出来事を前にして、「無」を描くことの不可能性についての、長く自己言及的な小説になった。そして、その最後のページを、その「無」が届いた日に、そっと置いた。佐々木はそう読む。</w:t>
+      </w:r>
+    </w:p>
+    <w:p>
+      <w:pPr>
+        <w:pStyle w:val="BodyText"/>
+      </w:pPr>
+      <w:r>
+        <w:t xml:space="preserve">これを、これまでの幕で見たものと並べてみる。一九七九年のデビューが、外国の小説の模倣だと退けられた作家。九〇年代に、『ねじまき鳥クロニクル』のノモンハンの場面で、超現実の文体が本物の歴史の重みに耐えると示した作家。『神の子どもたちはみな踊る』で、災害に斜めから近づく方法を編み出した作家。その人が、国内の読者のかなりの部分が、いまも口に出されるのを聞きたがらない歴史的事実を、一つの家族の悲劇の核に置いた。そして、ある批評的な読みでは、小説全体の構造を使って、まだ直接には書けないでいた、もう一つの、もっと最近の災厄に近づいた。それを自分の名前で書いて出すことは、あの時期、あの国では、小さなことではなかった。七十近い作家が、文壇の初期の厳しい評決から何十年も離れたあとで、それでもやった。しかも、二つ以上の層で、同時に。</w:t>
+      </w:r>
+    </w:p>
+    <w:bookmarkEnd w:id="99"/>
+    <w:bookmarkStart w:id="102" w:name="第16章-ドライブマイカー"/>
+    <w:p>
+      <w:pPr>
+        <w:pStyle w:val="Heading2"/>
+      </w:pPr>
+      <w:r>
+        <w:t xml:space="preserve">第16章　『ドライブ・マイ・カー』</w:t>
+      </w:r>
+    </w:p>
+    <w:p>
+      <w:pPr>
+        <w:pStyle w:val="FirstParagraph"/>
+      </w:pPr>
+      <w:r>
+        <w:t xml:space="preserve">アカデミー賞を取った映画の原作は、長編ではなかった。短編集の中の一編だ。</w:t>
+      </w:r>
+    </w:p>
+    <w:p>
+      <w:pPr>
+        <w:pStyle w:val="BodyText"/>
+      </w:pPr>
+      <w:r>
+        <w:t xml:space="preserve">今世紀、村上春樹の国際的な知名度をいちばん押し上げたのは、二〇一四年の短編集『女のいない男たち』をもとにした、三時間の映画だった。</w:t>
+      </w:r>
+    </w:p>
+    <w:p>
+      <w:pPr>
+        <w:pStyle w:val="BodyText"/>
+      </w:pPr>
+      <w:r>
+        <w:t xml:space="preserve">濱口竜介監督、大江崇允との共同脚本の『ドライブ・マイ・カー』は、二〇二一年に公開され、第九十四回アカデミー賞で、日本映画がそれまでやったことのない展開をした。作品賞と国際長編映画賞にノミネートされた。日本の作品が作品賞の候補になるのは初めてだった。監督賞と脚色賞にも候補が入った。受賞は国際長編映画賞で、競争の末にこの賞をとった日本映画としては、二〇〇九年の『おくりびと』に次ぐ二本目になる。数か月前のカンヌ国際映画祭では脚本賞をとった。日本人の脚本家がこの賞をとるのは、初めてだった。</w:t>
+      </w:r>
+      <w:r>
+        <w:rPr>
+          <w:rStyle w:val="FootnoteReference"/>
+        </w:rPr>
+        <w:footnoteReference w:id="100"/>
+      </w:r>
+    </w:p>
+    <w:p>
+      <w:pPr>
+        <w:pStyle w:val="BodyText"/>
+      </w:pPr>
+      <w:r>
+        <w:t xml:space="preserve">濱口が「ドライブ・マイ・カー」を初めて読んだのは、三十代の半ばだった。『文藝春秋』に載ったときのことで、人にすすめられたという。</w:t>
+      </w:r>
+      <w:r>
+        <w:rPr>
+          <w:rStyle w:val="FootnoteReference"/>
+        </w:rPr>
+        <w:footnoteReference w:id="101"/>
+      </w:r>
+      <w:r>
+        <w:t xml:space="preserve"> </w:t>
+      </w:r>
+      <w:r>
+        <w:t xml:space="preserve">驚いたのは、短編が自分の仕事にあまりに近かったことだ。演技についての話で、ほとんどが車の中の会話でできている。当時の濱口は、村上を映画にするのは現実的ではないと感じていた。ただ、これなら近づけるかもしれない、とは思った。</w:t>
+      </w:r>
+    </w:p>
+    <w:p>
+      <w:pPr>
+        <w:pStyle w:val="BodyText"/>
+      </w:pPr>
+      <w:r>
+        <w:t xml:space="preserve">なぜ三つの短編なのか。書かれたままに映画にすると、長編映画の観客に、はっきりした決着を渡せない。それでは物足りないだろう、と濱口は言う。答えは、同じ短編集の中にあった。『女のいない男たち』を読みなおして、「木野」が、すでにそれを持っていると気づいたのだ。「木野」の舞台のバーは、「ドライブ・マイ・カー」の中にも出てくる。濱口は、村上自身が、この短編集を書くあいだに何かが変わった場所として「木野」を読み、主人公の家福が最後にたどり着く場所にした。村上に許可を求める手紙を書いたころには、映画の構成は、画面に出たものにすでに近かった、と彼は言う。</w:t>
+      </w:r>
+    </w:p>
+    <w:p>
+      <w:pPr>
+        <w:pStyle w:val="BodyText"/>
+      </w:pPr>
+      <w:r>
+        <w:t xml:space="preserve">「シェエラザード」は、別の仕事をした。家福の妻に厚みを与え、彼女の遺したもの、つまり性と結びついた物語を、若い俳優の高槻に持たせた。</w:t>
+      </w:r>
+    </w:p>
+    <w:p>
+      <w:pPr>
+        <w:pStyle w:val="BodyText"/>
+      </w:pPr>
+      <w:r>
+        <w:t xml:space="preserve">チェーホフは、あとから足したものではない。村上の短編の中で、家福は『ワーニャ伯父さん』のワーニャを演じる俳優で、小説はすでに、家福をワーニャに、若い運転手のみさきをワーニャの姪のソーニャに結びつけている。濱口が挙げるのは、器量が悪く生まれたというソーニャの嘆きで、みさきはそれを自分のものとして受け取る。もう一つは、ワーニャが、六十で死ぬとして、自分に残された年月を数える計算で、家福はそれを自分のものとして聞く。映画は、小説が植えていたものを広げただけだ。</w:t>
+      </w:r>
+    </w:p>
+    <w:p>
+      <w:pPr>
+        <w:pStyle w:val="BodyText"/>
+      </w:pPr>
+      <w:r>
+        <w:t xml:space="preserve">みさきが大きくなったのには、別の理由がある。濱口は彼女を、村上の描いた人物のなかでもとくに魅力的な一人と呼ぶ。謎をそのまま残したくて、どの俳優にもするように、その役の来歴を書いた。来歴は膨らみ、改稿の中で、映画の本編に流れこんだ。影響として彼が挙げる一冊は、この本の第二幕で出てきた『村上春樹、河合隼雄に会いにいく』だ。村上と心理学者の河合隼雄が、物語は現実から、きれいには切り離せない、無意識の抑圧されたものが現れる形だ、と話している対談である。</w:t>
+      </w:r>
+    </w:p>
+    <w:p>
+      <w:pPr>
+        <w:pStyle w:val="BodyText"/>
+      </w:pPr>
+      <w:r>
+        <w:t xml:space="preserve">小さな変更にも理由がある。家福の黄色いサーブ900のコンバーチブルは、赤いサーブ900ターボのサンルーフ付きになった。風景に緑が多く、赤が映えるからだ。小説では、家福は助手席にすわる。映画では、たいてい後部座席にいる。後ろの席の客は運転手の視線から外れてくつろげるし、近い関係を思わせる助手席は、あとのために取っておける。筋の細部も、一つ、はっきり変わった。小説では、ある重要な人物の母親は運転中の事故で死ぬ。映画では、土砂崩れで死ぬ。</w:t>
+      </w:r>
+    </w:p>
+    <w:p>
+      <w:pPr>
+        <w:pStyle w:val="BodyText"/>
+      </w:pPr>
+      <w:r>
+        <w:t xml:space="preserve">ほとんど変えなかった一節がある。高槻が家福に、本当に誰かを見たいなら、まっすぐ深く自分自身の中を見るしかない、と話す長い台詞だ。映画は、ほぼ一字一句、小説に従った。濱口が最初に読んだとき、いちばんはっきり残った部分だった。小説の中で家福は、その言葉を、高槻の深い特別な場所から立ちのぼるものとして聞く。濱口は、村上自身が、そういう場所に潜って書いたのだと考えている。言葉には曇りのない響きがあり、そういう台詞は、言わなければならない俳優に働きかける、と彼は言い、高槻を演じた岡田将生に功績を渡す。映画は、この台詞をバーから車の中へ移した。結末の都合で、みさきにも聞こえるようにするため、そして題名と結びつけるためだ。</w:t>
+      </w:r>
+    </w:p>
+    <w:p>
+      <w:pPr>
+        <w:pStyle w:val="BodyText"/>
+      </w:pPr>
+      <w:r>
+        <w:t xml:space="preserve">村上の何が映画にしにくいのか。そう聞かれた濱口は、この世のものではない部分を挙げる。村上の文章には、描写のリアリズムがあって、存在しないものを、きっとあるのだと信じさせる。映画に幻想を足しても、それがすべて私たちの心の中で起きている、という確信の強さには届かない、と彼は言う。</w:t>
+      </w:r>
+    </w:p>
+    <w:p>
+      <w:pPr>
+        <w:pStyle w:val="BodyText"/>
+      </w:pPr>
+      <w:r>
+        <w:t xml:space="preserve">だから、オスカーをとった映画は、村上のリアリズムの側面を映した版で、その深みの一部は、ほかの二つの短編から借りて戻してある。同じ壁の街へ戻り続ける作家を扱うこの幕で、この映画は、注意深い読み手が村上の世界から何を持ち出せて、何を置いていくことにしたのかを、見せてくれる。</w:t>
+      </w:r>
+    </w:p>
+    <w:bookmarkEnd w:id="102"/>
+    <w:bookmarkStart w:id="107" w:name="第17章-街とその不確かな壁"/>
+    <w:p>
+      <w:pPr>
+        <w:pStyle w:val="Heading2"/>
+      </w:pPr>
+      <w:r>
+        <w:t xml:space="preserve">第17章　『街とその不確かな壁』</w:t>
+      </w:r>
+    </w:p>
+    <w:p>
+      <w:pPr>
+        <w:pStyle w:val="FirstParagraph"/>
+      </w:pPr>
+      <w:r>
+        <w:t xml:space="preserve">村上春樹は、同じ街を、なぜ三度書いたのか。</w:t>
+      </w:r>
+    </w:p>
+    <w:p>
+      <w:pPr>
+        <w:pStyle w:val="BodyText"/>
+      </w:pPr>
+      <w:r>
+        <w:t xml:space="preserve">二〇二三年四月十三日に新潮社から出た『街とその不確かな壁』は、原稿用紙で約千二百枚の長編で、その由来は、本そのものより長い。</w:t>
+      </w:r>
+      <w:r>
+        <w:rPr>
+          <w:rStyle w:val="FootnoteReference"/>
+        </w:rPr>
+        <w:footnoteReference w:id="103"/>
+      </w:r>
+    </w:p>
+    <w:p>
+      <w:pPr>
+        <w:pStyle w:val="BodyText"/>
+      </w:pPr>
+      <w:r>
+        <w:t xml:space="preserve">始まりは一九八〇年だ。村上は「街と、その不確かな壁」という中編を発表した。のちの題と違って、読点がある。この作品への村上自身の評価は、優しかったことがない。満足のいかない、中途半端な形で発表した、と語り、のちのインタビューでは、あれは「失敗作」だった、あの形で書くべきではなかった、とまで言っている。自分の発表した仕事への評価としては、異例に厳しい。謙遜としてではなく、真剣に受け取るべき言葉だ。</w:t>
+      </w:r>
+    </w:p>
+    <w:p>
+      <w:pPr>
+        <w:pStyle w:val="BodyText"/>
+      </w:pPr>
+      <w:r>
+        <w:t xml:space="preserve">そのあとのことは、第6章を読んだ人ならもう知っている。一九八五年、村上は一九八〇年の中編の出来に満足せず、その核になる素材を作り直して、『世界の終りとハードボイルド・ワンダーランド』にした。第6章で、私と僕の分裂した語りを見た、あの小説だ。金色の獣が守る、壁に囲まれた季節のない街は、分裂した語り手の「僕」の半分に属している。それでも、この二度目の書き直しで、問題は片づかなかった。村上は、急ぎすぎた、あと二年は素材を寝かせておけばよかった、と言っている。一九八〇年の中編を失敗と呼んだ不満は、それを乗り越えるために書いた一冊の長編のあとも残り、まだ解けなかった。</w:t>
+      </w:r>
+    </w:p>
+    <w:p>
+      <w:pPr>
+        <w:pStyle w:val="BodyText"/>
+      </w:pPr>
+      <w:r>
+        <w:t xml:space="preserve">二〇二三年の小説の「街」を、第6章で引いた『世界の終り』の街と並べると、連続性は、言い回しにいたるまで、すぐにわかる。金色の獣は、まだそこにいて、同じ季節の周期で金色になる。</w:t>
+      </w:r>
+    </w:p>
+    <w:p>
+      <w:pPr>
+        <w:pStyle w:val="BlockText"/>
+      </w:pPr>
+      <w:r>
+        <w:t xml:space="preserve">秋、獣たちの体は、来たるべき寒い季節に備えて輝かしい金色の毛に覆われる。額に生えた単角は鋭く白い。</w:t>
+      </w:r>
+      <w:r>
+        <w:rPr>
+          <w:rStyle w:val="FootnoteReference"/>
+        </w:rPr>
+        <w:footnoteReference w:id="104"/>
+      </w:r>
+    </w:p>
+    <w:p>
+      <w:pPr>
+        <w:pStyle w:val="FirstParagraph"/>
+      </w:pPr>
+      <w:r>
+        <w:t xml:space="preserve">三十八年前に『世界の終り』で、「金色として世界に生じ、金色として世界に存在した」と描かれた獣と、同じ像だ。同じ動物が、三十八年を置いて、同じように描かれている。</w:t>
+      </w:r>
+    </w:p>
+    <w:p>
+      <w:pPr>
+        <w:pStyle w:val="BodyText"/>
+      </w:pPr>
+      <w:r>
+        <w:t xml:space="preserve">違うのは、その像のまわりに、二〇二三年の版がどれだけのものを築いたかだ。門には専従の門番がいる。体の大きな几帳面な男で、毎朝、獣の毛を整えるのと同じ大きな鋭い剃刀で、自分の頭と顔を剃る。朝と夕には、門番小屋のそばの小さな塔に上って、角笛を吹く。語り手が、男のいかつい外見にしては、と驚くほど、柔らかくよく響く音だ。</w:t>
+      </w:r>
+      <w:r>
+        <w:rPr>
+          <w:rStyle w:val="FootnoteReference"/>
+        </w:rPr>
+        <w:footnoteReference w:id="105"/>
+      </w:r>
+      <w:r>
+        <w:t xml:space="preserve"> </w:t>
+      </w:r>
+      <w:r>
+        <w:t xml:space="preserve">壁の外の獣の世界には、はるかに暗い季節もある。毎年春の一週間、獣たちは、角を互いの喉や腹に向けて、雌をめぐって戦う。食べることも忘れ、何頭も死ぬまで戦う。その一週間、門番は、暴力が街の通りに届かないように、門を完全に閉じる。</w:t>
+      </w:r>
+      <w:r>
+        <w:rPr>
+          <w:rStyle w:val="FootnoteReference"/>
+        </w:rPr>
+        <w:footnoteReference w:id="106"/>
+      </w:r>
+      <w:r>
+        <w:t xml:space="preserve"> </w:t>
+      </w:r>
+      <w:r>
+        <w:t xml:space="preserve">第6章で見た『世界の終り』の「金色の獣」の章には、この交尾期の凶暴さはまったくなかった。二〇二三年の本は、核になる像をそのまま残し、前の二回よりも四百ページ多く使って、壁の街がその下で動いている仕組みと儀式と暴力を築いた。</w:t>
+      </w:r>
+    </w:p>
+    <w:p>
+      <w:pPr>
+        <w:pStyle w:val="BodyText"/>
+      </w:pPr>
+      <w:r>
+        <w:t xml:space="preserve">三度目に同じ素材に取り組んだこの小説は、最初の試みから四十年以上たっている。その粘りは、何かを語っている。キャリアのこれほど遅い時期に、新しい思いつきを使い果たした作家が、古い素材に戻ってきたのではない。この本の残りの部分は、すべて逆のことを言っている。七十代に入っても、本物の歴史上の危険と、本物の形式上の実験に挑む作家だ。もっと文字どおりの意味で、やり残した仕事に近い。三十一歳で最初に思い描いた壁の街を、三十六歳で、初期のもっとも評価された小説の中に作り直した。それでもうまく書けたと思えず、七十四歳で、三度目に戻って、きちんと仕上げた。作家人生の土台になった像を、何十年を置いて、三回、公然と書き直す機会を与えられる作家は、少ない。最初の二回を、三回目に至る途中の失敗と呼ぶ度胸のある作家は、もっと少ない。</w:t>
+      </w:r>
+    </w:p>
+    <w:bookmarkEnd w:id="107"/>
+    <w:bookmarkStart w:id="111" w:name="第18章-ノーベル賞という賭け"/>
+    <w:p>
+      <w:pPr>
+        <w:pStyle w:val="Heading2"/>
+      </w:pPr>
+      <w:r>
+        <w:t xml:space="preserve">第18章　ノーベル賞という賭け</w:t>
+      </w:r>
+    </w:p>
+    <w:p>
+      <w:pPr>
+        <w:pStyle w:val="FirstParagraph"/>
+      </w:pPr>
+      <w:r>
+        <w:t xml:space="preserve">【この章の後半(結果を受けた部分)は、二〇二六年十月八日の発表後に書く。結果ごとの二つの版を</w:t>
+      </w:r>
+      <w:r>
+        <w:t xml:space="preserve"> </w:t>
+      </w:r>
+      <w:r>
+        <w:rPr>
+          <w:rStyle w:val="VerbatimChar"/>
+        </w:rPr>
+        <w:t xml:space="preserve">nobel-branches/</w:t>
+      </w:r>
+      <w:r>
+        <w:t xml:space="preserve"> </w:t>
+      </w:r>
+      <w:r>
+        <w:t xml:space="preserve">に用意する。以下は、結果に左右されない前半。】</w:t>
+      </w:r>
+    </w:p>
+    <w:p>
+      <w:pPr>
+        <w:pStyle w:val="BodyText"/>
+      </w:pPr>
+      <w:r>
+        <w:t xml:space="preserve">毎年十月になると、日本のメディアは同じ記事を出す。村上春樹はノーベル文学賞の有力候補で、発表が近い。今年こそ、かもしれない。そして毎年、スウェーデン・アカデミーは別の名前を挙げ、翌秋まで話は巻き戻る。年中行事、と言ってもいい。</w:t>
+      </w:r>
+    </w:p>
+    <w:p>
+      <w:pPr>
+        <w:pStyle w:val="BodyText"/>
+      </w:pPr>
+      <w:r>
+        <w:t xml:space="preserve">二〇一七年の発表の夜、約二百人のファンが、東京・千駄ヶ谷の鳩森八幡神社に集まった。村上がかつてジャズ喫茶を営んでいた場所の近くだ。報道陣に囲まれ、ライブ配信で発表を見るために。みんなクラッカーを持ってきていた。アカデミーが挙げた名前は、カズオ・イシグロだった。毎日新聞によれば、驚きの声を上げた人もいれば、黙った人もいた。それから、みんなは拍手をして、イシグロのためにクラッカーを鳴らした。</w:t>
+      </w:r>
+      <w:r>
+        <w:rPr>
+          <w:rStyle w:val="FootnoteReference"/>
+        </w:rPr>
+        <w:footnoteReference w:id="108"/>
+      </w:r>
+    </w:p>
+    <w:p>
+      <w:pPr>
+        <w:pStyle w:val="BodyText"/>
+      </w:pPr>
+      <w:r>
+        <w:t xml:space="preserve">この種の報道が素通りする事実がある。ノーベル文学賞は、候補者の名簿を公表しない。候補者の記録は、賞の規則で五十年間封印される。</w:t>
+      </w:r>
+      <w:r>
+        <w:rPr>
+          <w:rStyle w:val="FootnoteReference"/>
+        </w:rPr>
+        <w:footnoteReference w:id="109"/>
+      </w:r>
+      <w:r>
+        <w:t xml:space="preserve"> </w:t>
+      </w:r>
+      <w:r>
+        <w:t xml:space="preserve">だから、ある年に村上が最終候補だったと、公式に確認できる名簿は存在しない。候補者が存命のうちは、公表されないのだ。毎年の見出しを動かしているのは、それよりずっと権威の低いものだ。イギリスのブックメーカーが、この賞について出している賭けの相場である。競馬や選挙に出すのと同じ種類の、推測による賭け率で、村上の名前は十年以上、その表の上位にい続けた。倍率は、ブックメーカーと年によって大きく揺れ、短いときは三倍、長いときは十六倍まで動いた。</w:t>
+      </w:r>
+      <w:r>
+        <w:rPr>
+          <w:rStyle w:val="FootnoteReference"/>
+        </w:rPr>
+        <w:footnoteReference w:id="110"/>
+      </w:r>
+      <w:r>
+        <w:t xml:space="preserve"> </w:t>
+      </w:r>
+      <w:r>
+        <w:t xml:space="preserve">日本のメディアは二十年にわたって、この賭け率を、スウェーデン・アカデミーの議論の内側から来た信号であるかのように扱ってきた。実際には、賭ける素人と、その賭けに値段をつけるブックメーカーが、どの名前を知っているかを映しているだけだ。</w:t>
+      </w:r>
+    </w:p>
+    <w:p>
+      <w:pPr>
+        <w:pStyle w:val="BodyText"/>
+      </w:pPr>
+      <w:r>
+        <w:t xml:space="preserve">だからといって、なぜ取れないのか、という問いに意味がないわけではない。ブックメーカーの芝居とは別に、その問いは立てられる。賞を長く追ってきた日本の論者がときどき挙げる説明に、スウェーデン・アカデミーの会員が年月のうちに入れ替わり、それに応じて、評価される作家や作品の種類が移ってきた、というものがある。構造的で制度的な、本物の説明だ。そして、「もう少しで取れそうなのに」という話に比べて、ずっと物足りない説明でもある。いちばん正確な見方は、村上の作品が毎年あと一歩で足りない、というものではなかったことになるからだ。賭けの市場の上に「今度こそ取るか」という二十年の物語を、国内のメディアが築いてきた。その市場は、賞について何かを報告したことが、一度もなかった。</w:t>
+      </w:r>
+    </w:p>
+    <w:p>
+      <w:pPr>
+        <w:pStyle w:val="BodyText"/>
+      </w:pPr>
+      <w:r>
+        <w:t xml:space="preserve">【ノーベル賞の結果を受けた節: 受賞した場合と受賞しなかった場合の版を、発表後に書く。】</w:t>
+      </w:r>
+    </w:p>
+    <w:bookmarkEnd w:id="111"/>
+    <w:bookmarkStart w:id="114" w:name="第19章-村上研究という世界"/>
+    <w:p>
+      <w:pPr>
+        <w:pStyle w:val="Heading2"/>
+      </w:pPr>
+      <w:r>
+        <w:t xml:space="preserve">第19章　村上研究という世界</w:t>
+      </w:r>
+    </w:p>
+    <w:p>
+      <w:pPr>
+        <w:pStyle w:val="FirstParagraph"/>
+      </w:pPr>
+      <w:r>
+        <w:t xml:space="preserve">二〇二〇年代には、「村上春樹」は、批評家が折にふれて書く対象を超えて、学問の一分野になっていた。早稲田大学は、彼の母校で、国際文学館を置いている。「村上春樹ライブラリー」の通称を併記し、彼の原稿や資料を所蔵して、継続的な学術プログラムを開く施設だ。台湾の淡江大学の村上春樹研究センターが近年組織してきた「国際村上春樹シンポジウム」は、彼の作品だけを扱う定期的な学会で、二〇二五年七月に京都大学で開かれたときには、十四回目になっていた。</w:t>
+      </w:r>
+      <w:r>
+        <w:rPr>
+          <w:rStyle w:val="FootnoteReference"/>
+        </w:rPr>
+        <w:footnoteReference w:id="112"/>
+      </w:r>
+      <w:r>
+        <w:t xml:space="preserve"> </w:t>
+      </w:r>
+      <w:r>
+        <w:t xml:space="preserve">企画には、バスツアーまで含まれていた。ふつうは、すでに亡くなって、定着した正典に入るだけの時間がたった作家のものだ。別に、東アジア村上春樹研究会も、独自の学術的な活動と越境的なシンポジウムを続けている。</w:t>
+      </w:r>
+    </w:p>
+    <w:p>
+      <w:pPr>
+        <w:pStyle w:val="BodyText"/>
+      </w:pPr>
+      <w:r>
+        <w:t xml:space="preserve">この関心の地理は、二つに分かれる。学術シンポジウムの参加者は、ヨーロッパの研究者に偏っていて、日本で開かれる学会に大陸じゅうから集まる。商業的な読者は逆に、東アジア、とくに中国語圏の中国、台湾、香港、マレーシアで、いちばん強い。大学で村上を研究する人と、いちばん大勢で村上を買って読む人は、かなりの程度、別の大陸にいる別の聴衆で、同じ作品群と、別の種類の付き合い方をしている。</w:t>
+      </w:r>
+    </w:p>
+    <w:p>
+      <w:pPr>
+        <w:pStyle w:val="BodyText"/>
+      </w:pPr>
+      <w:r>
+        <w:t xml:space="preserve">商業的な読者の側を、数字で語る人がいる。中国語訳者の林少華は、自分が訳した四十四作品の発行部数が、二〇二〇年十二月までに千三百五十万部にのぼると書いた。一部を平均四人が読むという説で計算すれば、五千四百万人以上になる、と。自分を「世界最大の村上文学翻訳者」と呼び、「最大」は翻訳の質ではなく、読者の数のことだ、と断っている。</w:t>
+      </w:r>
+      <w:r>
+        <w:rPr>
+          <w:rStyle w:val="FootnoteReference"/>
+        </w:rPr>
+        <w:footnoteReference w:id="113"/>
+      </w:r>
+      <w:r>
+        <w:t xml:space="preserve"> </w:t>
+      </w:r>
+      <w:r>
+        <w:t xml:space="preserve">これは本人の見積もりで、発行部数も読者数も、独立した統計では確認していない。それでも、これだけの読者が、一人の訳者の文体を通して村上を読んできた、という事実は重い。林は、百人の訳者がいれば百様の春樹が生じる、と言い、自分の訳は文体が美しすぎるという批判を、世界のどこかで耳にしたとも書いている。「村上春樹」は、翻訳のたびに、別の声になる。この本が追ってきた声は、そのうちの一つにすぎない。</w:t>
+      </w:r>
+    </w:p>
+    <w:p>
+      <w:pPr>
+        <w:pStyle w:val="BodyText"/>
+      </w:pPr>
+      <w:r>
+        <w:t xml:space="preserve">その下に、街の水準で、三つ目の関わり方がある。文学観光だ。東京を歩くガイド付きのツアーが、彼の小説や経歴にかかわる場所をたどる。早稲田大学は、その起点に近い場所として扱われる。まだ作家になる前の若い村上が学んだところで、彼はそのあと、ピーターキャットを開き、店を閉めた明け方に、『風の歌を聴け』を書きはじめた。</w:t>
+      </w:r>
+    </w:p>
+    <w:p>
+      <w:pPr>
+        <w:pStyle w:val="BodyText"/>
+      </w:pPr>
+      <w:r>
+        <w:t xml:space="preserve">一九七九年と一九八〇年に、彼の文章が日本のどんな伝統に属するのかを、国の文壇が疑った作家は、いまや、原稿を所蔵する大学付属の図書館と、二桁の回数を重ねる国際学会と、かつて彼が住み、働いた町を、まさにそのために歩く観光客を持っている。芥川賞の選考委員が与えなかった種類の制度的な正統性は、結局、誰も予想しなかった道筋で届いた。賞そのものを通してではなく、そのまわりを通って。芥川賞の許可がなくても、最初から彼を真剣に受け取ってきた、何十年分の読者と研究者によって、築かれたものだ。</w:t>
+      </w:r>
+    </w:p>
+    <w:bookmarkEnd w:id="114"/>
+    <w:bookmarkStart w:id="116" w:name="第20章-最新作夏帆ネタバレなし"/>
+    <w:p>
+      <w:pPr>
+        <w:pStyle w:val="Heading2"/>
+      </w:pPr>
+      <w:r>
+        <w:t xml:space="preserve">第20章　最新作『夏帆』(ネタバレなし)</w:t>
+      </w:r>
+    </w:p>
+    <w:p>
+      <w:pPr>
+        <w:pStyle w:val="FirstParagraph"/>
+      </w:pPr>
+      <w:r>
+        <w:t xml:space="preserve">最新作のことは、少しだけ書く。まだ多くの人が読んでいる最中で、筋に触れるのは、この本の仕事ではないからだ。</w:t>
+      </w:r>
+    </w:p>
+    <w:p>
+      <w:pPr>
+        <w:pStyle w:val="BodyText"/>
+      </w:pPr>
+      <w:r>
+        <w:t xml:space="preserve">二〇二六年七月三日に出た『夏帆――The Tale of KAHO――』は、村上の長編で初めて、女性が単独の主人公になった。出た直後から三十万部を超えて売れた。公式の紹介文は、二十六歳の絵本作家が、初対面の男に容姿を罵られる場面から始まり、そのあと、彼女の周りで「実にさまざまな奇妙な出来事」が起こりはじめる、と告げている。</w:t>
+      </w:r>
+      <w:r>
+        <w:rPr>
+          <w:rStyle w:val="FootnoteReference"/>
+        </w:rPr>
+        <w:footnoteReference w:id="115"/>
+      </w:r>
+    </w:p>
+    <w:p>
+      <w:pPr>
+        <w:pStyle w:val="BodyText"/>
+      </w:pPr>
+      <w:r>
+        <w:t xml:space="preserve">この本のここまでを読んできた人なら、おそらく、既視感を覚えるだろう。プロローグで書いたとおり、読者の多くが、この小説に「どこかで見た村上春樹」を見つけている。その見つけ方は、人によって違う。好意的な評論家は、新しい主題を得たと言い、厳しい評論家は、肝心なところから逃げていると言う。ただ、どの評も、文体が優れていることだけは、あまり疑っていない。</w:t>
+      </w:r>
+    </w:p>
+    <w:p>
+      <w:pPr>
+        <w:pStyle w:val="BodyText"/>
+      </w:pPr>
+      <w:r>
+        <w:t xml:space="preserve">第一幕で「翻訳のようだ」と言われた文章が、四十七年後に、賛否のどちらの陣営からも、まず認められる部分になっている。本書が『夏帆』について言えるのは、いまのところ、そこまでだ。作品の評価は、まだ決まっていない。決まっていない作品を、ここで決めてしまうことはしない。</w:t>
+      </w:r>
+    </w:p>
+    <w:bookmarkEnd w:id="116"/>
+    <w:bookmarkStart w:id="117" w:name="終章-外にいつづける人"/>
+    <w:p>
+      <w:pPr>
+        <w:pStyle w:val="Heading2"/>
+      </w:pPr>
+      <w:r>
+        <w:t xml:space="preserve">終章　外にいつづける人</w:t>
+      </w:r>
+    </w:p>
+    <w:p>
+      <w:pPr>
+        <w:pStyle w:val="FirstParagraph"/>
+      </w:pPr>
+      <w:r>
+        <w:t xml:space="preserve">【終章の最後の数段落は、ノーベル賞の結果を受けて書く。以下は、結果に左右されない部分。】</w:t>
+      </w:r>
+    </w:p>
+    <w:p>
+      <w:pPr>
+        <w:pStyle w:val="BodyText"/>
+      </w:pPr>
+      <w:r>
+        <w:t xml:space="preserve">この三幕の終わりに、最初の問いへ戻る。英語圏の読者が「村上春樹」として知っている、平らで、かすかに外国風の声は、翻訳者が作ったのか。それとも、彼自身が作ったのか。</w:t>
+      </w:r>
+    </w:p>
+    <w:p>
+      <w:pPr>
+        <w:pStyle w:val="BodyText"/>
+      </w:pPr>
+      <w:r>
+        <w:t xml:space="preserve">答えは早いうちに出ていて、それ以後、真剣に覆されてはいない。彼自身が作った。デビュー作を、一度英語で書いて日本語に戻すことで。ほとんど知らない言語を通って、より平らな日本語を見つけることで。(第1章)</w:t>
+      </w:r>
+    </w:p>
+    <w:p>
+      <w:pPr>
+        <w:pStyle w:val="BodyText"/>
+      </w:pPr>
+      <w:r>
+        <w:t xml:space="preserve">そのあとこの本が追ってきたことは、すべて、その最初の技術が何になったかの記録だ。『世界の終り』の分裂した「私」と「僕」。『ノルウェイの森』と『多崎つくる』の、意図的な写実への出発。『ねじまき鳥クロニクル』と『騎士団長殺し』の歴史の重み。予定された国民的な出来事になった『1Q84』。三十一歳で最初に思い描いた壁の街への、三度目の挑戦。属しきれなさから作られた作家が、国内で、どこかで、まだ完全には属していない人として読まれ続けたとき、その技術は何になったのか。</w:t>
+      </w:r>
+    </w:p>
+    <w:p>
+      <w:pPr>
+        <w:pStyle w:val="BodyText"/>
+      </w:pPr>
+      <w:r>
+        <w:t xml:space="preserve">属しきれなさは、一九七九年に制度的な疑いを呼んだ、文体上の偶然にとどまらなかった。それがエンジンだった。外国の小説を読みすぎると疑われた作家が、国内の尊敬される小説家が十年かけて調べ、暗すぎて手が出せないとあきらめた歴史の素材で、最後には成功できた。自分の国が、いまも聞きたがらない歴史上の事実を、そのまま口にして、反発を、全員の承認を必要としない人生の、もう一つの項目として受け止められた。自分のいちばん個人的に痛い評決、最初に発表した作品への評決を見て、それが話の終わりではない、と決めることもできた。</w:t>
+      </w:r>
+    </w:p>
+    <w:p>
+      <w:pPr>
+        <w:pStyle w:val="BodyText"/>
+      </w:pPr>
+      <w:r>
+        <w:t xml:space="preserve">安全の中にすっかり吸収された作家の姿ではない。そこまで安全な作家は、国内の新聞で名指しで非難される一節を書かない。七十代を、自分のいちばん古い、いちばん自分を傷つけた評決を、そのままにせず書き直すことに使ったりもしない。この本が追った四十七年のあいだに、外にいる、という状態の形は、すっかり変わった。外国風すぎると言われたデビューの新人から、歴史への誠実さが、別の種類の国内の敵意の的になった作家へ。そして七十代になっても、自分のいちばん古いやり残しに、まだ満足しきれず、それを人前で直しにいく人へ。どの形の下でも変わらなかったのは、自分の国の文壇の中に、居心地よく収まりきることが一度もなかった作家だ。その文壇の意見が、彼をもう少しも遅らせられなくなってからでさえ。</w:t>
+      </w:r>
+    </w:p>
+    <w:p>
+      <w:pPr>
+        <w:pStyle w:val="BodyText"/>
+      </w:pPr>
+      <w:r>
+        <w:t xml:space="preserve">【終章の結び: ノーベル賞の結果を受けて、十月八日の発表後に書く。】</w:t>
       </w:r>
     </w:p>
     <w:p>
@@ -2037,914 +3106,18 @@
         </w:pict>
       </w:r>
     </w:p>
-    <w:bookmarkEnd w:id="83"/>
-    <w:bookmarkEnd w:id="84"/>
-    <w:bookmarkStart w:id="117" w:name="第三幕-未完の声二〇一三"/>
+    <w:bookmarkEnd w:id="117"/>
+    <w:bookmarkEnd w:id="118"/>
+    <w:bookmarkStart w:id="129" w:name="巻末資料"/>
     <w:p>
       <w:pPr>
         <w:pStyle w:val="Heading1"/>
       </w:pPr>
       <w:r>
-        <w:t xml:space="preserve">第三幕　未完の声(二〇一三〜)</w:t>
-      </w:r>
-    </w:p>
-    <w:p>
-      <w:pPr>
-        <w:pStyle w:val="FirstParagraph"/>
-      </w:pPr>
-      <w:r>
-        <w:t xml:space="preserve">七十代に入った作家は、もう何も証明しなくていいはずだった。ところが村上春樹は、リアリズムに戻り、歴史に触れ、三十年以上前の失敗作をもう一度書き直し、初めて女性を主人公に据えた。そのあいだに、世界での読まれ方も変わった。この幕では、二〇一三年の『色彩を持たない多崎つくると、彼の巡礼の年』から、結果の出る二〇二六年十月までをたどる。</w:t>
-      </w:r>
-    </w:p>
-    <w:bookmarkStart w:id="89" w:name="第14章-色彩を持たない多崎つくると彼の巡礼の年"/>
-    <w:p>
-      <w:pPr>
-        <w:pStyle w:val="Heading2"/>
-      </w:pPr>
-      <w:r>
-        <w:t xml:space="preserve">第14章　『色彩を持たない多崎つくると、彼の巡礼の年』</w:t>
-      </w:r>
-    </w:p>
-    <w:p>
-      <w:pPr>
-        <w:pStyle w:val="FirstParagraph"/>
-      </w:pPr>
-      <w:r>
-        <w:t xml:space="preserve">『1Q84』のあとだから、次はもっと遠くへ行くだろう、と読者は思った。二つの月、カルト、書き換えられた童話。その先に何があるのか。</w:t>
-      </w:r>
-    </w:p>
-    <w:p>
-      <w:pPr>
-        <w:pStyle w:val="BodyText"/>
-      </w:pPr>
-      <w:r>
-        <w:t xml:space="preserve">実際には逆だった。二〇一三年四月十二日に文藝春秋から出た『色彩を持たない多崎つくると、彼の巡礼の年』は、村上の十三作目の長編で、足場の固い、驚くほど読みやすい小説だった。</w:t>
-      </w:r>
-      <w:r>
-        <w:rPr>
-          <w:rStyle w:val="FootnoteReference"/>
-        </w:rPr>
-        <w:footnoteReference w:id="85"/>
-      </w:r>
-      <w:r>
-        <w:t xml:space="preserve"> </w:t>
-      </w:r>
-      <w:r>
-        <w:t xml:space="preserve">高校時代の仲間四人から、理由も告げずに絶交された男が、何十年もたって、その理由を確かめにいく。当時の書評は、『1Q84』や『海辺のカフカ』の込み入った構造に比べて、この本がリアリズムに深く根を下ろしていることに、少し驚いている。</w:t>
-      </w:r>
-    </w:p>
-    <w:p>
-      <w:pPr>
-        <w:pStyle w:val="BodyText"/>
-      </w:pPr>
-      <w:r>
-        <w:t xml:space="preserve">この言い方には聞き覚えがある。一九八七年に『ノルウェイの森』が出たとき、批評家が使ったのと、ほとんど同じ言葉だ。どちらも比較的短く、焦点が絞られていて、過去の解けない喪失と向き合う主人公を、切り詰めた写実の文体で描く。前後を超現実的な作品にはさまれているので、よけい目立つ。</w:t>
-      </w:r>
-    </w:p>
-    <w:p>
-      <w:pPr>
-        <w:pStyle w:val="BodyText"/>
-      </w:pPr>
-      <w:r>
-        <w:t xml:space="preserve">違いも指摘されている。『ノルウェイの森』は、失い続ける物語だった。死と不在が積み重なり、語り手は最後まで立ち直りきれない。『多崎つくる』は、回復の物語として読まれてきた。傷と解けない悲しみが、一人称の清算をうながす。骨組みは同じでも、今度は修復に近いところへ向かって組まれている。</w:t>
-      </w:r>
-    </w:p>
-    <w:p>
-      <w:pPr>
-        <w:pStyle w:val="BodyText"/>
-      </w:pPr>
-      <w:r>
-        <w:t xml:space="preserve">二十五年を置いて、同じリアリズムに二度戻る。それは何を意味するのか。一九八七年の写実は、『羊をめぐる冒険』や『世界の終り』の超現実から距離をとるための、意図的な出発だった。「100パーセントの恋愛小説」という帯の言葉にも、その事情がかかわっている(第7章)。二〇一三年の同じ動きは、何かからの出発というより、手持ちの道具のひとつに見える。語り口のひとつであって、どんな作家になりたいかの表明ではない。反対の書き方も何十年かけて証明してきた作家だけが、この動きを、後退に見せずにやれる。</w:t>
-      </w:r>
-    </w:p>
-    <w:p>
-      <w:pPr>
-        <w:pStyle w:val="BodyText"/>
-      </w:pPr>
-      <w:r>
-        <w:t xml:space="preserve">小説のすべてが悲しみなのではない。前半に、大学のプールの日曜の朝が出てくる。友人の灰田と泳ぐ時間は、つくるの特徴である「空っぽ」に、痛くない形を与える。</w:t>
-      </w:r>
-    </w:p>
-    <w:p>
-      <w:pPr>
-        <w:pStyle w:val="BlockText"/>
-      </w:pPr>
-      <w:r>
-        <w:t xml:space="preserve">灰田の柔らかなキックが小さな白い泡をリズミカルに水中につくり出す光景を、つくるは無心に眺めていた。その光景は彼に常に軽い意識の麻痺状態をもたらした。</w:t>
-      </w:r>
-      <w:r>
-        <w:rPr>
-          <w:rStyle w:val="FootnoteReference"/>
-        </w:rPr>
-        <w:footnoteReference w:id="86"/>
-      </w:r>
-    </w:p>
-    <w:p>
-      <w:pPr>
-        <w:pStyle w:val="FirstParagraph"/>
-      </w:pPr>
-      <w:r>
-        <w:t xml:space="preserve">「空っぽ」は、小説がつくるの内面を言うために、何度も手を伸ばす言葉だ。ここでは、週に三十分だけ、その空っぽが傷でなく、ただのリズムになる。</w:t>
-      </w:r>
-    </w:p>
-    <w:p>
-      <w:pPr>
-        <w:pStyle w:val="BodyText"/>
-      </w:pPr>
-      <w:r>
-        <w:t xml:space="preserve">終わりの数ページでは、回復であって解決ではない、という違いが、構造だけでなく場面そのものになる。つくるは恋人の沙羅に、自分と、彼女が会っているもう一人の男と、どちらを選ぶのか、答えを聞きたいと言った。彼女は、考えるために三日間ほしいと言う。待つあいだに電話が鳴る。つくるは二度、出ずに鳴りやむのを待つ。</w:t>
-      </w:r>
-    </w:p>
-    <w:p>
-      <w:pPr>
-        <w:pStyle w:val="BlockText"/>
-      </w:pPr>
-      <w:r>
-        <w:t xml:space="preserve">コールが十二回続くあいだ、つくるは迷っていた。</w:t>
-      </w:r>
-      <w:r>
-        <w:rPr>
-          <w:rStyle w:val="FootnoteReference"/>
-        </w:rPr>
-        <w:footnoteReference w:id="87"/>
-      </w:r>
-    </w:p>
-    <w:p>
-      <w:pPr>
-        <w:pStyle w:val="FirstParagraph"/>
-      </w:pPr>
-      <w:r>
-        <w:t xml:space="preserve">迷いは解けない。彼は、最初の電話の前にかけたレコードに戻る。ラザール・ベルマンが弾くリストの『巡礼の年』だ。小説の題の「巡礼」は、この曲から借りている。二度目の電話は、数えもしないまま鳴らしておく。</w:t>
-      </w:r>
-    </w:p>
-    <w:p>
-      <w:pPr>
-        <w:pStyle w:val="BodyText"/>
-      </w:pPr>
-      <w:r>
-        <w:t xml:space="preserve">最後の一行は、沙羅の答えを、つくるにも読者にも渡さない。彼は答えを知らないまま眠る。最後の段落が書いているのは、眠りに落ちることだけだ。</w:t>
-      </w:r>
-    </w:p>
-    <w:p>
-      <w:pPr>
-        <w:pStyle w:val="BlockText"/>
-      </w:pPr>
-      <w:r>
-        <w:t xml:space="preserve">彼は心を静め、目を閉じて眠りについた。意識の最後尾の明かりが、遠ざかっていく最終の特急列車のように、徐々にスピードを増しながら小さくなり、あとには白樺の木立を抜ける風の音だけが残った。</w:t>
-      </w:r>
-      <w:r>
-        <w:rPr>
-          <w:rStyle w:val="FootnoteReference"/>
-        </w:rPr>
-        <w:footnoteReference w:id="88"/>
-      </w:r>
-    </w:p>
-    <w:p>
-      <w:pPr>
-        <w:pStyle w:val="FirstParagraph"/>
-      </w:pPr>
-      <w:r>
-        <w:t xml:space="preserve">沙羅の返事も、つくるの決断もない。眠る男と、木立を抜ける風だけがある。『ノルウェイの森』が、自分がどこにいるのかまだわからない語り手で終わるなら、『多崎つくる』は、答えを必要としなくなって、ようやく休める語り手で終わる。傷を、解決する前に、その上で眠れるようになること。ここまで見てきた回復の形は、それである。</w:t>
-      </w:r>
-    </w:p>
-    <w:bookmarkEnd w:id="89"/>
-    <w:bookmarkStart w:id="98" w:name="第15章-騎士団長殺しと南京"/>
-    <w:p>
-      <w:pPr>
-        <w:pStyle w:val="Heading2"/>
-      </w:pPr>
-      <w:r>
-        <w:t xml:space="preserve">第15章　『騎士団長殺し』と南京</w:t>
-      </w:r>
-    </w:p>
-    <w:p>
-      <w:pPr>
-        <w:pStyle w:val="BlockText"/>
-      </w:pPr>
-      <w:r>
-        <w:t xml:space="preserve">この章は、南京事件という実際の歴史上の虐殺を扱う。事件が起きたこと自体は、主流の歴史学者のあいだで争われていない。被害者数については、いまも学術的な議論がある。政治的にも評判の面でも敏感な話題なので、複数の出典に基づいて、慎重に書いた。</w:t>
-      </w:r>
-    </w:p>
-    <w:p>
-      <w:pPr>
-        <w:pStyle w:val="FirstParagraph"/>
-      </w:pPr>
-      <w:r>
-        <w:t xml:space="preserve">『騎士団長殺し』は、二〇一七年二月二十四日に新潮社から出た。初版は二部合わせて百三十万部。</w:t>
-      </w:r>
-      <w:r>
-        <w:rPr>
-          <w:rStyle w:val="FootnoteReference"/>
-        </w:rPr>
-        <w:footnoteReference w:id="90"/>
-      </w:r>
-      <w:r>
-        <w:t xml:space="preserve"> </w:t>
-      </w:r>
-      <w:r>
-        <w:t xml:space="preserve">肖像画家と、半分だけ命を得た一枚の絵をめぐる、長くて形のいびつな長編だ。その中の一本の糸が、政治的な論争になった。</w:t>
-      </w:r>
-    </w:p>
-    <w:p>
-      <w:pPr>
-        <w:pStyle w:val="BodyText"/>
-      </w:pPr>
-      <w:r>
-        <w:t xml:space="preserve">資産家で正体のつかめない隣人の免色は、語り手に電話で、画家・雨田具彦の家族の歴史を話す。具彦の弟の継彦は、徴兵され、南京で残虐行為に加わることを強いられ、復員後、自分のしたことに耐えきれず命を絶った。免色は、歴史上の事実を、そのまま口にする。</w:t>
-      </w:r>
-    </w:p>
-    <w:p>
-      <w:pPr>
-        <w:pStyle w:val="BlockText"/>
-      </w:pPr>
-      <w:r>
-        <w:t xml:space="preserve">正確に何人が殺害されたか、細部については歴史学者のあいだにも異論がありますが、とにかくおびただしい数の市民が戦闘の巻き添えになって殺されたことは、打ち消しがたい事実です。中国人死者の数を四十万人というものもいれば、十万人というものもいます。</w:t>
-      </w:r>
-      <w:r>
-        <w:rPr>
-          <w:rStyle w:val="FootnoteReference"/>
-        </w:rPr>
-        <w:footnoteReference w:id="91"/>
-      </w:r>
-    </w:p>
-    <w:p>
-      <w:pPr>
-        <w:pStyle w:val="FirstParagraph"/>
-      </w:pPr>
-      <w:r>
-        <w:t xml:space="preserve">数字の食い違いを並べたうえで、殺害そのものは、どちらの数字をとっても動かない事実として押さえている。事件があったこと自体は、日本でも国際的にも、主流の歴史学者のあいだで争われていない。いま学問の上で争われているのは死者の数だ。方法や、どの殺害をどの期間まで数えるかによって、推計は変わる。小説が挙げる二つの数字は、どちらもその実際の幅の中にある。正確な数の不確かさの後ろに、読者が隠れることを許さない。二〇一七年の日本で、これが中立的な歴史の記述として読まれるはずはなかった。</w:t>
-      </w:r>
-    </w:p>
-    <w:p>
-      <w:pPr>
-        <w:pStyle w:val="BodyText"/>
-      </w:pPr>
-      <w:r>
-        <w:t xml:space="preserve">反応は、予想どおりの線で割れた。中国の南京大屠殺遇難同胞紀念館は、公式のウェイボーで歓迎の意を示した。村上の「四十万人でも十万人でも」という言い方を引き、戦後の南京戦犯軍事法廷が三十万人以上の犠牲者を認定したことにも触れた。</w:t>
-      </w:r>
-      <w:r>
-        <w:rPr>
-          <w:rStyle w:val="FootnoteReference"/>
-        </w:rPr>
-        <w:footnoteReference w:id="92"/>
-      </w:r>
-      <w:r>
-        <w:t xml:space="preserve"> </w:t>
-      </w:r>
-      <w:r>
-        <w:t xml:space="preserve">中国のネットには、事件に触れたことだけで村上を良心の作家と称える声もあった。</w:t>
-      </w:r>
-    </w:p>
-    <w:p>
-      <w:pPr>
-        <w:pStyle w:val="BodyText"/>
-      </w:pPr>
-      <w:r>
-        <w:t xml:space="preserve">日本では、作家の百田尚樹と、在特会の元会長・桜井誠が、この箇所を直接批判した。産経新聞も批判的に取り上げた。</w:t>
-      </w:r>
-      <w:r>
-        <w:rPr>
-          <w:rStyle w:val="FootnoteReference"/>
-        </w:rPr>
-        <w:footnoteReference w:id="93"/>
-      </w:r>
-      <w:r>
-        <w:t xml:space="preserve"> </w:t>
-      </w:r>
-      <w:r>
-        <w:t xml:space="preserve">百田は、中国の好意を、ひいてはノーベル賞への勢いを得るために入れたのではないか、とまで言った。桜井は、軍には捕虜を管理する力がなかった、という一節の中身を、支持者にそのまま引いてみせた。反発の相手は、本が政治的になったという漠然とした印象ではなく、具体的な主張だったのである。ウェブメディアの「リテラ」などは、二人が小説のもっと大きな流れを見逃していると反論した。この小説は、単発の挑発ではなく、歴史修正主義に対する持続的な反論になっている、と。当時の報道によれば、日本の主要なニュースポータルにも、この箇所への直接の批判がかなりの量で載った。沈黙ではなかった。</w:t>
-      </w:r>
-    </w:p>
-    <w:p>
-      <w:pPr>
-        <w:pStyle w:val="BodyText"/>
-      </w:pPr>
-      <w:r>
-        <w:t xml:space="preserve">この一節の背後に、もう少し大きな構図を見る批評家がいる。佐々木敦だ。『騎士団長殺し』は肖像画家の小説であり、同時に、構造として、それ自体が一枚の肖像になっている。語り手が描けないと言う、ただ一つのものの肖像として。</w:t>
-      </w:r>
-      <w:r>
-        <w:rPr>
-          <w:rStyle w:val="FootnoteReference"/>
-        </w:rPr>
-        <w:footnoteReference w:id="94"/>
-      </w:r>
-    </w:p>
-    <w:p>
-      <w:pPr>
-        <w:pStyle w:val="BodyText"/>
-      </w:pPr>
-      <w:r>
-        <w:t xml:space="preserve">名前のない語り手は三十六歳で、妻と別れたばかりだ。年老いて施設にいる雨田具彦の、山の上の家に住み、数か月のあいだに何枚かの肖像を描く。資産家の免色。秋川まりえという少女。「白いスバル・フォレスターの男」と呼ぶ、繰り返し現れる脅威的な人物。彼がどうしても描けないのは、顔のない男だ。その男は、物語のはじめと終わりに二度来て、まさにそれを頼む。語り手の説明は、問題と同じくらい素っ気ない。</w:t>
-      </w:r>
-    </w:p>
-    <w:p>
-      <w:pPr>
-        <w:pStyle w:val="BlockText"/>
-      </w:pPr>
-      <w:r>
-        <w:t xml:space="preserve">なにしろそこにあるのはただの無なのだ。何もないものをいったいどのように造形すればいいのだろう？</w:t>
-      </w:r>
-      <w:r>
-        <w:rPr>
-          <w:rStyle w:val="FootnoteReference"/>
-        </w:rPr>
-        <w:footnoteReference w:id="95"/>
-      </w:r>
-    </w:p>
-    <w:p>
-      <w:pPr>
-        <w:pStyle w:val="FirstParagraph"/>
-      </w:pPr>
-      <w:r>
-        <w:t xml:space="preserve">佐々木の読みでは、この描けない「無」が、語り手が最初のページで書いていると言う本の、本当の主題だ。今度は絵ではなく、六百ページの小説そのものが、自分の媒体では抱えきれなかった空白の、代わりの肖像になっている。</w:t>
-      </w:r>
-    </w:p>
-    <w:p>
-      <w:pPr>
-        <w:pStyle w:val="BodyText"/>
-      </w:pPr>
-      <w:r>
-        <w:t xml:space="preserve">佐々木は、題名の由来になった隠された絵の背後に、もう一層の歴史を組み立てる。一九三八年のアンシュルス前のウィーンにいた若い具彦は、抵抗運動の計画に巻きこまれ、実行される前に父親に連れ戻された。残った仲間は逮捕され、おそらく殺された。そのあいだに弟の継彦は徴兵され、中国へ送られ、佐々木の説明では、一九三七年十二月の南京陥落の場にいた。佐々木自身が、これは推論だと断っている。「らしい」という言葉が、ここでは大きな仕事をしていて、「最後まで、すべてが憶測の領域にとどまるから」だ、と。</w:t>
-      </w:r>
-      <w:r>
-        <w:rPr>
-          <w:rStyle w:val="FootnoteReference"/>
-        </w:rPr>
-        <w:footnoteReference w:id="96"/>
-      </w:r>
-    </w:p>
-    <w:p>
-      <w:pPr>
-        <w:pStyle w:val="BodyText"/>
-      </w:pPr>
-      <w:r>
-        <w:t xml:space="preserve">この小説の背後には、もう一つ、時計がある。物語は長いあいだ、いつのことかを言わない。それが変わるのは最終章だ。語り手が、何年も後になって、三月十一日に東北の海岸を襲った「大きな地震」の報道を、テレビで見たことに触れる。かつて通りかかった小さな海辺の町のひとつも、それで壊れた。二か月後には、物語の中心にある山の家が、火事で焼ける。</w:t>
-      </w:r>
-      <w:r>
-        <w:rPr>
-          <w:rStyle w:val="FootnoteReference"/>
-        </w:rPr>
-        <w:footnoteReference w:id="97"/>
-      </w:r>
-      <w:r>
-        <w:t xml:space="preserve"> </w:t>
-      </w:r>
-      <w:r>
-        <w:t xml:space="preserve">最終章のある細部、秋川まりえの後の年齢から逆算して、佐々木は、中心の出来事が二〇〇七年五月から二〇〇八年の初めにかけて起きたと割り出す。語り手が六百ページかけて語る出来事は、最後の数ページにだけ出てくる災害の、三、四年前だった。</w:t>
-      </w:r>
-    </w:p>
-    <w:p>
-      <w:pPr>
-        <w:pStyle w:val="BodyText"/>
-      </w:pPr>
-      <w:r>
-        <w:t xml:space="preserve">村上は、前にも、こういう作りの本を書いている。第10章で見た『神の子どもたちはみな踊る』の六つの短編は、阪神・淡路大震災の一月と地下鉄サリン事件の三月のあいだ、一九九五年二月を舞台にしていて、どちらの出来事も紙の上には描かない。『騎士団長殺し』は、同じ操作の長い版だ。私的で、超現実的で、比喩に満ちた危機の小説が、最後になって初めて、二〇一一年三月十一日へのカウントダウンだったとわかる。本はその災害を描かず、語り手は、あとから遠くでテレビを見るだけだ。佐々木は、地震と福島の事故を、小説の文字どおりの主題とは読まない。顔のない男を語り手が描けないように、村上の小説も、それ以上は直接近づけない出来事を前にして、「無」を描くことの不可能性についての、長く自己言及的な小説になった。そして、その最後のページを、その「無」が届いた日に、そっと置いた。佐々木はそう読む。</w:t>
-      </w:r>
-    </w:p>
-    <w:p>
-      <w:pPr>
-        <w:pStyle w:val="BodyText"/>
-      </w:pPr>
-      <w:r>
-        <w:t xml:space="preserve">これを、これまでの幕で見たものと並べてみる。一九七九年のデビューが、外国の小説の模倣だと退けられた作家。九〇年代に、『ねじまき鳥クロニクル』のノモンハンの場面で、超現実の文体が本物の歴史の重みに耐えると示した作家。『神の子どもたちはみな踊る』で、災害に斜めから近づく方法を編み出した作家。その人が、国内の読者のかなりの部分が、いまも口に出されるのを聞きたがらない歴史的事実を、一つの家族の悲劇の核に置いた。そして、ある批評的な読みでは、小説全体の構造を使って、まだ直接には書けないでいた、もう一つの、もっと最近の災厄に近づいた。それを自分の名前で書いて出すことは、あの時期、あの国では、小さなことではなかった。七十近い作家が、文壇の初期の厳しい評決から何十年も離れたあとで、それでもやった。しかも、二つ以上の層で、同時に。</w:t>
-      </w:r>
-    </w:p>
-    <w:bookmarkEnd w:id="98"/>
-    <w:bookmarkStart w:id="101" w:name="第16章-ドライブマイカー"/>
-    <w:p>
-      <w:pPr>
-        <w:pStyle w:val="Heading2"/>
-      </w:pPr>
-      <w:r>
-        <w:t xml:space="preserve">第16章　『ドライブ・マイ・カー』</w:t>
-      </w:r>
-    </w:p>
-    <w:p>
-      <w:pPr>
-        <w:pStyle w:val="FirstParagraph"/>
-      </w:pPr>
-      <w:r>
-        <w:t xml:space="preserve">今世紀、村上春樹の国際的な知名度をいちばん押し上げたのは、長編ではなかった。二〇一四年の短編集『女のいない男たち』の中の短編をもとにした、三時間の映画だった。</w:t>
-      </w:r>
-    </w:p>
-    <w:p>
-      <w:pPr>
-        <w:pStyle w:val="BodyText"/>
-      </w:pPr>
-      <w:r>
-        <w:t xml:space="preserve">濱口竜介監督、大江崇允との共同脚本の『ドライブ・マイ・カー』は、二〇二一年に公開され、第九十四回アカデミー賞で、日本映画がそれまでやったことのない展開をした。作品賞と国際長編映画賞にノミネートされた。日本の作品が作品賞の候補になるのは初めてだった。監督賞と脚色賞にも候補が入った。受賞は国際長編映画賞で、競争の末にこの賞をとった日本映画としては、二〇〇九年の『おくりびと』に次ぐ二本目になる。数か月前のカンヌ国際映画祭では脚本賞をとった。日本人の脚本家がこの賞をとるのは、初めてだった。</w:t>
-      </w:r>
-      <w:r>
-        <w:rPr>
-          <w:rStyle w:val="FootnoteReference"/>
-        </w:rPr>
-        <w:footnoteReference w:id="99"/>
-      </w:r>
-    </w:p>
-    <w:p>
-      <w:pPr>
-        <w:pStyle w:val="BodyText"/>
-      </w:pPr>
-      <w:r>
-        <w:t xml:space="preserve">濱口が「ドライブ・マイ・カー」を初めて読んだのは、三十代の半ばだった。『文藝春秋』に載ったときのことで、人にすすめられたという。</w:t>
-      </w:r>
-      <w:r>
-        <w:rPr>
-          <w:rStyle w:val="FootnoteReference"/>
-        </w:rPr>
-        <w:footnoteReference w:id="100"/>
-      </w:r>
-      <w:r>
-        <w:t xml:space="preserve"> </w:t>
-      </w:r>
-      <w:r>
-        <w:t xml:space="preserve">驚いたのは、短編が自分の仕事にあまりに近かったことだ。演技についての話で、ほとんどが車の中の会話でできている。当時の濱口は、村上を映画にするのは現実的ではないと感じていた。ただ、これなら近づけるかもしれない、とは思った。</w:t>
-      </w:r>
-    </w:p>
-    <w:p>
-      <w:pPr>
-        <w:pStyle w:val="BodyText"/>
-      </w:pPr>
-      <w:r>
-        <w:t xml:space="preserve">なぜ三つの短編なのか。書かれたままに映画にすると、長編映画の観客に、はっきりした決着を渡せない。それでは物足りないだろう、と濱口は言う。答えは、同じ短編集の中にあった。『女のいない男たち』を読みなおして、「木野」が、すでにそれを持っていると気づいたのだ。「木野」の舞台のバーは、「ドライブ・マイ・カー」の中にも出てくる。濱口は、村上自身が、この短編集を書くあいだに何かが変わった場所として「木野」を読み、主人公の家福が最後にたどり着く場所にした。村上に許可を求める手紙を書いたころには、映画の構成は、画面に出たものにすでに近かった、と彼は言う。</w:t>
-      </w:r>
-    </w:p>
-    <w:p>
-      <w:pPr>
-        <w:pStyle w:val="BodyText"/>
-      </w:pPr>
-      <w:r>
-        <w:t xml:space="preserve">「シェエラザード」は、別の仕事をした。家福の妻に厚みを与え、彼女の遺したもの、つまり性と結びついた物語を、若い俳優の高槻に持たせた。</w:t>
-      </w:r>
-    </w:p>
-    <w:p>
-      <w:pPr>
-        <w:pStyle w:val="BodyText"/>
-      </w:pPr>
-      <w:r>
-        <w:t xml:space="preserve">チェーホフは、あとから足したものではない。村上の短編の中で、家福は『ワーニャ伯父さん』のワーニャを演じる俳優で、小説はすでに、家福をワーニャに、若い運転手のみさきをワーニャの姪のソーニャに結びつけている。濱口が挙げるのは、器量が悪く生まれたというソーニャの嘆きで、みさきはそれを自分のものとして受け取る。もう一つは、ワーニャが、六十で死ぬとして、自分に残された年月を数える計算で、家福はそれを自分のものとして聞く。映画は、小説が植えていたものを広げただけだ。</w:t>
-      </w:r>
-    </w:p>
-    <w:p>
-      <w:pPr>
-        <w:pStyle w:val="BodyText"/>
-      </w:pPr>
-      <w:r>
-        <w:t xml:space="preserve">みさきが大きくなったのには、別の理由がある。濱口は彼女を、村上の描いた人物のなかでもとくに魅力的な一人と呼ぶ。謎をそのまま残したくて、どの俳優にもするように、その役の来歴を書いた。来歴は膨らみ、改稿の中で、映画の本編に流れこんだ。影響として彼が挙げる一冊は、この本の第二幕で出てきた『村上春樹、河合隼雄に会いにいく』だ。村上と心理学者の河合隼雄が、物語は現実から、きれいには切り離せない、無意識の抑圧されたものが現れる形だ、と話している対談である。</w:t>
-      </w:r>
-    </w:p>
-    <w:p>
-      <w:pPr>
-        <w:pStyle w:val="BodyText"/>
-      </w:pPr>
-      <w:r>
-        <w:t xml:space="preserve">小さな変更にも理由がある。家福の黄色いサーブ900のコンバーチブルは、赤いサーブ900ターボのサンルーフ付きになった。風景に緑が多く、赤が映えるからだ。小説では、家福は助手席にすわる。映画では、たいてい後部座席にいる。後ろの席の客は運転手の視線から外れてくつろげるし、近い関係を思わせる助手席は、あとのために取っておける。筋の細部も、一つ、はっきり変わった。小説では、ある重要な人物の母親は運転中の事故で死ぬ。映画では、土砂崩れで死ぬ。</w:t>
-      </w:r>
-    </w:p>
-    <w:p>
-      <w:pPr>
-        <w:pStyle w:val="BodyText"/>
-      </w:pPr>
-      <w:r>
-        <w:t xml:space="preserve">ほとんど変えなかった一節がある。高槻が家福に、本当に誰かを見たいなら、まっすぐ深く自分自身の中を見るしかない、と話す長い台詞だ。映画は、ほぼ一字一句、小説に従った。濱口が最初に読んだとき、いちばんはっきり残った部分だった。小説の中で家福は、その言葉を、高槻の深い特別な場所から立ちのぼるものとして聞く。濱口は、村上自身が、そういう場所に潜って書いたのだと考えている。言葉には曇りのない響きがあり、そういう台詞は、言わなければならない俳優に働きかける、と彼は言い、高槻を演じた岡田将生に功績を渡す。映画は、この台詞をバーから車の中へ移した。結末の都合で、みさきにも聞こえるようにするため、そして題名と結びつけるためだ。</w:t>
-      </w:r>
-    </w:p>
-    <w:p>
-      <w:pPr>
-        <w:pStyle w:val="BodyText"/>
-      </w:pPr>
-      <w:r>
-        <w:t xml:space="preserve">村上の何が映画にしにくいのか。そう聞かれた濱口は、この世のものではない部分を挙げる。村上の文章には、描写のリアリズムがあって、存在しないものを、きっとあるのだと信じさせる。映画に幻想を足しても、それがすべて私たちの心の中で起きている、という確信の強さには届かない、と彼は言う。</w:t>
-      </w:r>
-    </w:p>
-    <w:p>
-      <w:pPr>
-        <w:pStyle w:val="BodyText"/>
-      </w:pPr>
-      <w:r>
-        <w:t xml:space="preserve">だから、オスカーをとった映画は、村上のリアリズムの側面を映した版で、その深みの一部は、ほかの二つの短編から借りて戻してある。同じ壁の街へ戻り続ける作家を扱うこの幕で、この映画は、注意深い読み手が村上の世界から何を持ち出せて、何を置いていくことにしたのかを、見せてくれる。</w:t>
-      </w:r>
-    </w:p>
-    <w:bookmarkEnd w:id="101"/>
-    <w:bookmarkStart w:id="106" w:name="第17章-街とその不確かな壁"/>
-    <w:p>
-      <w:pPr>
-        <w:pStyle w:val="Heading2"/>
-      </w:pPr>
-      <w:r>
-        <w:t xml:space="preserve">第17章　『街とその不確かな壁』</w:t>
-      </w:r>
-    </w:p>
-    <w:p>
-      <w:pPr>
-        <w:pStyle w:val="FirstParagraph"/>
-      </w:pPr>
-      <w:r>
-        <w:t xml:space="preserve">二〇二三年四月十三日に新潮社から出た『街とその不確かな壁』は、原稿用紙で約千二百枚の長編で、その由来は、本そのものより長い。</w:t>
-      </w:r>
-      <w:r>
-        <w:rPr>
-          <w:rStyle w:val="FootnoteReference"/>
-        </w:rPr>
-        <w:footnoteReference w:id="102"/>
-      </w:r>
-    </w:p>
-    <w:p>
-      <w:pPr>
-        <w:pStyle w:val="BodyText"/>
-      </w:pPr>
-      <w:r>
-        <w:t xml:space="preserve">始まりは一九八〇年だ。村上は「街と、その不確かな壁」という中編を発表した。のちの題と違って、読点がある。この作品への村上自身の評価は、優しかったことがない。満足のいかない、中途半端な形で発表した、と語り、のちのインタビューでは、あれは「失敗作」だった、あの形で書くべきではなかった、とまで言っている。自分の発表した仕事への評価としては、異例に厳しい。謙遜としてではなく、真剣に受け取るべき言葉だ。</w:t>
-      </w:r>
-    </w:p>
-    <w:p>
-      <w:pPr>
-        <w:pStyle w:val="BodyText"/>
-      </w:pPr>
-      <w:r>
-        <w:t xml:space="preserve">そのあとのことは、第6章を読んだ人ならもう知っている。一九八五年、村上は一九八〇年の中編の出来に満足せず、その核になる素材を作り直して、『世界の終りとハードボイルド・ワンダーランド』にした。第6章で、私と僕の分裂した語りを見た、あの小説だ。金色の獣が守る、壁に囲まれた季節のない街は、分裂した語り手の「僕」の半分に属している。それでも、この二度目の書き直しで、問題は片づかなかった。村上は、急ぎすぎた、あと二年は素材を寝かせておけばよかった、と言っている。一九八〇年の中編を失敗と呼んだ不満は、それを乗り越えるために書いた一冊の長編のあとも残り、まだ解けなかった。</w:t>
-      </w:r>
-    </w:p>
-    <w:p>
-      <w:pPr>
-        <w:pStyle w:val="BodyText"/>
-      </w:pPr>
-      <w:r>
-        <w:t xml:space="preserve">二〇二三年の小説の「街」を、第6章で引いた『世界の終り』の街と並べると、連続性は、言い回しにいたるまで、すぐにわかる。金色の獣は、まだそこにいて、同じ季節の周期で金色になる。</w:t>
-      </w:r>
-    </w:p>
-    <w:p>
-      <w:pPr>
-        <w:pStyle w:val="BlockText"/>
-      </w:pPr>
-      <w:r>
-        <w:t xml:space="preserve">秋、獣たちの体は、来たるべき寒い季節に備えて輝かしい金色の毛に覆われる。額に生えた単角は鋭く白い。</w:t>
-      </w:r>
-      <w:r>
-        <w:rPr>
-          <w:rStyle w:val="FootnoteReference"/>
-        </w:rPr>
-        <w:footnoteReference w:id="103"/>
-      </w:r>
-    </w:p>
-    <w:p>
-      <w:pPr>
-        <w:pStyle w:val="FirstParagraph"/>
-      </w:pPr>
-      <w:r>
-        <w:t xml:space="preserve">三十八年前に『世界の終り』で、「金色として世界に生じ、金色として世界に存在した」と描かれた獣と、同じ像だ。同じ動物が、三十八年を置いて、同じように描かれている。</w:t>
-      </w:r>
-    </w:p>
-    <w:p>
-      <w:pPr>
-        <w:pStyle w:val="BodyText"/>
-      </w:pPr>
-      <w:r>
-        <w:t xml:space="preserve">違うのは、その像のまわりに、二〇二三年の版がどれだけのものを築いたかだ。門には専従の門番がいる。体の大きな几帳面な男で、毎朝、獣の毛を整えるのと同じ大きな鋭い剃刀で、自分の頭と顔を剃る。朝と夕には、門番小屋のそばの小さな塔に上って、角笛を吹く。語り手が、男のいかつい外見にしては、と驚くほど、柔らかくよく響く音だ。</w:t>
-      </w:r>
-      <w:r>
-        <w:rPr>
-          <w:rStyle w:val="FootnoteReference"/>
-        </w:rPr>
-        <w:footnoteReference w:id="104"/>
-      </w:r>
-      <w:r>
-        <w:t xml:space="preserve"> </w:t>
-      </w:r>
-      <w:r>
-        <w:t xml:space="preserve">壁の外の獣の世界には、はるかに暗い季節もある。毎年春の一週間、獣たちは、角を互いの喉や腹に向けて、雌をめぐって戦う。食べることも忘れ、何頭も死ぬまで戦う。その一週間、門番は、暴力が街の通りに届かないように、門を完全に閉じる。</w:t>
-      </w:r>
-      <w:r>
-        <w:rPr>
-          <w:rStyle w:val="FootnoteReference"/>
-        </w:rPr>
-        <w:footnoteReference w:id="105"/>
-      </w:r>
-      <w:r>
-        <w:t xml:space="preserve"> </w:t>
-      </w:r>
-      <w:r>
-        <w:t xml:space="preserve">第6章で見た『世界の終り』の「金色の獣」の章には、この交尾期の凶暴さはまったくなかった。二〇二三年の本は、核になる像をそのまま残し、前の二回よりも四百ページ多く使って、壁の街がその下で動いている仕組みと儀式と暴力を築いた。</w:t>
-      </w:r>
-    </w:p>
-    <w:p>
-      <w:pPr>
-        <w:pStyle w:val="BodyText"/>
-      </w:pPr>
-      <w:r>
-        <w:t xml:space="preserve">三度目に同じ素材に取り組んだこの小説は、最初の試みから四十年以上たっている。その粘りは、何かを語っている。キャリアのこれほど遅い時期に、新しい思いつきを使い果たした作家が、古い素材に戻ってきたのではない。この本の残りの部分は、すべて逆のことを言っている。七十代に入っても、本物の歴史上の危険と、本物の形式上の実験に挑む作家だ。もっと文字どおりの意味で、やり残した仕事に近い。三十一歳で最初に思い描いた壁の街を、三十六歳で、初期のもっとも評価された小説の中に作り直した。それでもうまく書けたと思えず、七十四歳で、三度目に戻って、きちんと仕上げた。作家人生の土台になった像を、何十年を置いて、三回、公然と書き直す機会を与えられる作家は、少ない。最初の二回を、三回目に至る途中の失敗と呼ぶ度胸のある作家は、もっと少ない。</w:t>
-      </w:r>
-    </w:p>
-    <w:bookmarkEnd w:id="106"/>
-    <w:bookmarkStart w:id="110" w:name="第18章-ノーベル賞という賭け"/>
-    <w:p>
-      <w:pPr>
-        <w:pStyle w:val="Heading2"/>
-      </w:pPr>
-      <w:r>
-        <w:t xml:space="preserve">第18章　ノーベル賞という賭け</w:t>
-      </w:r>
-    </w:p>
-    <w:p>
-      <w:pPr>
-        <w:pStyle w:val="FirstParagraph"/>
-      </w:pPr>
-      <w:r>
-        <w:t xml:space="preserve">【この章の後半(結果を受けた部分)は、二〇二六年十月八日の発表後に書く。結果ごとの二つの版を</w:t>
-      </w:r>
-      <w:r>
-        <w:t xml:space="preserve"> </w:t>
-      </w:r>
-      <w:r>
-        <w:rPr>
-          <w:rStyle w:val="VerbatimChar"/>
-        </w:rPr>
-        <w:t xml:space="preserve">nobel-branches/</w:t>
-      </w:r>
-      <w:r>
-        <w:t xml:space="preserve"> </w:t>
-      </w:r>
-      <w:r>
-        <w:t xml:space="preserve">に用意する。以下は、結果に左右されない前半。】</w:t>
-      </w:r>
-    </w:p>
-    <w:p>
-      <w:pPr>
-        <w:pStyle w:val="BodyText"/>
-      </w:pPr>
-      <w:r>
-        <w:t xml:space="preserve">毎年十月になると、日本のメディアは同じ記事を出す。村上春樹はノーベル文学賞の有力候補で、発表が近い。今年こそ、かもしれない。そして毎年、スウェーデン・アカデミーは別の名前を挙げ、翌秋まで話は巻き戻る。</w:t>
-      </w:r>
-    </w:p>
-    <w:p>
-      <w:pPr>
-        <w:pStyle w:val="BodyText"/>
-      </w:pPr>
-      <w:r>
-        <w:t xml:space="preserve">二〇一七年の発表の夜、約二百人のファンが、東京・千駄ヶ谷の鳩森八幡神社に集まった。村上がかつてジャズ喫茶を営んでいた場所の近くだ。報道陣に囲まれ、ライブ配信で発表を見るために。みんなクラッカーを持ってきていた。アカデミーが挙げた名前は、カズオ・イシグロだった。毎日新聞によれば、驚きの声を上げた人もいれば、黙った人もいた。それから、みんなは拍手をして、イシグロのためにクラッカーを鳴らした。</w:t>
-      </w:r>
-      <w:r>
-        <w:rPr>
-          <w:rStyle w:val="FootnoteReference"/>
-        </w:rPr>
-        <w:footnoteReference w:id="107"/>
-      </w:r>
-    </w:p>
-    <w:p>
-      <w:pPr>
-        <w:pStyle w:val="BodyText"/>
-      </w:pPr>
-      <w:r>
-        <w:t xml:space="preserve">この種の報道が素通りする事実がある。ノーベル文学賞は、候補者の名簿を公表しない。候補者の記録は、賞の規則で五十年間封印される。</w:t>
-      </w:r>
-      <w:r>
-        <w:rPr>
-          <w:rStyle w:val="FootnoteReference"/>
-        </w:rPr>
-        <w:footnoteReference w:id="108"/>
-      </w:r>
-      <w:r>
-        <w:t xml:space="preserve"> </w:t>
-      </w:r>
-      <w:r>
-        <w:t xml:space="preserve">だから、ある年に村上が最終候補だったと、公式に確認できる名簿は存在しない。候補者が存命のうちは、公表されないのだ。毎年の見出しを動かしているのは、それよりずっと権威の低いものだ。イギリスのブックメーカーが、この賞について出している賭けの相場である。競馬や選挙に出すのと同じ種類の、推測による賭け率で、村上の名前は十年以上、その表の上位にい続けた。倍率は、ブックメーカーと年によって大きく揺れ、短いときは三倍、長いときは十六倍まで動いた。</w:t>
-      </w:r>
-      <w:r>
-        <w:rPr>
-          <w:rStyle w:val="FootnoteReference"/>
-        </w:rPr>
-        <w:footnoteReference w:id="109"/>
-      </w:r>
-      <w:r>
-        <w:t xml:space="preserve"> </w:t>
-      </w:r>
-      <w:r>
-        <w:t xml:space="preserve">日本のメディアは二十年にわたって、この賭け率を、スウェーデン・アカデミーの議論の内側から来た信号であるかのように扱ってきた。実際には、賭ける素人と、その賭けに値段をつけるブックメーカーが、どの名前を知っているかを映しているだけだ。</w:t>
-      </w:r>
-    </w:p>
-    <w:p>
-      <w:pPr>
-        <w:pStyle w:val="BodyText"/>
-      </w:pPr>
-      <w:r>
-        <w:t xml:space="preserve">だからといって、なぜ取れないのか、という問いに意味がないわけではない。ブックメーカーの芝居とは別に、その問いは立てられる。賞を長く追ってきた日本の論者がときどき挙げる説明に、スウェーデン・アカデミーの会員が年月のうちに入れ替わり、それに応じて、評価される作家や作品の種類が移ってきた、というものがある。構造的で制度的な、本物の説明だ。そして、「もう少しで取れそうなのに」という話に比べて、ずっと物足りない説明でもある。いちばん正確な見方は、村上の作品が毎年あと一歩で足りない、というものではなかったことになるからだ。賭けの市場の上に「今度こそ取るか」という二十年の物語を、国内のメディアが築いてきた。その市場は、賞について何かを報告したことが、一度もなかった。</w:t>
-      </w:r>
-    </w:p>
-    <w:p>
-      <w:pPr>
-        <w:pStyle w:val="BodyText"/>
-      </w:pPr>
-      <w:r>
-        <w:t xml:space="preserve">【ノーベル賞の結果を受けた節: 受賞した場合と受賞しなかった場合の版を、発表後に書く。】</w:t>
-      </w:r>
-    </w:p>
-    <w:bookmarkEnd w:id="110"/>
-    <w:bookmarkStart w:id="113" w:name="第19章-村上研究という世界"/>
-    <w:p>
-      <w:pPr>
-        <w:pStyle w:val="Heading2"/>
-      </w:pPr>
-      <w:r>
-        <w:t xml:space="preserve">第19章　村上研究という世界</w:t>
-      </w:r>
-    </w:p>
-    <w:p>
-      <w:pPr>
-        <w:pStyle w:val="FirstParagraph"/>
-      </w:pPr>
-      <w:r>
-        <w:t xml:space="preserve">二〇二〇年代には、「村上春樹」は、批評家が折にふれて書く対象を超えて、学問の一分野になっていた。早稲田大学は、彼の母校で、国際文学館を置いている。「村上春樹ライブラリー」の通称を併記し、彼の原稿や資料を所蔵して、継続的な学術プログラムを開く施設だ。台湾の淡江大学の村上春樹研究センターが近年組織してきた「国際村上春樹シンポジウム」は、彼の作品だけを扱う定期的な学会で、二〇二五年七月に京都大学で開かれたときには、十四回目になっていた。</w:t>
-      </w:r>
-      <w:r>
-        <w:rPr>
-          <w:rStyle w:val="FootnoteReference"/>
-        </w:rPr>
-        <w:footnoteReference w:id="111"/>
-      </w:r>
-      <w:r>
-        <w:t xml:space="preserve"> </w:t>
-      </w:r>
-      <w:r>
-        <w:t xml:space="preserve">企画には、バスツアーまで含まれていた。ふつうは、すでに亡くなって、定着した正典に入るだけの時間がたった作家のものだ。別に、東アジア村上春樹研究会も、独自の学術的な活動と越境的なシンポジウムを続けている。</w:t>
-      </w:r>
-    </w:p>
-    <w:p>
-      <w:pPr>
-        <w:pStyle w:val="BodyText"/>
-      </w:pPr>
-      <w:r>
-        <w:t xml:space="preserve">この関心の地理は、二つに分かれる。学術シンポジウムの参加者は、ヨーロッパの研究者に偏っていて、日本で開かれる学会に大陸じゅうから集まる。商業的な読者は逆に、東アジア、とくに中国語圏の中国、台湾、香港、マレーシアで、いちばん強い。大学で村上を研究する人と、いちばん大勢で村上を買って読む人は、かなりの程度、別の大陸にいる別の聴衆で、同じ作品群と、別の種類の付き合い方をしている。</w:t>
-      </w:r>
-    </w:p>
-    <w:p>
-      <w:pPr>
-        <w:pStyle w:val="BodyText"/>
-      </w:pPr>
-      <w:r>
-        <w:t xml:space="preserve">商業的な読者の側を、数字で語る人がいる。中国語訳者の林少華は、自分が訳した四十四作品の発行部数が、二〇二〇年十二月までに千三百五十万部にのぼると書いた。一部を平均四人が読むという説で計算すれば、五千四百万人以上になる、と。自分を「世界最大の村上文学翻訳者」と呼び、「最大」は翻訳の質ではなく、読者の数のことだ、と断っている。</w:t>
-      </w:r>
-      <w:r>
-        <w:rPr>
-          <w:rStyle w:val="FootnoteReference"/>
-        </w:rPr>
-        <w:footnoteReference w:id="112"/>
-      </w:r>
-      <w:r>
-        <w:t xml:space="preserve"> </w:t>
-      </w:r>
-      <w:r>
-        <w:t xml:space="preserve">これは本人の見積もりで、発行部数も読者数も、独立した統計では確認していない。それでも、これだけの読者が、一人の訳者の文体を通して村上を読んできた、という事実は重い。林は、百人の訳者がいれば百様の春樹が生じる、と言い、自分の訳は文体が美しすぎるという批判を、世界のどこかで耳にしたとも書いている。「村上春樹」は、翻訳のたびに、別の声になる。この本が追ってきた声は、そのうちの一つにすぎない。</w:t>
-      </w:r>
-    </w:p>
-    <w:p>
-      <w:pPr>
-        <w:pStyle w:val="BodyText"/>
-      </w:pPr>
-      <w:r>
-        <w:t xml:space="preserve">その下に、街の水準で、三つ目の関わり方がある。文学観光だ。東京を歩くガイド付きのツアーが、彼の小説や経歴にかかわる場所をたどる。早稲田大学は、その起点に近い場所として扱われる。まだ作家になる前の若い村上が学んだところで、彼はそのあと、ピーターキャットを開き、店を閉めた明け方に、『風の歌を聴け』を書きはじめた。</w:t>
-      </w:r>
-    </w:p>
-    <w:p>
-      <w:pPr>
-        <w:pStyle w:val="BodyText"/>
-      </w:pPr>
-      <w:r>
-        <w:t xml:space="preserve">一九七九年と一九八〇年に、彼の文章が日本のどんな伝統に属するのかを、国の文壇が疑った作家は、いまや、原稿を所蔵する大学付属の図書館と、二桁の回数を重ねる国際学会と、かつて彼が住み、働いた町を、まさにそのために歩く観光客を持っている。芥川賞の選考委員が与えなかった種類の制度的な正統性は、結局、誰も予想しなかった道筋で届いた。賞そのものを通してではなく、そのまわりを通って。芥川賞の許可がなくても、最初から彼を真剣に受け取ってきた、何十年分の読者と研究者によって、築かれたものだ。</w:t>
-      </w:r>
-    </w:p>
-    <w:bookmarkEnd w:id="113"/>
-    <w:bookmarkStart w:id="115" w:name="第20章-最新作夏帆ネタバレなし"/>
-    <w:p>
-      <w:pPr>
-        <w:pStyle w:val="Heading2"/>
-      </w:pPr>
-      <w:r>
-        <w:t xml:space="preserve">第20章　最新作『夏帆』(ネタバレなし)</w:t>
-      </w:r>
-    </w:p>
-    <w:p>
-      <w:pPr>
-        <w:pStyle w:val="FirstParagraph"/>
-      </w:pPr>
-      <w:r>
-        <w:t xml:space="preserve">最新作のことは、少しだけ書く。まだ多くの人が読んでいる最中で、筋に触れるのは、この本の仕事ではないからだ。</w:t>
-      </w:r>
-    </w:p>
-    <w:p>
-      <w:pPr>
-        <w:pStyle w:val="BodyText"/>
-      </w:pPr>
-      <w:r>
-        <w:t xml:space="preserve">二〇二六年七月三日に出た『夏帆――The Tale of KAHO――』は、村上の長編で初めて、女性が単独の主人公になった。出た直後から三十万部を超えて売れた。公式の紹介文は、二十六歳の絵本作家が、初対面の男に容姿を罵られる場面から始まり、そのあと、彼女の周りで「実にさまざまな奇妙な出来事」が起こりはじめる、と告げている。</w:t>
-      </w:r>
-      <w:r>
-        <w:rPr>
-          <w:rStyle w:val="FootnoteReference"/>
-        </w:rPr>
-        <w:footnoteReference w:id="114"/>
-      </w:r>
-    </w:p>
-    <w:p>
-      <w:pPr>
-        <w:pStyle w:val="BodyText"/>
-      </w:pPr>
-      <w:r>
-        <w:t xml:space="preserve">この本のここまでを読んできた人なら、おそらく、既視感を覚えるだろう。プロローグで書いたとおり、読者の多くが、この小説に「どこかで見た村上春樹」を見つけている。その見つけ方は、人によって違う。好意的な評論家は、新しい主題を得たと言い、厳しい評論家は、肝心なところから逃げていると言う。ただ、どの評も、文体が優れていることだけは、あまり疑っていない。</w:t>
-      </w:r>
-    </w:p>
-    <w:p>
-      <w:pPr>
-        <w:pStyle w:val="BodyText"/>
-      </w:pPr>
-      <w:r>
-        <w:t xml:space="preserve">第一幕で「翻訳のようだ」と言われた文章が、四十七年後に、賛否のどちらの陣営からも、まず認められる部分になっている。本書が『夏帆』について言えるのは、いまのところ、そこまでだ。作品の評価は、まだ決まっていない。決まっていない作品を、ここで決めてしまうことはしない。</w:t>
-      </w:r>
-    </w:p>
-    <w:bookmarkEnd w:id="115"/>
-    <w:bookmarkStart w:id="116" w:name="終章-外にいつづける人"/>
-    <w:p>
-      <w:pPr>
-        <w:pStyle w:val="Heading2"/>
-      </w:pPr>
-      <w:r>
-        <w:t xml:space="preserve">終章　外にいつづける人</w:t>
-      </w:r>
-    </w:p>
-    <w:p>
-      <w:pPr>
-        <w:pStyle w:val="FirstParagraph"/>
-      </w:pPr>
-      <w:r>
-        <w:t xml:space="preserve">【終章の最後の数段落は、ノーベル賞の結果を受けて書く。以下は、結果に左右されない部分。】</w:t>
-      </w:r>
-    </w:p>
-    <w:p>
-      <w:pPr>
-        <w:pStyle w:val="BodyText"/>
-      </w:pPr>
-      <w:r>
-        <w:t xml:space="preserve">この三幕の終わりに、最初の問いへ戻る。英語圏の読者が「村上春樹」として知っている、平らで、かすかに外国風の声は、翻訳者が作ったのか。それとも、彼自身が作ったのか。</w:t>
-      </w:r>
-    </w:p>
-    <w:p>
-      <w:pPr>
-        <w:pStyle w:val="BodyText"/>
-      </w:pPr>
-      <w:r>
-        <w:t xml:space="preserve">答えは早いうちに出ていて、それ以後、真剣に覆されてはいない。彼自身が作った。デビュー作を、一度英語で書いて日本語に戻すことで。ほとんど知らない言語を通って、より平らな日本語を見つけることで。(第1章)</w:t>
-      </w:r>
-    </w:p>
-    <w:p>
-      <w:pPr>
-        <w:pStyle w:val="BodyText"/>
-      </w:pPr>
-      <w:r>
-        <w:t xml:space="preserve">そのあとこの本が追ってきたことは、すべて、その最初の技術が何になったかの記録だ。『世界の終り』の分裂した「私」と「僕」。『ノルウェイの森』と『多崎つくる』の、意図的な写実への出発。『ねじまき鳥クロニクル』と『騎士団長殺し』の歴史の重み。予定された国民的な出来事になった『1Q84』。三十一歳で最初に思い描いた壁の街への、三度目の挑戦。属しきれなさから作られた作家が、国内で、どこかで、まだ完全には属していない人として読まれ続けたとき、その技術は何になったのか。</w:t>
-      </w:r>
-    </w:p>
-    <w:p>
-      <w:pPr>
-        <w:pStyle w:val="BodyText"/>
-      </w:pPr>
-      <w:r>
-        <w:t xml:space="preserve">属しきれなさは、一九七九年に制度的な疑いを呼んだ、文体上の偶然にとどまらなかった。それがエンジンだった。外国の小説を読みすぎると疑われた作家が、国内の尊敬される小説家が十年かけて調べ、暗すぎて手が出せないとあきらめた歴史の素材で、最後には成功できた。自分の国が、いまも聞きたがらない歴史上の事実を、そのまま口にして、反発を、全員の承認を必要としない人生の、もう一つの項目として受け止められた。自分のいちばん個人的に痛い評決、最初に発表した作品への評決を見て、それが話の終わりではない、と決めることもできた。</w:t>
-      </w:r>
-    </w:p>
-    <w:p>
-      <w:pPr>
-        <w:pStyle w:val="BodyText"/>
-      </w:pPr>
-      <w:r>
-        <w:t xml:space="preserve">安全の中にすっかり吸収された作家の姿ではない。そこまで安全な作家は、国内の新聞で名指しで非難される一節を書かない。七十代を、自分のいちばん古い、いちばん自分を傷つけた評決を、そのままにせず書き直すことに使ったりもしない。この本が追った四十七年のあいだに、外にいる、という状態の形は、すっかり変わった。外国風すぎると言われたデビューの新人から、歴史への誠実さが、別の種類の国内の敵意の的になった作家へ。そして七十代になっても、自分のいちばん古いやり残しに、まだ満足しきれず、それを人前で直しにいく人へ。どの形の下でも変わらなかったのは、自分の国の文壇の中に、居心地よく収まりきることが一度もなかった作家だ。その文壇の意見が、彼をもう少しも遅らせられなくなってからでさえ。</w:t>
-      </w:r>
-    </w:p>
-    <w:p>
-      <w:pPr>
-        <w:pStyle w:val="BodyText"/>
-      </w:pPr>
-      <w:r>
-        <w:t xml:space="preserve">【終章の結び: ノーベル賞の結果を受けて、十月八日の発表後に書く。】</w:t>
-      </w:r>
-    </w:p>
-    <w:p>
-      <w:r>
-        <w:pict>
-          <v:rect style="width:0;height:1.5pt" o:hralign="center" o:hrstd="t" o:hr="t"/>
-        </w:pict>
-      </w:r>
-    </w:p>
-    <w:bookmarkEnd w:id="116"/>
-    <w:bookmarkEnd w:id="117"/>
-    <w:bookmarkStart w:id="128" w:name="巻末資料"/>
-    <w:p>
-      <w:pPr>
-        <w:pStyle w:val="Heading1"/>
-      </w:pPr>
-      <w:r>
         <w:t xml:space="preserve">巻末資料</w:t>
       </w:r>
     </w:p>
-    <w:bookmarkStart w:id="118" w:name="年表"/>
+    <w:bookmarkStart w:id="119" w:name="年表"/>
     <w:p>
       <w:pPr>
         <w:pStyle w:val="Heading2"/>
@@ -3621,8 +3794,8 @@
         <w:t xml:space="preserve">七月三日、『夏帆――The Tale of KAHO――』刊行(プロローグ、第20章)。十月八日(木)の二十時以降、ノーベル文学賞の発表(予定。第18章、終章)。</w:t>
       </w:r>
     </w:p>
-    <w:bookmarkEnd w:id="118"/>
-    <w:bookmarkStart w:id="119" w:name="本書で扱った主な作品"/>
+    <w:bookmarkEnd w:id="119"/>
+    <w:bookmarkStart w:id="120" w:name="本書で扱った主な作品"/>
     <w:p>
       <w:pPr>
         <w:pStyle w:val="Heading2"/>
@@ -3911,8 +4084,8 @@
         <w:t xml:space="preserve">『みみずくは黄昏に飛び立つ』(川上未映子との対談、新潮社、二〇一七年)</w:t>
       </w:r>
     </w:p>
-    <w:bookmarkEnd w:id="119"/>
-    <w:bookmarkStart w:id="120" w:name="用語集"/>
+    <w:bookmarkEnd w:id="120"/>
+    <w:bookmarkStart w:id="121" w:name="用語集"/>
     <w:p>
       <w:pPr>
         <w:pStyle w:val="Heading2"/>
@@ -4449,8 +4622,8 @@
         <w:t xml:space="preserve">村上作品だけを扱う定期的な学会。淡江大学の村上春樹研究センターが組織し、二〇二五年七月に京都大学で十四回目が開かれた(第19章)。</w:t>
       </w:r>
     </w:p>
-    <w:bookmarkEnd w:id="120"/>
-    <w:bookmarkStart w:id="127" w:name="注出典"/>
+    <w:bookmarkEnd w:id="121"/>
+    <w:bookmarkStart w:id="128" w:name="注出典"/>
     <w:p>
       <w:pPr>
         <w:pStyle w:val="Heading2"/>
@@ -4467,7 +4640,7 @@
         <w:t xml:space="preserve">本文の注は、引用の出どころを、できるだけ細かく書いた。原典(本や選評の原文)を直接確かめた引用と、他の記事や論考に引かれた形で使った引用は、注の中で区別してある。ここには、種類ごとに、主な出典をまとめる。</w:t>
       </w:r>
     </w:p>
-    <w:bookmarkStart w:id="121" w:name="村上春樹の著作"/>
+    <w:bookmarkStart w:id="122" w:name="村上春樹の著作"/>
     <w:p>
       <w:pPr>
         <w:pStyle w:val="Heading3"/>
@@ -4728,8 +4901,8 @@
         <w:t xml:space="preserve">川上未映子との対談『みみずくは黄昏に飛び立つ』(新潮社、二〇一七年四月二十七日)</w:t>
       </w:r>
     </w:p>
-    <w:bookmarkEnd w:id="121"/>
-    <w:bookmarkStart w:id="122" w:name="賞の記録と選評"/>
+    <w:bookmarkEnd w:id="122"/>
+    <w:bookmarkStart w:id="123" w:name="賞の記録と選評"/>
     <w:p>
       <w:pPr>
         <w:pStyle w:val="Heading3"/>
@@ -4774,8 +4947,8 @@
         <w:t xml:space="preserve">ノーベル賞の公式記録(大江健三郎の受賞、候補者記録の五十年の封印)。</w:t>
       </w:r>
     </w:p>
-    <w:bookmarkEnd w:id="122"/>
-    <w:bookmarkStart w:id="123" w:name="日本語の批評研究"/>
+    <w:bookmarkEnd w:id="123"/>
+    <w:bookmarkStart w:id="124" w:name="日本語の批評研究"/>
     <w:p>
       <w:pPr>
         <w:pStyle w:val="Heading3"/>
@@ -4856,8 +5029,8 @@
         <w:t xml:space="preserve">「やれやれ」についての論考(CiNii Research所収)と、murakami-haruki-times.comの調査。</w:t>
       </w:r>
     </w:p>
-    <w:bookmarkEnd w:id="123"/>
-    <w:bookmarkStart w:id="124" w:name="翻訳者と海外の声"/>
+    <w:bookmarkEnd w:id="124"/>
+    <w:bookmarkStart w:id="125" w:name="翻訳者と海外の声"/>
     <w:p>
       <w:pPr>
         <w:pStyle w:val="Heading3"/>
@@ -4938,8 +5111,8 @@
         <w:t xml:space="preserve">MCLC Resource Center「Murakami novel acknowledges Nanjing Massacre」(二〇一七年)。People’s Daily Online の同題の記事(二〇一七年三月三日)。</w:t>
       </w:r>
     </w:p>
-    <w:bookmarkEnd w:id="124"/>
-    <w:bookmarkStart w:id="125" w:name="報道ウェブ"/>
+    <w:bookmarkEnd w:id="125"/>
+    <w:bookmarkStart w:id="126" w:name="報道ウェブ"/>
     <w:p>
       <w:pPr>
         <w:pStyle w:val="Heading3"/>
@@ -5020,8 +5193,8 @@
         <w:t xml:space="preserve">Gigazine「村上春樹風tweet Maker」(二〇一五年二月十七日)。</w:t>
       </w:r>
     </w:p>
-    <w:bookmarkEnd w:id="125"/>
-    <w:bookmarkStart w:id="126" w:name="公式の記録"/>
+    <w:bookmarkEnd w:id="126"/>
+    <w:bookmarkStart w:id="127" w:name="公式の記録"/>
     <w:p>
       <w:pPr>
         <w:pStyle w:val="Heading3"/>
@@ -5054,9 +5227,9 @@
         <w:t xml:space="preserve">早稲田大学国際文学館(村上春樹ライブラリー)と、淡江大学の村上春樹研究センターの公開情報。</w:t>
       </w:r>
     </w:p>
-    <w:bookmarkEnd w:id="126"/>
     <w:bookmarkEnd w:id="127"/>
     <w:bookmarkEnd w:id="128"/>
+    <w:bookmarkEnd w:id="129"/>
     <w:sectPr/>
   </w:body>
 </w:document>
@@ -5382,7 +5555,7 @@
         <w:t xml:space="preserve"> </w:t>
       </w:r>
       <w:r>
-        <w:t xml:space="preserve">村上春樹『ノルウェイの森』(講談社、1987年)第1章冒頭。著者の手元の本の写真から書き起こした。本書の英語版では、英訳の引用に、ジェイ・ルービン訳(Vintage International。初版は2000年)を使った。</w:t>
+        <w:t xml:space="preserve">講談社版(1987年、定価各1,000円)の帯の文言は、上下巻の帯の写真による。「100パーセントの恋愛小説」が村上自身の言葉だという点と、「100%のリアリズム小説」と書きたかったという発言は、日本語で刊行されたインタビューや随筆の集成で広く引かれているが、元となるインタビューや随筆は、ここでは特定できていない。</w:t>
       </w:r>
     </w:p>
   </w:footnote>
@@ -5401,7 +5574,7 @@
         <w:t xml:space="preserve"> </w:t>
       </w:r>
       <w:r>
-        <w:t xml:space="preserve">『ノルウェイの森』の日本国内の累計部数が一千万部を超えると広く報じられていること、33の言語で約260万部が海外で売れたとされることは、2010年の映画化のころに広く引かれた数字による(英語版の出典では「2010年の英訳と映画化」とあったが、ルービン訳の初版は2000年なので、映画化のころに改めた)。</w:t>
+        <w:t xml:space="preserve">村上春樹『ノルウェイの森』(講談社、1987年)第1章冒頭。著者の手元の本の写真から書き起こした。本書の英語版では、英訳の引用に、ジェイ・ルービン訳(Vintage International。初版は2000年)を使った。</w:t>
       </w:r>
     </w:p>
   </w:footnote>
@@ -5420,7 +5593,7 @@
         <w:t xml:space="preserve"> </w:t>
       </w:r>
       <w:r>
-        <w:t xml:space="preserve">林少華「村上文学の翻訳について語る時 私が語ること」(早稲田大学国際文学館、2021年初夏)。林の発言と、三つの理由、四つの持ち味は、この文章による。</w:t>
+        <w:t xml:space="preserve">『ノルウェイの森』の日本国内の累計部数が一千万部を超えると広く報じられていること、33の言語で約260万部が海外で売れたとされることは、2010年の映画化のころに広く引かれた数字による(英語版の出典では「2010年の英訳と映画化」とあったが、ルービン訳の初版は2000年なので、映画化のころに改めた)。</w:t>
       </w:r>
     </w:p>
   </w:footnote>
@@ -5439,7 +5612,7 @@
         <w:t xml:space="preserve"> </w:t>
       </w:r>
       <w:r>
-        <w:t xml:space="preserve">講談社版(1987年、定価各1,000円)の帯の文言は、上下巻の帯の写真による。「100パーセントの恋愛小説」が村上自身の言葉だという点と、「100%のリアリズム小説」と書きたかったという発言は、日本語で刊行されたインタビューや随筆の集成で広く引かれているが、元となるインタビューや随筆は、ここでは特定できていない。</w:t>
+        <w:t xml:space="preserve">林少華「村上文学の翻訳について語る時 私が語ること」(早稲田大学国際文学館、2021年初夏)。林の発言と、三つの理由、四つの持ち味は、この文章による。</w:t>
       </w:r>
     </w:p>
   </w:footnote>
@@ -5458,26 +5631,26 @@
         <w:t xml:space="preserve"> </w:t>
       </w:r>
       <w:r>
+        <w:t xml:space="preserve">講談社版(1987年、定価各1,000円)の帯の文言は、上下巻の帯の写真による。「100パーセントの恋愛小説」が村上自身の言葉だという点と、「100%のリアリズム小説」と書きたかったという発言は、日本語で刊行されたインタビューや随筆の集成で広く引かれているが、元となるインタビューや随筆は、ここでは特定できていない。</w:t>
+      </w:r>
+    </w:p>
+  </w:footnote>
+  <w:footnote w:id="49">
+    <w:p>
+      <w:pPr>
+        <w:pStyle w:val="FootnoteText"/>
+      </w:pPr>
+      <w:r>
+        <w:rPr>
+          <w:rStyle w:val="FootnoteReference"/>
+        </w:rPr>
+        <w:footnoteRef/>
+      </w:r>
+      <w:r>
+        <w:t xml:space="preserve"> </w:t>
+      </w:r>
+      <w:r>
         <w:t xml:space="preserve">村上夫妻は、1986年10月に日本を出て、ギリシャのスペッツェス島、ミコノス島に滞在し、のちにイタリアへ移った。『ノルウェイの森』は、1987年に講談社から刊行された。</w:t>
-      </w:r>
-    </w:p>
-  </w:footnote>
-  <w:footnote w:id="51">
-    <w:p>
-      <w:pPr>
-        <w:pStyle w:val="FootnoteText"/>
-      </w:pPr>
-      <w:r>
-        <w:rPr>
-          <w:rStyle w:val="FootnoteReference"/>
-        </w:rPr>
-        <w:footnoteRef/>
-      </w:r>
-      <w:r>
-        <w:t xml:space="preserve"> </w:t>
-      </w:r>
-      <w:r>
-        <w:t xml:space="preserve">『ダンス・ダンス・ダンス』は、1988年10月に、日本で講談社から刊行された。</w:t>
       </w:r>
     </w:p>
   </w:footnote>
@@ -5496,7 +5669,7 @@
         <w:t xml:space="preserve"> </w:t>
       </w:r>
       <w:r>
-        <w:t xml:space="preserve">村上春樹『ダンス・ダンス・ダンス』(講談社文庫、1991年)。羊男の台詞は、著者の手元の本から直接引いた。</w:t>
+        <w:t xml:space="preserve">『ダンス・ダンス・ダンス』は、1988年10月に、日本で講談社から刊行された。</w:t>
       </w:r>
     </w:p>
   </w:footnote>
@@ -5519,7 +5692,7 @@
       </w:r>
     </w:p>
   </w:footnote>
-  <w:footnote w:id="55">
+  <w:footnote w:id="54">
     <w:p>
       <w:pPr>
         <w:pStyle w:val="FootnoteText"/>
@@ -5534,7 +5707,7 @@
         <w:t xml:space="preserve"> </w:t>
       </w:r>
       <w:r>
-        <w:t xml:space="preserve">村上春樹『ねじまき鳥クロニクル』第1部「泥棒かささぎ編」(新潮社、1994年)第1章「火曜日のねじまき鳥、六本の指と四つの乳房について」、7頁。</w:t>
+        <w:t xml:space="preserve">村上春樹『ダンス・ダンス・ダンス』(講談社文庫、1991年)。羊男の台詞は、著者の手元の本から直接引いた。</w:t>
       </w:r>
     </w:p>
   </w:footnote>
@@ -5553,7 +5726,7 @@
         <w:t xml:space="preserve"> </w:t>
       </w:r>
       <w:r>
-        <w:t xml:space="preserve">ノモンハン事件(ハルハ河戦争)は、1939年に満洲で起きた、日本軍とソ連・モンゴル軍の国境紛争。戦前の日本の軍事史のなかで、あまり語られてこなかった出来事のひとつである。</w:t>
+        <w:t xml:space="preserve">司馬遼太郎が、ノモンハンの調査を断念したことと、その調査から受けた絶望については、慶應義塾大学の「司馬遼太郎生誕100年」関連の記述など、司馬をめぐる回顧で論じられている。</w:t>
       </w:r>
     </w:p>
   </w:footnote>
@@ -5572,7 +5745,7 @@
         <w:t xml:space="preserve"> </w:t>
       </w:r>
       <w:r>
-        <w:t xml:space="preserve">村上春樹『ねじまき鳥クロニクル』第1部(新潮社、1994年)第13章「間宮中尉の長い話2」、263頁。</w:t>
+        <w:t xml:space="preserve">村上春樹『ねじまき鳥クロニクル』第1部「泥棒かささぎ編」(新潮社、1994年)第1章「火曜日のねじまき鳥、六本の指と四つの乳房について」、7頁。</w:t>
       </w:r>
     </w:p>
   </w:footnote>
@@ -5591,7 +5764,7 @@
         <w:t xml:space="preserve"> </w:t>
       </w:r>
       <w:r>
-        <w:t xml:space="preserve">村上春樹『辺境・近境』(新潮社、1998年)。1994年6月のノモンハン行きの記録を収め、「ノモンハンの鉄の墓場」という章がある。</w:t>
+        <w:t xml:space="preserve">ノモンハン事件(ハルハ河戦争)は、1939年に満洲で起きた、日本軍とソ連・モンゴル軍の国境紛争。戦前の日本の軍事史のなかで、あまり語られてこなかった出来事のひとつである。</w:t>
       </w:r>
     </w:p>
   </w:footnote>
@@ -5610,7 +5783,7 @@
         <w:t xml:space="preserve"> </w:t>
       </w:r>
       <w:r>
-        <w:t xml:space="preserve">司馬遼太郎が、ノモンハンの調査を断念したことと、その調査から受けた絶望については、慶應義塾大学の「司馬遼太郎生誕100年」関連の記述など、司馬をめぐる回顧で論じられている。</w:t>
+        <w:t xml:space="preserve">村上春樹『ねじまき鳥クロニクル』第1部(新潮社、1994年)第13章「間宮中尉の長い話2」、263頁。</w:t>
       </w:r>
     </w:p>
   </w:footnote>
@@ -5629,7 +5802,7 @@
         <w:t xml:space="preserve"> </w:t>
       </w:r>
       <w:r>
-        <w:t xml:space="preserve">『ねじまき鳥クロニクル』は、第47回読売文学賞(1995年に刊行された作品が対象)を、1996年2月に受けた。</w:t>
+        <w:t xml:space="preserve">村上春樹『辺境・近境』(新潮社、1998年)。1994年6月のノモンハン行きの記録を収め、「ノモンハンの鉄の墓場」という章がある。</w:t>
       </w:r>
     </w:p>
   </w:footnote>
@@ -5648,26 +5821,26 @@
         <w:t xml:space="preserve"> </w:t>
       </w:r>
       <w:r>
+        <w:t xml:space="preserve">『ねじまき鳥クロニクル』は、第47回読売文学賞(1995年に刊行された作品が対象)を、1996年2月に受けた。</w:t>
+      </w:r>
+    </w:p>
+  </w:footnote>
+  <w:footnote w:id="62">
+    <w:p>
+      <w:pPr>
+        <w:pStyle w:val="FootnoteText"/>
+      </w:pPr>
+      <w:r>
+        <w:rPr>
+          <w:rStyle w:val="FootnoteReference"/>
+        </w:rPr>
+        <w:footnoteRef/>
+      </w:r>
+      <w:r>
+        <w:t xml:space="preserve"> </w:t>
+      </w:r>
+      <w:r>
         <w:t xml:space="preserve">林少華「村上文学の翻訳について語る時 私が語ること」(早稲田大学国際文学館、2021年初夏)。『ねじまき鳥クロニクル』の翻訳についての部分による。</w:t>
-      </w:r>
-    </w:p>
-  </w:footnote>
-  <w:footnote w:id="63">
-    <w:p>
-      <w:pPr>
-        <w:pStyle w:val="FootnoteText"/>
-      </w:pPr>
-      <w:r>
-        <w:rPr>
-          <w:rStyle w:val="FootnoteReference"/>
-        </w:rPr>
-        <w:footnoteRef/>
-      </w:r>
-      <w:r>
-        <w:t xml:space="preserve"> </w:t>
-      </w:r>
-      <w:r>
-        <w:t xml:space="preserve">阪神・淡路大震災は1995年1月17日に神戸周辺を襲った。地下鉄サリン事件は同年3月20日に起き、13人が死亡し、数千人が負傷した。</w:t>
       </w:r>
     </w:p>
   </w:footnote>
@@ -5686,7 +5859,7 @@
         <w:t xml:space="preserve"> </w:t>
       </w:r>
       <w:r>
-        <w:t xml:space="preserve">村上春樹『アンダーグラウンド』(講談社、1997年)。</w:t>
+        <w:t xml:space="preserve">阪神・淡路大震災は1995年1月17日に神戸周辺を襲った。地下鉄サリン事件は同年3月20日に起き、13人が死亡し、数千人が負傷した。</w:t>
       </w:r>
     </w:p>
   </w:footnote>
@@ -5705,26 +5878,26 @@
         <w:t xml:space="preserve"> </w:t>
       </w:r>
       <w:r>
+        <w:t xml:space="preserve">村上春樹『アンダーグラウンド』(講談社、1997年)。</w:t>
+      </w:r>
+    </w:p>
+  </w:footnote>
+  <w:footnote w:id="66">
+    <w:p>
+      <w:pPr>
+        <w:pStyle w:val="FootnoteText"/>
+      </w:pPr>
+      <w:r>
+        <w:rPr>
+          <w:rStyle w:val="FootnoteReference"/>
+        </w:rPr>
+        <w:footnoteRef/>
+      </w:r>
+      <w:r>
+        <w:t xml:space="preserve"> </w:t>
+      </w:r>
+      <w:r>
         <w:t xml:space="preserve">村上春樹『神の子どもたちはみな踊る』(新潮社、2000年)。単行本になる前に、雑誌『新潮』に連載された。</w:t>
-      </w:r>
-    </w:p>
-  </w:footnote>
-  <w:footnote w:id="67">
-    <w:p>
-      <w:pPr>
-        <w:pStyle w:val="FootnoteText"/>
-      </w:pPr>
-      <w:r>
-        <w:rPr>
-          <w:rStyle w:val="FootnoteReference"/>
-        </w:rPr>
-        <w:footnoteRef/>
-      </w:r>
-      <w:r>
-        <w:t xml:space="preserve"> </w:t>
-      </w:r>
-      <w:r>
-        <w:t xml:space="preserve">村上春樹『海辺のカフカ』(新潮社、2002年)。砂嵐の一節は、著者の手元の新潮文庫版から直接引いた。</w:t>
       </w:r>
     </w:p>
   </w:footnote>
@@ -5781,26 +5954,26 @@
         <w:t xml:space="preserve"> </w:t>
       </w:r>
       <w:r>
+        <w:t xml:space="preserve">村上春樹『海辺のカフカ』(新潮社、2002年)。砂嵐の一節は、著者の手元の新潮文庫版から直接引いた。</w:t>
+      </w:r>
+    </w:p>
+  </w:footnote>
+  <w:footnote w:id="71">
+    <w:p>
+      <w:pPr>
+        <w:pStyle w:val="FootnoteText"/>
+      </w:pPr>
+      <w:r>
+        <w:rPr>
+          <w:rStyle w:val="FootnoteReference"/>
+        </w:rPr>
+        <w:footnoteRef/>
+      </w:r>
+      <w:r>
+        <w:t xml:space="preserve"> </w:t>
+      </w:r>
+      <w:r>
         <w:t xml:space="preserve">『海辺のカフカ』は、フィリップ・ゲイブリエルの英訳で、『ニューヨーク・タイムズ』の2005年の十大ブックのひとつに選ばれ、2006年のワールド・ファンタジー賞の長編部門を受けた。</w:t>
-      </w:r>
-    </w:p>
-  </w:footnote>
-  <w:footnote w:id="72">
-    <w:p>
-      <w:pPr>
-        <w:pStyle w:val="FootnoteText"/>
-      </w:pPr>
-      <w:r>
-        <w:rPr>
-          <w:rStyle w:val="FootnoteReference"/>
-        </w:rPr>
-        <w:footnoteRef/>
-      </w:r>
-      <w:r>
-        <w:t xml:space="preserve"> </w:t>
-      </w:r>
-      <w:r>
-        <w:t xml:space="preserve">『1Q84』の2009年5月29日の発売にあたる、初版の合計部数と先行販売の数字は、『ザ・ミリオンズ』の「1Q84 Revealed」(2009年)などの当時の報道、日本の報道による。</w:t>
       </w:r>
     </w:p>
   </w:footnote>
@@ -5819,7 +5992,7 @@
         <w:t xml:space="preserve"> </w:t>
       </w:r>
       <w:r>
-        <w:t xml:space="preserve">村上春樹『1Q84』BOOK 1(新潮社、2009年)第1章「青豆」、副題「見かけにだまされないように」、11頁。</w:t>
+        <w:t xml:space="preserve">『1Q84』の2009年5月29日の発売にあたる、初版の合計部数と先行販売の数字は、『ザ・ミリオンズ』の「1Q84 Revealed」(2009年)などの当時の報道、日本の報道による。</w:t>
       </w:r>
     </w:p>
   </w:footnote>
@@ -5857,26 +6030,26 @@
         <w:t xml:space="preserve"> </w:t>
       </w:r>
       <w:r>
+        <w:t xml:space="preserve">村上春樹『1Q84』BOOK 1(新潮社、2009年)第1章「青豆」、副題「見かけにだまされないように」、11頁。</w:t>
+      </w:r>
+    </w:p>
+  </w:footnote>
+  <w:footnote w:id="76">
+    <w:p>
+      <w:pPr>
+        <w:pStyle w:val="FootnoteText"/>
+      </w:pPr>
+      <w:r>
+        <w:rPr>
+          <w:rStyle w:val="FootnoteReference"/>
+        </w:rPr>
+        <w:footnoteRef/>
+      </w:r>
+      <w:r>
+        <w:t xml:space="preserve"> </w:t>
+      </w:r>
+      <w:r>
         <w:t xml:space="preserve">クリーブランド管弦楽団とソニーの数字は、『1Q84』刊行後の報道による(League of American Orchestras の記事「New Book Spurs Sales of Cleveland Orchestra CD」、2009年)。</w:t>
-      </w:r>
-    </w:p>
-  </w:footnote>
-  <w:footnote w:id="77">
-    <w:p>
-      <w:pPr>
-        <w:pStyle w:val="FootnoteText"/>
-      </w:pPr>
-      <w:r>
-        <w:rPr>
-          <w:rStyle w:val="FootnoteReference"/>
-        </w:rPr>
-        <w:footnoteRef/>
-      </w:r>
-      <w:r>
-        <w:t xml:space="preserve"> </w:t>
-      </w:r>
-      <w:r>
-        <w:t xml:space="preserve">Gigazine「村上春樹風tweet Maker」(2015年2月17日)。ツイートを村上春樹風の文章に書き換えるジェネレーターの紹介記事で、例文として「完璧なフラペチーノなどといったものは存在しない」が挙げられている。</w:t>
       </w:r>
     </w:p>
   </w:footnote>
@@ -5895,7 +6068,7 @@
         <w:t xml:space="preserve"> </w:t>
       </w:r>
       <w:r>
-        <w:t xml:space="preserve">「村上春樹チルドレン」という呼び名は、本田孝好、大崎善生らの作家に対して、日本の文芸評論でたびたび使われてきた。</w:t>
+        <w:t xml:space="preserve">Gigazine「村上春樹風tweet Maker」(2015年2月17日)。ツイートを村上春樹風の文章に書き換えるジェネレーターの紹介記事で、例文として「完璧なフラペチーノなどといったものは存在しない」が挙げられている。</w:t>
       </w:r>
     </w:p>
   </w:footnote>
@@ -5914,7 +6087,7 @@
         <w:t xml:space="preserve"> </w:t>
       </w:r>
       <w:r>
-        <w:t xml:space="preserve">新海誠が村上の影響を語ったのは、日本の雑誌のインタビューによる。</w:t>
+        <w:t xml:space="preserve">「村上春樹チルドレン」という呼び名は、本田孝好、大崎善生らの作家に対して、日本の文芸評論でたびたび使われてきた。</w:t>
       </w:r>
     </w:p>
   </w:footnote>
@@ -5933,7 +6106,7 @@
         <w:t xml:space="preserve"> </w:t>
       </w:r>
       <w:r>
-        <w:t xml:space="preserve">河合隼雄・村上春樹『村上春樹、河合隼雄に会いにいく』(岩波書店、1996年)。1995年11月に京都で二晩にわたって行われた対談で、最初は雑誌『世界』に連載された。</w:t>
+        <w:t xml:space="preserve">新海誠が村上の影響を語ったのは、日本の雑誌のインタビューによる。</w:t>
       </w:r>
     </w:p>
   </w:footnote>
@@ -5952,26 +6125,26 @@
         <w:t xml:space="preserve"> </w:t>
       </w:r>
       <w:r>
+        <w:t xml:space="preserve">河合隼雄・村上春樹『村上春樹、河合隼雄に会いにいく』(岩波書店、1996年)。1995年11月に京都で二晩にわたって行われた対談で、最初は雑誌『世界』に連載された。</w:t>
+      </w:r>
+    </w:p>
+  </w:footnote>
+  <w:footnote w:id="82">
+    <w:p>
+      <w:pPr>
+        <w:pStyle w:val="FootnoteText"/>
+      </w:pPr>
+      <w:r>
+        <w:rPr>
+          <w:rStyle w:val="FootnoteReference"/>
+        </w:rPr>
+        <w:footnoteRef/>
+      </w:r>
+      <w:r>
+        <w:t xml:space="preserve"> </w:t>
+      </w:r>
+      <w:r>
         <w:t xml:space="preserve">加藤典洋が、村上は最初期の作品でさえ単純な「デタッチメント」の作家ではないと論じたことは、『村上春樹の世界』(講談社)や、のちの『村上春樹は、むずかしい』(岩波新書、2015年)など、村上についての彼の批評書に通っている。</w:t>
-      </w:r>
-    </w:p>
-  </w:footnote>
-  <w:footnote w:id="85">
-    <w:p>
-      <w:pPr>
-        <w:pStyle w:val="FootnoteText"/>
-      </w:pPr>
-      <w:r>
-        <w:rPr>
-          <w:rStyle w:val="FootnoteReference"/>
-        </w:rPr>
-        <w:footnoteRef/>
-      </w:r>
-      <w:r>
-        <w:t xml:space="preserve"> </w:t>
-      </w:r>
-      <w:r>
-        <w:t xml:space="preserve">『色彩を持たない多崎つくると、彼の巡礼の年』は、2013年4月12日に、文藝春秋から刊行された。</w:t>
       </w:r>
     </w:p>
   </w:footnote>
@@ -5990,7 +6163,7 @@
         <w:t xml:space="preserve"> </w:t>
       </w:r>
       <w:r>
-        <w:t xml:space="preserve">村上春樹『色彩を持たない多崎つくると、彼の巡礼の年』(文藝春秋、2013年)121頁。プールの場面は、著者の手元の本から直接引いた。</w:t>
+        <w:t xml:space="preserve">『色彩を持たない多崎つくると、彼の巡礼の年』は、2013年4月12日に、文藝春秋から刊行された。</w:t>
       </w:r>
     </w:p>
   </w:footnote>
@@ -6009,7 +6182,7 @@
         <w:t xml:space="preserve"> </w:t>
       </w:r>
       <w:r>
-        <w:t xml:space="preserve">同書、366〜369頁。十二回の呼び出し音と、最後の段落は、著者の手元の本から直接引いた。</w:t>
+        <w:t xml:space="preserve">村上春樹『色彩を持たない多崎つくると、彼の巡礼の年』(文藝春秋、2013年)121頁。プールの場面は、著者の手元の本から直接引いた。</w:t>
       </w:r>
     </w:p>
   </w:footnote>
@@ -6032,7 +6205,7 @@
       </w:r>
     </w:p>
   </w:footnote>
-  <w:footnote w:id="90">
+  <w:footnote w:id="89">
     <w:p>
       <w:pPr>
         <w:pStyle w:val="FootnoteText"/>
@@ -6047,7 +6220,7 @@
         <w:t xml:space="preserve"> </w:t>
       </w:r>
       <w:r>
-        <w:t xml:space="preserve">『騎士団長殺し』は、2017年2月24日に新潮社から刊行され、初版は第1部・第2部の合計で130万部。</w:t>
+        <w:t xml:space="preserve">同書、366〜369頁。十二回の呼び出し音と、最後の段落は、著者の手元の本から直接引いた。</w:t>
       </w:r>
     </w:p>
   </w:footnote>
@@ -6066,7 +6239,7 @@
         <w:t xml:space="preserve"> </w:t>
       </w:r>
       <w:r>
-        <w:t xml:space="preserve">村上春樹『騎士団長殺し』第2部「遷ろうメタファー編」(新潮社、2017年)。免色の死者数についての台詞は、著者の手元の本から直接引いた。</w:t>
+        <w:t xml:space="preserve">『騎士団長殺し』は、2017年2月24日に新潮社から刊行され、初版は第1部・第2部の合計で130万部。</w:t>
       </w:r>
     </w:p>
   </w:footnote>
@@ -6085,7 +6258,7 @@
         <w:t xml:space="preserve"> </w:t>
       </w:r>
       <w:r>
-        <w:t xml:space="preserve">MCLC Resource Center「Murakami novel acknowledges Nanjing Massacre」(2017年)、People’s Daily Online「Murakami novel acknowledges Nanjing Massacre, sets off online frenzy」(2017年3月3日)。いずれも、南京大屠殺遇難同胞紀念館の公式ウェイボーでの反応を報じている。</w:t>
+        <w:t xml:space="preserve">村上春樹『騎士団長殺し』第2部「遷ろうメタファー編」(新潮社、2017年)。免色の死者数についての台詞は、著者の手元の本から直接引いた。</w:t>
       </w:r>
     </w:p>
   </w:footnote>
@@ -6104,7 +6277,7 @@
         <w:t xml:space="preserve"> </w:t>
       </w:r>
       <w:r>
-        <w:t xml:space="preserve">百田尚樹と桜井誠の批判、産経新聞の批判を含む論争の広がりは、当時の日本語の報道と論評に記録されている。リテラ「村上春樹『騎士団長殺し』の南京虐殺「40万人説」紹介に百田尚樹と産経が言いがかり!」(2017年3月)、同「村上春樹『騎士団長殺し』は歴史修正主義と対決する小説だった! 百田尚樹も気づいてない南京虐殺の生々しい描写」(2017年5月)、人民網日本語版「日本の右翼勢力が村上春樹の新作を批判する理由」(2017年3月)など。</w:t>
+        <w:t xml:space="preserve">MCLC Resource Center「Murakami novel acknowledges Nanjing Massacre」(2017年)、People’s Daily Online「Murakami novel acknowledges Nanjing Massacre, sets off online frenzy」(2017年3月3日)。いずれも、南京大屠殺遇難同胞紀念館の公式ウェイボーでの反応を報じている。</w:t>
       </w:r>
     </w:p>
   </w:footnote>
@@ -6123,7 +6296,7 @@
         <w:t xml:space="preserve"> </w:t>
       </w:r>
       <w:r>
-        <w:t xml:space="preserve">佐々木敦「村上春樹『騎士団長殺し』論」(note)。「無」を描けないという構造、ウィーンと雨田兄弟の背景(同論でも本書でも、小説が明言したことではなく佐々木の推論として扱う)、最終章で時間設定が明かされる点は、この論に拠る。『神の子どもたちはみな踊る』の同様の構造は、第10章を参照。「なにしろそこにあるのはただの無なのだ。何もないものをいったいどのように造形すればいいのだろう？」という小説からの引用は、佐々木の論に引かれた形で再録したもので、第1部の実物とは、まだ照合していない。</w:t>
+        <w:t xml:space="preserve">百田尚樹と桜井誠の批判、産経新聞の批判を含む論争の広がりは、当時の日本語の報道と論評に記録されている。リテラ「村上春樹『騎士団長殺し』の南京虐殺「40万人説」紹介に百田尚樹と産経が言いがかり!」(2017年3月)、同「村上春樹『騎士団長殺し』は歴史修正主義と対決する小説だった! 百田尚樹も気づいてない南京虐殺の生々しい描写」(2017年5月)、人民網日本語版「日本の右翼勢力が村上春樹の新作を批判する理由」(2017年3月)など。</w:t>
       </w:r>
     </w:p>
   </w:footnote>
@@ -6184,7 +6357,7 @@
       </w:r>
     </w:p>
   </w:footnote>
-  <w:footnote w:id="99">
+  <w:footnote w:id="98">
     <w:p>
       <w:pPr>
         <w:pStyle w:val="FootnoteText"/>
@@ -6199,7 +6372,7 @@
         <w:t xml:space="preserve"> </w:t>
       </w:r>
       <w:r>
-        <w:t xml:space="preserve">『ドライブ・マイ・カー』は、第94回アカデミー賞(2022年)で、作品賞、国際長編映画賞、監督賞、脚色賞にノミネートされ、国際長編映画賞を受賞した。日本映画の作品賞ノミネートは初めてで、国際長編映画賞の競争での受賞は、『おくりびと』(2009年)に次いで二本目。2021年のカンヌ国際映画祭では脚本賞を受け、日本人の脚本家の受賞は初めてだった。</w:t>
+        <w:t xml:space="preserve">佐々木敦「村上春樹『騎士団長殺し』論」(note)。「無」を描けないという構造、ウィーンと雨田兄弟の背景(同論でも本書でも、小説が明言したことではなく佐々木の推論として扱う)、最終章で時間設定が明かされる点は、この論に拠る。『神の子どもたちはみな踊る』の同様の構造は、第10章を参照。「なにしろそこにあるのはただの無なのだ。何もないものをいったいどのように造形すればいいのだろう？」という小説からの引用は、佐々木の論に引かれた形で再録したもので、第1部の実物とは、まだ照合していない。</w:t>
       </w:r>
     </w:p>
   </w:footnote>
@@ -6218,26 +6391,26 @@
         <w:t xml:space="preserve"> </w:t>
       </w:r>
       <w:r>
+        <w:t xml:space="preserve">『ドライブ・マイ・カー』は、第94回アカデミー賞(2022年)で、作品賞、国際長編映画賞、監督賞、脚色賞にノミネートされ、国際長編映画賞を受賞した。日本映画の作品賞ノミネートは初めてで、国際長編映画賞の競争での受賞は、『おくりびと』(2009年)に次いで二本目。2021年のカンヌ国際映画祭では脚本賞を受け、日本人の脚本家の受賞は初めてだった。</w:t>
+      </w:r>
+    </w:p>
+  </w:footnote>
+  <w:footnote w:id="101">
+    <w:p>
+      <w:pPr>
+        <w:pStyle w:val="FootnoteText"/>
+      </w:pPr>
+      <w:r>
+        <w:rPr>
+          <w:rStyle w:val="FootnoteReference"/>
+        </w:rPr>
+        <w:footnoteRef/>
+      </w:r>
+      <w:r>
+        <w:t xml:space="preserve"> </w:t>
+      </w:r>
+      <w:r>
         <w:t xml:space="preserve">BRUTUS(brutus.jp)「『ドライブ・マイ・カー』映画監督・濱口竜介にインタビュー。村上春樹の小説を映画化する時に最も困難なこと」(2022年2月25日)。この章の濱口の発言は、このインタビューを言い換えたものである。</w:t>
-      </w:r>
-    </w:p>
-  </w:footnote>
-  <w:footnote w:id="102">
-    <w:p>
-      <w:pPr>
-        <w:pStyle w:val="FootnoteText"/>
-      </w:pPr>
-      <w:r>
-        <w:rPr>
-          <w:rStyle w:val="FootnoteReference"/>
-        </w:rPr>
-        <w:footnoteRef/>
-      </w:r>
-      <w:r>
-        <w:t xml:space="preserve"> </w:t>
-      </w:r>
-      <w:r>
-        <w:t xml:space="preserve">『街とその不確かな壁』は、2023年4月13日に新潮社から刊行された。村上は2020年3月に書き始め、およそ3年かけて、原稿用紙約1200枚の長編を完成させた。</w:t>
       </w:r>
     </w:p>
   </w:footnote>
@@ -6256,7 +6429,7 @@
         <w:t xml:space="preserve"> </w:t>
       </w:r>
       <w:r>
-        <w:t xml:space="preserve">村上春樹『街とその不確かな壁』(新潮社、2023年)。金色の獣、門番の剃刀と角笛、春の交尾期の暴力は、著者の手元の本から直接引いた。</w:t>
+        <w:t xml:space="preserve">『街とその不確かな壁』は、2023年4月13日に新潮社から刊行された。村上は2020年3月に書き始め、およそ3年かけて、原稿用紙約1200枚の長編を完成させた。</w:t>
       </w:r>
     </w:p>
   </w:footnote>
@@ -6298,7 +6471,7 @@
       </w:r>
     </w:p>
   </w:footnote>
-  <w:footnote w:id="107">
+  <w:footnote w:id="106">
     <w:p>
       <w:pPr>
         <w:pStyle w:val="FootnoteText"/>
@@ -6313,7 +6486,7 @@
         <w:t xml:space="preserve"> </w:t>
       </w:r>
       <w:r>
-        <w:t xml:space="preserve">BBCニュース・ジャパン(2017年10月6日)による、2017年10月5日の夜の記述。千駄ヶ谷の鳩森八幡神社に約200人のファンが集まり、ネットで発表を見たこと。群衆の反応は毎日新聞を、紀伊國屋書店新宿本店の約30点の村上作品の棚がイシグロの本に入れ替えられたことは朝日新聞を、記事が引いている。</w:t>
+        <w:t xml:space="preserve">村上春樹『街とその不確かな壁』(新潮社、2023年)。金色の獣、門番の剃刀と角笛、春の交尾期の暴力は、著者の手元の本から直接引いた。</w:t>
       </w:r>
     </w:p>
   </w:footnote>
@@ -6332,7 +6505,7 @@
         <w:t xml:space="preserve"> </w:t>
       </w:r>
       <w:r>
-        <w:t xml:space="preserve">ノーベル賞の候補者の記録は、賞自体の規則により、五十年間封印される。本書の執筆時点で公開されているのは、1975年までの候補だけである。安部公房(1993年没)は、当時、受賞にもっとも近い日本の作家のひとりと広く見られていたが、具体的な候補としての検討を確認できる記録は、封印されたままである。賭け率については、ブックメーカーのラドブロークスが、少なくとも2011年以降、ほとんどの年に、村上を有力候補に挙げてきた。倍率は、2011年のおよそ16倍から、2013年の3倍、2024年の14倍まで、年によって幅がある。この幅の広さだけでも、倍率が、スウェーデン・アカデミーからの信号ではなく、世間の推測を追っていることがわかる。</w:t>
+        <w:t xml:space="preserve">BBCニュース・ジャパン(2017年10月6日)による、2017年10月5日の夜の記述。千駄ヶ谷の鳩森八幡神社に約200人のファンが集まり、ネットで発表を見たこと。群衆の反応は毎日新聞を、紀伊國屋書店新宿本店の約30点の村上作品の棚がイシグロの本に入れ替えられたことは朝日新聞を、記事が引いている。</w:t>
       </w:r>
     </w:p>
   </w:footnote>
@@ -6355,7 +6528,7 @@
       </w:r>
     </w:p>
   </w:footnote>
-  <w:footnote w:id="111">
+  <w:footnote w:id="110">
     <w:p>
       <w:pPr>
         <w:pStyle w:val="FootnoteText"/>
@@ -6370,7 +6543,7 @@
         <w:t xml:space="preserve"> </w:t>
       </w:r>
       <w:r>
-        <w:t xml:space="preserve">第14回国際村上春樹シンポジウムは、2025年7月5〜6日に、京都大学で開かれ、淡江大学の村上春樹研究センターが主催した。「村上春樹ライブラリー」は、早稲田大学国際文学館の通称。</w:t>
+        <w:t xml:space="preserve">ノーベル賞の候補者の記録は、賞自体の規則により、五十年間封印される。本書の執筆時点で公開されているのは、1975年までの候補だけである。安部公房(1993年没)は、当時、受賞にもっとも近い日本の作家のひとりと広く見られていたが、具体的な候補としての検討を確認できる記録は、封印されたままである。賭け率については、ブックメーカーのラドブロークスが、少なくとも2011年以降、ほとんどの年に、村上を有力候補に挙げてきた。倍率は、2011年のおよそ16倍から、2013年の3倍、2024年の14倍まで、年によって幅がある。この幅の広さだけでも、倍率が、スウェーデン・アカデミーからの信号ではなく、世間の推測を追っていることがわかる。</w:t>
       </w:r>
     </w:p>
   </w:footnote>
@@ -6389,11 +6562,30 @@
         <w:t xml:space="preserve"> </w:t>
       </w:r>
       <w:r>
+        <w:t xml:space="preserve">第14回国際村上春樹シンポジウムは、2025年7月5〜6日に、京都大学で開かれ、淡江大学の村上春樹研究センターが主催した。「村上春樹ライブラリー」は、早稲田大学国際文学館の通称。</w:t>
+      </w:r>
+    </w:p>
+  </w:footnote>
+  <w:footnote w:id="113">
+    <w:p>
+      <w:pPr>
+        <w:pStyle w:val="FootnoteText"/>
+      </w:pPr>
+      <w:r>
+        <w:rPr>
+          <w:rStyle w:val="FootnoteReference"/>
+        </w:rPr>
+        <w:footnoteRef/>
+      </w:r>
+      <w:r>
+        <w:t xml:space="preserve"> </w:t>
+      </w:r>
+      <w:r>
         <w:t xml:space="preserve">林少華「村上文学の翻訳について語る時 私が語ること」(早稲田大学国際文学館、2021年初夏)。発行部数、読者数の計算、「百様の春樹」、「美しすぎる」という批判への言及は、この文章による。</w:t>
       </w:r>
     </w:p>
   </w:footnote>
-  <w:footnote w:id="114">
+  <w:footnote w:id="115">
     <w:p>
       <w:pPr>
         <w:pStyle w:val="FootnoteText"/>

</xml_diff>